<commit_message>
TEEL deck: the whole essay in bars, an anchor diagram that shrinks as you type, sentences built from matched parts; bars on the template sheet
Co-Authored-By: Claude Fable 5.1 <noreply@anthropic.com>
Claude-Session: https://claude.ai/code/session_01TX2KYiJGekMNoBBPASQh6e
</commit_message>
<xml_diff>
--- a/BoneSparrow-TEEL-template.docx
+++ b/BoneSparrow-TEEL-template.docx
@@ -197,7 +197,7 @@
           <w:sz w:val="24"/>
           <w:szCs w:val="24"/>
         </w:rPr>
-        <w:t xml:space="preserve">How a TEEL paragraph is built</w:t>
+        <w:t xml:space="preserve">The shape of a paragraph</w:t>
       </w:r>
     </w:p>
     <w:p>
@@ -284,42 +284,41 @@
       <w:tblPr>
         <w:tblW w:type="dxa" w:w="9906"/>
         <w:tblBorders>
-          <w:top w:val="single" w:color="1D3C34" w:sz="8"/>
-          <w:left w:val="single" w:color="1D3C34" w:sz="8"/>
-          <w:bottom w:val="single" w:color="1D3C34" w:sz="8"/>
-          <w:right w:val="single" w:color="1D3C34" w:sz="8"/>
+          <w:top w:val="none" w:color="FFFFFF" w:sz="0"/>
+          <w:left w:val="none" w:color="FFFFFF" w:sz="0"/>
+          <w:bottom w:val="none" w:color="FFFFFF" w:sz="0"/>
+          <w:right w:val="none" w:color="FFFFFF" w:sz="0"/>
           <w:insideH w:val="single" w:color="auto" w:sz="4"/>
           <w:insideV w:val="single" w:color="auto" w:sz="4"/>
         </w:tblBorders>
       </w:tblPr>
       <w:tblGrid>
-        <w:gridCol w:w="700"/>
-        <w:gridCol w:w="2600"/>
-        <w:gridCol w:w="6606"/>
+        <w:gridCol w:w="900"/>
+        <w:gridCol w:w="9006"/>
       </w:tblGrid>
       <w:tr>
         <w:trPr>
-          <w:trHeight w:val="900" w:hRule="atLeast"/>
+          <w:trHeight w:val="420" w:hRule="atLeast"/>
         </w:trPr>
         <w:tc>
           <w:tcPr>
-            <w:tcW w:type="dxa" w:w="700"/>
-            <w:tcMar>
-              <w:top w:type="dxa" w:w="100"/>
+            <w:tcW w:type="dxa" w:w="900"/>
+            <w:tcMar>
+              <w:top w:type="dxa" w:w="60"/>
               <w:left w:type="dxa" w:w="120"/>
-              <w:bottom w:type="dxa" w:w="100"/>
+              <w:bottom w:type="dxa" w:w="60"/>
               <w:right w:type="dxa" w:w="60"/>
             </w:tcMar>
           </w:tcPr>
           <w:p>
             <w:r>
               <w:rPr>
-                <w:rFonts w:ascii="Georgia" w:cs="Georgia" w:eastAsia="Georgia" w:hAnsi="Georgia"/>
+                <w:rFonts w:ascii="Calibri" w:cs="Calibri" w:eastAsia="Calibri" w:hAnsi="Calibri"/>
                 <w:b/>
                 <w:bCs/>
-                <w:color w:val="1D3C34"/>
-                <w:sz w:val="40"/>
-                <w:szCs w:val="40"/>
+                <w:color w:val="A83232"/>
+                <w:sz w:val="26"/>
+                <w:szCs w:val="26"/>
               </w:rPr>
               <w:t xml:space="preserve">T</w:t>
             </w:r>
@@ -327,94 +326,85 @@
         </w:tc>
         <w:tc>
           <w:tcPr>
-            <w:tcW w:type="dxa" w:w="2600"/>
-            <w:shd w:fill="F6F1E6" w:color="auto" w:val="clear"/>
-            <w:tcMar>
-              <w:top w:type="dxa" w:w="100"/>
-              <w:left w:type="dxa" w:w="100"/>
-              <w:bottom w:type="dxa" w:w="100"/>
-              <w:right w:type="dxa" w:w="100"/>
-            </w:tcMar>
-          </w:tcPr>
-          <w:p>
-            <w:pPr>
-              <w:spacing w:after="40"/>
-            </w:pPr>
-            <w:r>
-              <w:rPr>
-                <w:rFonts w:ascii="Calibri" w:cs="Calibri" w:eastAsia="Calibri" w:hAnsi="Calibri"/>
-                <w:color w:val="645D54"/>
-                <w:sz w:val="17"/>
-                <w:szCs w:val="17"/>
-              </w:rPr>
-              <w:t xml:space="preserve">Topic sentence.</w:t>
-            </w:r>
-          </w:p>
-          <w:p>
-            <w:pPr>
-              <w:spacing w:after="40"/>
-            </w:pPr>
-            <w:r>
-              <w:rPr>
-                <w:rFonts w:ascii="Calibri" w:cs="Calibri" w:eastAsia="Calibri" w:hAnsi="Calibri"/>
-                <w:color w:val="645D54"/>
-                <w:sz w:val="17"/>
-                <w:szCs w:val="17"/>
-              </w:rPr>
-              <w:t xml:space="preserve">The idea, and why it matters.</w:t>
-            </w:r>
-          </w:p>
-          <w:p>
-            <w:pPr>
-              <w:spacing w:after="40"/>
-            </w:pPr>
-            <w:r>
-              <w:rPr>
-                <w:rFonts w:ascii="Calibri" w:cs="Calibri" w:eastAsia="Calibri" w:hAnsi="Calibri"/>
-                <w:color w:val="645D54"/>
-                <w:sz w:val="17"/>
-                <w:szCs w:val="17"/>
-              </w:rPr>
-              <w:t xml:space="preserve">Name the two reasons, A and B.</w:t>
-            </w:r>
-          </w:p>
-        </w:tc>
-        <w:tc>
-          <w:tcPr>
-            <w:tcW w:type="dxa" w:w="6606"/>
-            <w:tcMar>
-              <w:top w:type="dxa" w:w="100"/>
-              <w:left w:type="dxa" w:w="120"/>
-              <w:bottom w:type="dxa" w:w="100"/>
-              <w:right w:type="dxa" w:w="120"/>
-            </w:tcMar>
-          </w:tcPr>
+            <w:tcW w:type="dxa" w:w="9006"/>
+            <w:tcMar>
+              <w:top w:type="dxa" w:w="80"/>
+              <w:left w:type="dxa" w:w="0"/>
+              <w:bottom w:type="dxa" w:w="80"/>
+              <w:right w:type="dxa" w:w="0"/>
+            </w:tcMar>
+          </w:tcPr>
+          <w:tbl>
+            <w:tblPr>
+              <w:tblW w:type="dxa" w:w="9006"/>
+              <w:tblBorders>
+                <w:top w:val="none" w:color="FFFFFF" w:sz="0"/>
+                <w:left w:val="none" w:color="FFFFFF" w:sz="0"/>
+                <w:bottom w:val="none" w:color="FFFFFF" w:sz="0"/>
+                <w:right w:val="none" w:color="FFFFFF" w:sz="0"/>
+                <w:insideH w:val="single" w:color="auto" w:sz="4"/>
+                <w:insideV w:val="single" w:color="auto" w:sz="4"/>
+              </w:tblBorders>
+            </w:tblPr>
+            <w:tblGrid>
+              <w:gridCol w:w="9006"/>
+            </w:tblGrid>
+            <w:tr>
+              <w:trPr>
+                <w:trHeight w:val="260" w:hRule="exact"/>
+              </w:trPr>
+              <w:tc>
+                <w:tcPr>
+                  <w:tcW w:type="dxa" w:w="9006"/>
+                  <w:shd w:fill="7FB3E6" w:color="auto" w:val="clear"/>
+                  <w:tcMar>
+                    <w:top w:type="dxa" w:w="0"/>
+                    <w:left w:type="dxa" w:w="0"/>
+                    <w:bottom w:type="dxa" w:w="0"/>
+                    <w:right w:type="dxa" w:w="0"/>
+                  </w:tcMar>
+                </w:tcPr>
+                <w:p>
+                  <w:pPr>
+                    <w:spacing w:after="0" w:line="200" w:lineRule="exact"/>
+                  </w:pPr>
+                  <w:r>
+                    <w:rPr>
+                      <w:sz w:val="8"/>
+                      <w:szCs w:val="8"/>
+                    </w:rPr>
+                    <w:t xml:space="preserve"/>
+                  </w:r>
+                </w:p>
+              </w:tc>
+            </w:tr>
+          </w:tbl>
           <w:p/>
         </w:tc>
       </w:tr>
       <w:tr>
         <w:trPr>
-          <w:trHeight w:val="900" w:hRule="atLeast"/>
+          <w:trHeight w:val="420" w:hRule="atLeast"/>
         </w:trPr>
         <w:tc>
           <w:tcPr>
-            <w:tcW w:type="dxa" w:w="700"/>
-            <w:tcMar>
-              <w:top w:type="dxa" w:w="100"/>
+            <w:tcW w:type="dxa" w:w="900"/>
+            <w:tcMar>
+              <w:top w:type="dxa" w:w="60"/>
               <w:left w:type="dxa" w:w="120"/>
-              <w:bottom w:type="dxa" w:w="100"/>
+              <w:bottom w:type="dxa" w:w="60"/>
               <w:right w:type="dxa" w:w="60"/>
             </w:tcMar>
           </w:tcPr>
           <w:p>
             <w:r>
               <w:rPr>
-                <w:rFonts w:ascii="Georgia" w:cs="Georgia" w:eastAsia="Georgia" w:hAnsi="Georgia"/>
+                <w:rFonts w:ascii="Calibri" w:cs="Calibri" w:eastAsia="Calibri" w:hAnsi="Calibri"/>
                 <w:b/>
                 <w:bCs/>
-                <w:color w:val="1D3C34"/>
-                <w:sz w:val="40"/>
-                <w:szCs w:val="40"/>
+                <w:color w:val="A83232"/>
+                <w:sz w:val="26"/>
+                <w:szCs w:val="26"/>
               </w:rPr>
               <w:t xml:space="preserve">E</w:t>
             </w:r>
@@ -422,108 +412,160 @@
         </w:tc>
         <w:tc>
           <w:tcPr>
-            <w:tcW w:type="dxa" w:w="2600"/>
-            <w:shd w:fill="F6F1E6" w:color="auto" w:val="clear"/>
-            <w:tcMar>
-              <w:top w:type="dxa" w:w="100"/>
-              <w:left w:type="dxa" w:w="100"/>
-              <w:bottom w:type="dxa" w:w="100"/>
-              <w:right w:type="dxa" w:w="100"/>
-            </w:tcMar>
-          </w:tcPr>
-          <w:p>
-            <w:pPr>
-              <w:spacing w:after="40"/>
-            </w:pPr>
-            <w:r>
-              <w:rPr>
-                <w:rFonts w:ascii="Calibri" w:cs="Calibri" w:eastAsia="Calibri" w:hAnsi="Calibri"/>
-                <w:color w:val="645D54"/>
-                <w:sz w:val="17"/>
-                <w:szCs w:val="17"/>
-              </w:rPr>
-              <w:t xml:space="preserve">Evidence and explanation.</w:t>
-            </w:r>
-          </w:p>
-          <w:p>
-            <w:pPr>
-              <w:spacing w:after="40"/>
-            </w:pPr>
-            <w:r>
-              <w:rPr>
-                <w:rFonts w:ascii="Calibri" w:cs="Calibri" w:eastAsia="Calibri" w:hAnsi="Calibri"/>
-                <w:color w:val="645D54"/>
-                <w:sz w:val="17"/>
-                <w:szCs w:val="17"/>
-              </w:rPr>
-              <w:t xml:space="preserve">A quote from the novel.</w:t>
-            </w:r>
-          </w:p>
-          <w:p>
-            <w:pPr>
-              <w:spacing w:after="40"/>
-            </w:pPr>
-            <w:r>
-              <w:rPr>
-                <w:rFonts w:ascii="Calibri" w:cs="Calibri" w:eastAsia="Calibri" w:hAnsi="Calibri"/>
-                <w:color w:val="645D54"/>
-                <w:sz w:val="17"/>
-                <w:szCs w:val="17"/>
-              </w:rPr>
-              <w:t xml:space="preserve">What it shows about reason A.</w:t>
-            </w:r>
-          </w:p>
-          <w:p>
-            <w:pPr>
-              <w:spacing w:after="40"/>
-            </w:pPr>
-            <w:r>
-              <w:rPr>
-                <w:rFonts w:ascii="Calibri" w:cs="Calibri" w:eastAsia="Calibri" w:hAnsi="Calibri"/>
-                <w:color w:val="645D54"/>
-                <w:sz w:val="17"/>
-                <w:szCs w:val="17"/>
-              </w:rPr>
-              <w:t xml:space="preserve">What it does to the reader.</w:t>
-            </w:r>
-          </w:p>
-        </w:tc>
-        <w:tc>
-          <w:tcPr>
-            <w:tcW w:type="dxa" w:w="6606"/>
-            <w:tcMar>
-              <w:top w:type="dxa" w:w="100"/>
-              <w:left w:type="dxa" w:w="120"/>
-              <w:bottom w:type="dxa" w:w="100"/>
-              <w:right w:type="dxa" w:w="120"/>
-            </w:tcMar>
-          </w:tcPr>
+            <w:tcW w:type="dxa" w:w="9006"/>
+            <w:tcMar>
+              <w:top w:type="dxa" w:w="80"/>
+              <w:left w:type="dxa" w:w="0"/>
+              <w:bottom w:type="dxa" w:w="80"/>
+              <w:right w:type="dxa" w:w="0"/>
+            </w:tcMar>
+          </w:tcPr>
+          <w:tbl>
+            <w:tblPr>
+              <w:tblW w:type="dxa" w:w="9003"/>
+              <w:tblBorders>
+                <w:top w:val="none" w:color="FFFFFF" w:sz="0"/>
+                <w:left w:val="none" w:color="FFFFFF" w:sz="0"/>
+                <w:bottom w:val="none" w:color="FFFFFF" w:sz="0"/>
+                <w:right w:val="none" w:color="FFFFFF" w:sz="0"/>
+                <w:insideH w:val="single" w:color="auto" w:sz="4"/>
+                <w:insideV w:val="single" w:color="auto" w:sz="4"/>
+              </w:tblBorders>
+            </w:tblPr>
+            <w:tblGrid>
+              <w:gridCol w:w="2701"/>
+              <w:gridCol w:w="900"/>
+              <w:gridCol w:w="2701"/>
+              <w:gridCol w:w="2701"/>
+            </w:tblGrid>
+            <w:tr>
+              <w:trPr>
+                <w:trHeight w:val="260" w:hRule="exact"/>
+              </w:trPr>
+              <w:tc>
+                <w:tcPr>
+                  <w:tcW w:type="dxa" w:w="2701"/>
+                  <w:shd w:fill="F5D75A" w:color="auto" w:val="clear"/>
+                  <w:tcMar>
+                    <w:top w:type="dxa" w:w="0"/>
+                    <w:left w:type="dxa" w:w="0"/>
+                    <w:bottom w:type="dxa" w:w="0"/>
+                    <w:right w:type="dxa" w:w="0"/>
+                  </w:tcMar>
+                </w:tcPr>
+                <w:p>
+                  <w:pPr>
+                    <w:spacing w:after="0" w:line="200" w:lineRule="exact"/>
+                  </w:pPr>
+                  <w:r>
+                    <w:rPr>
+                      <w:sz w:val="8"/>
+                      <w:szCs w:val="8"/>
+                    </w:rPr>
+                    <w:t xml:space="preserve"/>
+                  </w:r>
+                </w:p>
+              </w:tc>
+              <w:tc>
+                <w:tcPr>
+                  <w:tcW w:type="dxa" w:w="900"/>
+                  <w:shd w:fill="F2B27A" w:color="auto" w:val="clear"/>
+                  <w:tcMar>
+                    <w:top w:type="dxa" w:w="0"/>
+                    <w:left w:type="dxa" w:w="0"/>
+                    <w:bottom w:type="dxa" w:w="0"/>
+                    <w:right w:type="dxa" w:w="0"/>
+                  </w:tcMar>
+                </w:tcPr>
+                <w:p>
+                  <w:pPr>
+                    <w:spacing w:after="0" w:line="200" w:lineRule="exact"/>
+                  </w:pPr>
+                  <w:r>
+                    <w:rPr>
+                      <w:sz w:val="8"/>
+                      <w:szCs w:val="8"/>
+                    </w:rPr>
+                    <w:t xml:space="preserve"/>
+                  </w:r>
+                </w:p>
+              </w:tc>
+              <w:tc>
+                <w:tcPr>
+                  <w:tcW w:type="dxa" w:w="2701"/>
+                  <w:shd w:fill="7FB3E6" w:color="auto" w:val="clear"/>
+                  <w:tcMar>
+                    <w:top w:type="dxa" w:w="0"/>
+                    <w:left w:type="dxa" w:w="0"/>
+                    <w:bottom w:type="dxa" w:w="0"/>
+                    <w:right w:type="dxa" w:w="0"/>
+                  </w:tcMar>
+                </w:tcPr>
+                <w:p>
+                  <w:pPr>
+                    <w:spacing w:after="0" w:line="200" w:lineRule="exact"/>
+                  </w:pPr>
+                  <w:r>
+                    <w:rPr>
+                      <w:sz w:val="8"/>
+                      <w:szCs w:val="8"/>
+                    </w:rPr>
+                    <w:t xml:space="preserve"/>
+                  </w:r>
+                </w:p>
+              </w:tc>
+              <w:tc>
+                <w:tcPr>
+                  <w:tcW w:type="dxa" w:w="2701"/>
+                  <w:shd w:fill="8FD39A" w:color="auto" w:val="clear"/>
+                  <w:tcMar>
+                    <w:top w:type="dxa" w:w="0"/>
+                    <w:left w:type="dxa" w:w="0"/>
+                    <w:bottom w:type="dxa" w:w="0"/>
+                    <w:right w:type="dxa" w:w="0"/>
+                  </w:tcMar>
+                </w:tcPr>
+                <w:p>
+                  <w:pPr>
+                    <w:spacing w:after="0" w:line="200" w:lineRule="exact"/>
+                  </w:pPr>
+                  <w:r>
+                    <w:rPr>
+                      <w:sz w:val="8"/>
+                      <w:szCs w:val="8"/>
+                    </w:rPr>
+                    <w:t xml:space="preserve"/>
+                  </w:r>
+                </w:p>
+              </w:tc>
+            </w:tr>
+          </w:tbl>
           <w:p/>
         </w:tc>
       </w:tr>
       <w:tr>
         <w:trPr>
-          <w:trHeight w:val="900" w:hRule="atLeast"/>
+          <w:trHeight w:val="420" w:hRule="atLeast"/>
         </w:trPr>
         <w:tc>
           <w:tcPr>
-            <w:tcW w:type="dxa" w:w="700"/>
-            <w:tcMar>
-              <w:top w:type="dxa" w:w="100"/>
+            <w:tcW w:type="dxa" w:w="900"/>
+            <w:tcMar>
+              <w:top w:type="dxa" w:w="60"/>
               <w:left w:type="dxa" w:w="120"/>
-              <w:bottom w:type="dxa" w:w="100"/>
+              <w:bottom w:type="dxa" w:w="60"/>
               <w:right w:type="dxa" w:w="60"/>
             </w:tcMar>
           </w:tcPr>
           <w:p>
             <w:r>
               <w:rPr>
-                <w:rFonts w:ascii="Georgia" w:cs="Georgia" w:eastAsia="Georgia" w:hAnsi="Georgia"/>
+                <w:rFonts w:ascii="Calibri" w:cs="Calibri" w:eastAsia="Calibri" w:hAnsi="Calibri"/>
                 <w:b/>
                 <w:bCs/>
-                <w:color w:val="1D3C34"/>
-                <w:sz w:val="40"/>
-                <w:szCs w:val="40"/>
+                <w:color w:val="A83232"/>
+                <w:sz w:val="26"/>
+                <w:szCs w:val="26"/>
               </w:rPr>
               <w:t xml:space="preserve">E</w:t>
             </w:r>
@@ -531,108 +573,160 @@
         </w:tc>
         <w:tc>
           <w:tcPr>
-            <w:tcW w:type="dxa" w:w="2600"/>
-            <w:shd w:fill="F6F1E6" w:color="auto" w:val="clear"/>
-            <w:tcMar>
-              <w:top w:type="dxa" w:w="100"/>
-              <w:left w:type="dxa" w:w="100"/>
-              <w:bottom w:type="dxa" w:w="100"/>
-              <w:right w:type="dxa" w:w="100"/>
-            </w:tcMar>
-          </w:tcPr>
-          <w:p>
-            <w:pPr>
-              <w:spacing w:after="40"/>
-            </w:pPr>
-            <w:r>
-              <w:rPr>
-                <w:rFonts w:ascii="Calibri" w:cs="Calibri" w:eastAsia="Calibri" w:hAnsi="Calibri"/>
-                <w:color w:val="645D54"/>
-                <w:sz w:val="17"/>
-                <w:szCs w:val="17"/>
-              </w:rPr>
-              <w:t xml:space="preserve">Evidence and explanation.</w:t>
-            </w:r>
-          </w:p>
-          <w:p>
-            <w:pPr>
-              <w:spacing w:after="40"/>
-            </w:pPr>
-            <w:r>
-              <w:rPr>
-                <w:rFonts w:ascii="Calibri" w:cs="Calibri" w:eastAsia="Calibri" w:hAnsi="Calibri"/>
-                <w:color w:val="645D54"/>
-                <w:sz w:val="17"/>
-                <w:szCs w:val="17"/>
-              </w:rPr>
-              <w:t xml:space="preserve">A second quote.</w:t>
-            </w:r>
-          </w:p>
-          <w:p>
-            <w:pPr>
-              <w:spacing w:after="40"/>
-            </w:pPr>
-            <w:r>
-              <w:rPr>
-                <w:rFonts w:ascii="Calibri" w:cs="Calibri" w:eastAsia="Calibri" w:hAnsi="Calibri"/>
-                <w:color w:val="645D54"/>
-                <w:sz w:val="17"/>
-                <w:szCs w:val="17"/>
-              </w:rPr>
-              <w:t xml:space="preserve">What it shows about reason B.</w:t>
-            </w:r>
-          </w:p>
-          <w:p>
-            <w:pPr>
-              <w:spacing w:after="40"/>
-            </w:pPr>
-            <w:r>
-              <w:rPr>
-                <w:rFonts w:ascii="Calibri" w:cs="Calibri" w:eastAsia="Calibri" w:hAnsi="Calibri"/>
-                <w:color w:val="645D54"/>
-                <w:sz w:val="17"/>
-                <w:szCs w:val="17"/>
-              </w:rPr>
-              <w:t xml:space="preserve">What it does to the reader.</w:t>
-            </w:r>
-          </w:p>
-        </w:tc>
-        <w:tc>
-          <w:tcPr>
-            <w:tcW w:type="dxa" w:w="6606"/>
-            <w:tcMar>
-              <w:top w:type="dxa" w:w="100"/>
-              <w:left w:type="dxa" w:w="120"/>
-              <w:bottom w:type="dxa" w:w="100"/>
-              <w:right w:type="dxa" w:w="120"/>
-            </w:tcMar>
-          </w:tcPr>
+            <w:tcW w:type="dxa" w:w="9006"/>
+            <w:tcMar>
+              <w:top w:type="dxa" w:w="80"/>
+              <w:left w:type="dxa" w:w="0"/>
+              <w:bottom w:type="dxa" w:w="80"/>
+              <w:right w:type="dxa" w:w="0"/>
+            </w:tcMar>
+          </w:tcPr>
+          <w:tbl>
+            <w:tblPr>
+              <w:tblW w:type="dxa" w:w="9003"/>
+              <w:tblBorders>
+                <w:top w:val="none" w:color="FFFFFF" w:sz="0"/>
+                <w:left w:val="none" w:color="FFFFFF" w:sz="0"/>
+                <w:bottom w:val="none" w:color="FFFFFF" w:sz="0"/>
+                <w:right w:val="none" w:color="FFFFFF" w:sz="0"/>
+                <w:insideH w:val="single" w:color="auto" w:sz="4"/>
+                <w:insideV w:val="single" w:color="auto" w:sz="4"/>
+              </w:tblBorders>
+            </w:tblPr>
+            <w:tblGrid>
+              <w:gridCol w:w="2701"/>
+              <w:gridCol w:w="900"/>
+              <w:gridCol w:w="2701"/>
+              <w:gridCol w:w="2701"/>
+            </w:tblGrid>
+            <w:tr>
+              <w:trPr>
+                <w:trHeight w:val="260" w:hRule="exact"/>
+              </w:trPr>
+              <w:tc>
+                <w:tcPr>
+                  <w:tcW w:type="dxa" w:w="2701"/>
+                  <w:shd w:fill="F5D75A" w:color="auto" w:val="clear"/>
+                  <w:tcMar>
+                    <w:top w:type="dxa" w:w="0"/>
+                    <w:left w:type="dxa" w:w="0"/>
+                    <w:bottom w:type="dxa" w:w="0"/>
+                    <w:right w:type="dxa" w:w="0"/>
+                  </w:tcMar>
+                </w:tcPr>
+                <w:p>
+                  <w:pPr>
+                    <w:spacing w:after="0" w:line="200" w:lineRule="exact"/>
+                  </w:pPr>
+                  <w:r>
+                    <w:rPr>
+                      <w:sz w:val="8"/>
+                      <w:szCs w:val="8"/>
+                    </w:rPr>
+                    <w:t xml:space="preserve"/>
+                  </w:r>
+                </w:p>
+              </w:tc>
+              <w:tc>
+                <w:tcPr>
+                  <w:tcW w:type="dxa" w:w="900"/>
+                  <w:shd w:fill="F2B27A" w:color="auto" w:val="clear"/>
+                  <w:tcMar>
+                    <w:top w:type="dxa" w:w="0"/>
+                    <w:left w:type="dxa" w:w="0"/>
+                    <w:bottom w:type="dxa" w:w="0"/>
+                    <w:right w:type="dxa" w:w="0"/>
+                  </w:tcMar>
+                </w:tcPr>
+                <w:p>
+                  <w:pPr>
+                    <w:spacing w:after="0" w:line="200" w:lineRule="exact"/>
+                  </w:pPr>
+                  <w:r>
+                    <w:rPr>
+                      <w:sz w:val="8"/>
+                      <w:szCs w:val="8"/>
+                    </w:rPr>
+                    <w:t xml:space="preserve"/>
+                  </w:r>
+                </w:p>
+              </w:tc>
+              <w:tc>
+                <w:tcPr>
+                  <w:tcW w:type="dxa" w:w="2701"/>
+                  <w:shd w:fill="7FB3E6" w:color="auto" w:val="clear"/>
+                  <w:tcMar>
+                    <w:top w:type="dxa" w:w="0"/>
+                    <w:left w:type="dxa" w:w="0"/>
+                    <w:bottom w:type="dxa" w:w="0"/>
+                    <w:right w:type="dxa" w:w="0"/>
+                  </w:tcMar>
+                </w:tcPr>
+                <w:p>
+                  <w:pPr>
+                    <w:spacing w:after="0" w:line="200" w:lineRule="exact"/>
+                  </w:pPr>
+                  <w:r>
+                    <w:rPr>
+                      <w:sz w:val="8"/>
+                      <w:szCs w:val="8"/>
+                    </w:rPr>
+                    <w:t xml:space="preserve"/>
+                  </w:r>
+                </w:p>
+              </w:tc>
+              <w:tc>
+                <w:tcPr>
+                  <w:tcW w:type="dxa" w:w="2701"/>
+                  <w:shd w:fill="8FD39A" w:color="auto" w:val="clear"/>
+                  <w:tcMar>
+                    <w:top w:type="dxa" w:w="0"/>
+                    <w:left w:type="dxa" w:w="0"/>
+                    <w:bottom w:type="dxa" w:w="0"/>
+                    <w:right w:type="dxa" w:w="0"/>
+                  </w:tcMar>
+                </w:tcPr>
+                <w:p>
+                  <w:pPr>
+                    <w:spacing w:after="0" w:line="200" w:lineRule="exact"/>
+                  </w:pPr>
+                  <w:r>
+                    <w:rPr>
+                      <w:sz w:val="8"/>
+                      <w:szCs w:val="8"/>
+                    </w:rPr>
+                    <w:t xml:space="preserve"/>
+                  </w:r>
+                </w:p>
+              </w:tc>
+            </w:tr>
+          </w:tbl>
           <w:p/>
         </w:tc>
       </w:tr>
       <w:tr>
         <w:trPr>
-          <w:trHeight w:val="900" w:hRule="atLeast"/>
+          <w:trHeight w:val="420" w:hRule="atLeast"/>
         </w:trPr>
         <w:tc>
           <w:tcPr>
-            <w:tcW w:type="dxa" w:w="700"/>
-            <w:tcMar>
-              <w:top w:type="dxa" w:w="100"/>
+            <w:tcW w:type="dxa" w:w="900"/>
+            <w:tcMar>
+              <w:top w:type="dxa" w:w="60"/>
               <w:left w:type="dxa" w:w="120"/>
-              <w:bottom w:type="dxa" w:w="100"/>
+              <w:bottom w:type="dxa" w:w="60"/>
               <w:right w:type="dxa" w:w="60"/>
             </w:tcMar>
           </w:tcPr>
           <w:p>
             <w:r>
               <w:rPr>
-                <w:rFonts w:ascii="Georgia" w:cs="Georgia" w:eastAsia="Georgia" w:hAnsi="Georgia"/>
+                <w:rFonts w:ascii="Calibri" w:cs="Calibri" w:eastAsia="Calibri" w:hAnsi="Calibri"/>
                 <w:b/>
                 <w:bCs/>
-                <w:color w:val="1D3C34"/>
-                <w:sz w:val="40"/>
-                <w:szCs w:val="40"/>
+                <w:color w:val="A83232"/>
+                <w:sz w:val="26"/>
+                <w:szCs w:val="26"/>
               </w:rPr>
               <w:t xml:space="preserve">L</w:t>
             </w:r>
@@ -640,58 +734,127 @@
         </w:tc>
         <w:tc>
           <w:tcPr>
-            <w:tcW w:type="dxa" w:w="2600"/>
-            <w:shd w:fill="F6F1E6" w:color="auto" w:val="clear"/>
-            <w:tcMar>
-              <w:top w:type="dxa" w:w="100"/>
-              <w:left w:type="dxa" w:w="100"/>
-              <w:bottom w:type="dxa" w:w="100"/>
-              <w:right w:type="dxa" w:w="100"/>
-            </w:tcMar>
-          </w:tcPr>
-          <w:p>
-            <w:pPr>
-              <w:spacing w:after="40"/>
-            </w:pPr>
-            <w:r>
-              <w:rPr>
-                <w:rFonts w:ascii="Calibri" w:cs="Calibri" w:eastAsia="Calibri" w:hAnsi="Calibri"/>
-                <w:color w:val="645D54"/>
-                <w:sz w:val="17"/>
-                <w:szCs w:val="17"/>
-              </w:rPr>
-              <w:t xml:space="preserve">Link.</w:t>
-            </w:r>
-          </w:p>
-          <w:p>
-            <w:pPr>
-              <w:spacing w:after="40"/>
-            </w:pPr>
-            <w:r>
-              <w:rPr>
-                <w:rFonts w:ascii="Calibri" w:cs="Calibri" w:eastAsia="Calibri" w:hAnsi="Calibri"/>
-                <w:color w:val="645D54"/>
-                <w:sz w:val="17"/>
-                <w:szCs w:val="17"/>
-              </w:rPr>
-              <w:t xml:space="preserve">Tie A and B back to the main idea.</w:t>
-            </w:r>
-          </w:p>
-        </w:tc>
-        <w:tc>
-          <w:tcPr>
-            <w:tcW w:type="dxa" w:w="6606"/>
-            <w:tcMar>
-              <w:top w:type="dxa" w:w="100"/>
-              <w:left w:type="dxa" w:w="120"/>
-              <w:bottom w:type="dxa" w:w="100"/>
-              <w:right w:type="dxa" w:w="120"/>
-            </w:tcMar>
-          </w:tcPr>
+            <w:tcW w:type="dxa" w:w="9006"/>
+            <w:tcMar>
+              <w:top w:type="dxa" w:w="80"/>
+              <w:left w:type="dxa" w:w="0"/>
+              <w:bottom w:type="dxa" w:w="80"/>
+              <w:right w:type="dxa" w:w="0"/>
+            </w:tcMar>
+          </w:tcPr>
+          <w:tbl>
+            <w:tblPr>
+              <w:tblW w:type="dxa" w:w="9005"/>
+              <w:tblBorders>
+                <w:top w:val="none" w:color="FFFFFF" w:sz="0"/>
+                <w:left w:val="none" w:color="FFFFFF" w:sz="0"/>
+                <w:bottom w:val="none" w:color="FFFFFF" w:sz="0"/>
+                <w:right w:val="none" w:color="FFFFFF" w:sz="0"/>
+                <w:insideH w:val="single" w:color="auto" w:sz="4"/>
+                <w:insideV w:val="single" w:color="auto" w:sz="4"/>
+              </w:tblBorders>
+            </w:tblPr>
+            <w:tblGrid>
+              <w:gridCol w:w="2573"/>
+              <w:gridCol w:w="2573"/>
+              <w:gridCol w:w="3859"/>
+            </w:tblGrid>
+            <w:tr>
+              <w:trPr>
+                <w:trHeight w:val="260" w:hRule="exact"/>
+              </w:trPr>
+              <w:tc>
+                <w:tcPr>
+                  <w:tcW w:type="dxa" w:w="2573"/>
+                  <w:shd w:fill="7FB3E6" w:color="auto" w:val="clear"/>
+                  <w:tcMar>
+                    <w:top w:type="dxa" w:w="0"/>
+                    <w:left w:type="dxa" w:w="0"/>
+                    <w:bottom w:type="dxa" w:w="0"/>
+                    <w:right w:type="dxa" w:w="0"/>
+                  </w:tcMar>
+                </w:tcPr>
+                <w:p>
+                  <w:pPr>
+                    <w:spacing w:after="0" w:line="200" w:lineRule="exact"/>
+                  </w:pPr>
+                  <w:r>
+                    <w:rPr>
+                      <w:sz w:val="8"/>
+                      <w:szCs w:val="8"/>
+                    </w:rPr>
+                    <w:t xml:space="preserve"/>
+                  </w:r>
+                </w:p>
+              </w:tc>
+              <w:tc>
+                <w:tcPr>
+                  <w:tcW w:type="dxa" w:w="2573"/>
+                  <w:shd w:fill="7FB3E6" w:color="auto" w:val="clear"/>
+                  <w:tcMar>
+                    <w:top w:type="dxa" w:w="0"/>
+                    <w:left w:type="dxa" w:w="0"/>
+                    <w:bottom w:type="dxa" w:w="0"/>
+                    <w:right w:type="dxa" w:w="0"/>
+                  </w:tcMar>
+                </w:tcPr>
+                <w:p>
+                  <w:pPr>
+                    <w:spacing w:after="0" w:line="200" w:lineRule="exact"/>
+                  </w:pPr>
+                  <w:r>
+                    <w:rPr>
+                      <w:sz w:val="8"/>
+                      <w:szCs w:val="8"/>
+                    </w:rPr>
+                    <w:t xml:space="preserve"/>
+                  </w:r>
+                </w:p>
+              </w:tc>
+              <w:tc>
+                <w:tcPr>
+                  <w:tcW w:type="dxa" w:w="3859"/>
+                  <w:shd w:fill="8FD39A" w:color="auto" w:val="clear"/>
+                  <w:tcMar>
+                    <w:top w:type="dxa" w:w="0"/>
+                    <w:left w:type="dxa" w:w="0"/>
+                    <w:bottom w:type="dxa" w:w="0"/>
+                    <w:right w:type="dxa" w:w="0"/>
+                  </w:tcMar>
+                </w:tcPr>
+                <w:p>
+                  <w:pPr>
+                    <w:spacing w:after="0" w:line="200" w:lineRule="exact"/>
+                  </w:pPr>
+                  <w:r>
+                    <w:rPr>
+                      <w:sz w:val="8"/>
+                      <w:szCs w:val="8"/>
+                    </w:rPr>
+                    <w:t xml:space="preserve"/>
+                  </w:r>
+                </w:p>
+              </w:tc>
+            </w:tr>
+          </w:tbl>
           <w:p/>
         </w:tc>
       </w:tr>
     </w:tbl>
+    <w:p>
+      <w:pPr>
+        <w:spacing w:after="120" w:before="120"/>
+      </w:pPr>
+      <w:r>
+        <w:rPr>
+          <w:rFonts w:ascii="Calibri" w:cs="Calibri" w:eastAsia="Calibri" w:hAnsi="Calibri"/>
+          <w:color w:val="645D54"/>
+          <w:sz w:val="18"/>
+          <w:szCs w:val="18"/>
+        </w:rPr>
+        <w:t xml:space="preserve">T  the idea, and why it matters.   E  a quote, what it shows, what it does to the reader.   L  A and B, back to the main idea.</w:t>
+      </w:r>
+    </w:p>
     <w:p>
       <w:r>
         <w:br w:type="page"/>
@@ -724,7 +887,7 @@
           <w:sz w:val="22"/>
           <w:szCs w:val="22"/>
         </w:rPr>
-        <w:t xml:space="preserve">Colour each part of the sentence: </w:t>
+        <w:t xml:space="preserve">Colour each sentence to match its bar: </w:t>
       </w:r>
       <w:r>
         <w:rPr>
@@ -811,6 +974,567 @@
         <w:t xml:space="preserve">.</w:t>
       </w:r>
     </w:p>
+    <w:tbl>
+      <w:tblPr>
+        <w:tblW w:type="dxa" w:w="9906"/>
+        <w:tblBorders>
+          <w:top w:val="none" w:color="FFFFFF" w:sz="0"/>
+          <w:left w:val="none" w:color="FFFFFF" w:sz="0"/>
+          <w:bottom w:val="none" w:color="FFFFFF" w:sz="0"/>
+          <w:right w:val="none" w:color="FFFFFF" w:sz="0"/>
+          <w:insideH w:val="single" w:color="auto" w:sz="4"/>
+          <w:insideV w:val="single" w:color="auto" w:sz="4"/>
+        </w:tblBorders>
+      </w:tblPr>
+      <w:tblGrid>
+        <w:gridCol w:w="900"/>
+        <w:gridCol w:w="9006"/>
+      </w:tblGrid>
+      <w:tr>
+        <w:trPr>
+          <w:trHeight w:val="420" w:hRule="atLeast"/>
+        </w:trPr>
+        <w:tc>
+          <w:tcPr>
+            <w:tcW w:type="dxa" w:w="900"/>
+            <w:tcMar>
+              <w:top w:type="dxa" w:w="60"/>
+              <w:left w:type="dxa" w:w="120"/>
+              <w:bottom w:type="dxa" w:w="60"/>
+              <w:right w:type="dxa" w:w="60"/>
+            </w:tcMar>
+          </w:tcPr>
+          <w:p>
+            <w:r>
+              <w:rPr>
+                <w:rFonts w:ascii="Calibri" w:cs="Calibri" w:eastAsia="Calibri" w:hAnsi="Calibri"/>
+                <w:b/>
+                <w:bCs/>
+                <w:color w:val="A83232"/>
+                <w:sz w:val="26"/>
+                <w:szCs w:val="26"/>
+              </w:rPr>
+              <w:t xml:space="preserve">T</w:t>
+            </w:r>
+          </w:p>
+        </w:tc>
+        <w:tc>
+          <w:tcPr>
+            <w:tcW w:type="dxa" w:w="9006"/>
+            <w:tcMar>
+              <w:top w:type="dxa" w:w="80"/>
+              <w:left w:type="dxa" w:w="0"/>
+              <w:bottom w:type="dxa" w:w="80"/>
+              <w:right w:type="dxa" w:w="0"/>
+            </w:tcMar>
+          </w:tcPr>
+          <w:tbl>
+            <w:tblPr>
+              <w:tblW w:type="dxa" w:w="9006"/>
+              <w:tblBorders>
+                <w:top w:val="none" w:color="FFFFFF" w:sz="0"/>
+                <w:left w:val="none" w:color="FFFFFF" w:sz="0"/>
+                <w:bottom w:val="none" w:color="FFFFFF" w:sz="0"/>
+                <w:right w:val="none" w:color="FFFFFF" w:sz="0"/>
+                <w:insideH w:val="single" w:color="auto" w:sz="4"/>
+                <w:insideV w:val="single" w:color="auto" w:sz="4"/>
+              </w:tblBorders>
+            </w:tblPr>
+            <w:tblGrid>
+              <w:gridCol w:w="9006"/>
+            </w:tblGrid>
+            <w:tr>
+              <w:trPr>
+                <w:trHeight w:val="260" w:hRule="exact"/>
+              </w:trPr>
+              <w:tc>
+                <w:tcPr>
+                  <w:tcW w:type="dxa" w:w="9006"/>
+                  <w:shd w:fill="7FB3E6" w:color="auto" w:val="clear"/>
+                  <w:tcMar>
+                    <w:top w:type="dxa" w:w="0"/>
+                    <w:left w:type="dxa" w:w="0"/>
+                    <w:bottom w:type="dxa" w:w="0"/>
+                    <w:right w:type="dxa" w:w="0"/>
+                  </w:tcMar>
+                </w:tcPr>
+                <w:p>
+                  <w:pPr>
+                    <w:spacing w:after="0" w:line="200" w:lineRule="exact"/>
+                  </w:pPr>
+                  <w:r>
+                    <w:rPr>
+                      <w:sz w:val="8"/>
+                      <w:szCs w:val="8"/>
+                    </w:rPr>
+                    <w:t xml:space="preserve"/>
+                  </w:r>
+                </w:p>
+              </w:tc>
+            </w:tr>
+          </w:tbl>
+          <w:p/>
+        </w:tc>
+      </w:tr>
+      <w:tr>
+        <w:trPr>
+          <w:trHeight w:val="420" w:hRule="atLeast"/>
+        </w:trPr>
+        <w:tc>
+          <w:tcPr>
+            <w:tcW w:type="dxa" w:w="900"/>
+            <w:tcMar>
+              <w:top w:type="dxa" w:w="60"/>
+              <w:left w:type="dxa" w:w="120"/>
+              <w:bottom w:type="dxa" w:w="60"/>
+              <w:right w:type="dxa" w:w="60"/>
+            </w:tcMar>
+          </w:tcPr>
+          <w:p>
+            <w:r>
+              <w:rPr>
+                <w:rFonts w:ascii="Calibri" w:cs="Calibri" w:eastAsia="Calibri" w:hAnsi="Calibri"/>
+                <w:b/>
+                <w:bCs/>
+                <w:color w:val="A83232"/>
+                <w:sz w:val="26"/>
+                <w:szCs w:val="26"/>
+              </w:rPr>
+              <w:t xml:space="preserve">E</w:t>
+            </w:r>
+          </w:p>
+        </w:tc>
+        <w:tc>
+          <w:tcPr>
+            <w:tcW w:type="dxa" w:w="9006"/>
+            <w:tcMar>
+              <w:top w:type="dxa" w:w="80"/>
+              <w:left w:type="dxa" w:w="0"/>
+              <w:bottom w:type="dxa" w:w="80"/>
+              <w:right w:type="dxa" w:w="0"/>
+            </w:tcMar>
+          </w:tcPr>
+          <w:tbl>
+            <w:tblPr>
+              <w:tblW w:type="dxa" w:w="9003"/>
+              <w:tblBorders>
+                <w:top w:val="none" w:color="FFFFFF" w:sz="0"/>
+                <w:left w:val="none" w:color="FFFFFF" w:sz="0"/>
+                <w:bottom w:val="none" w:color="FFFFFF" w:sz="0"/>
+                <w:right w:val="none" w:color="FFFFFF" w:sz="0"/>
+                <w:insideH w:val="single" w:color="auto" w:sz="4"/>
+                <w:insideV w:val="single" w:color="auto" w:sz="4"/>
+              </w:tblBorders>
+            </w:tblPr>
+            <w:tblGrid>
+              <w:gridCol w:w="2701"/>
+              <w:gridCol w:w="900"/>
+              <w:gridCol w:w="2701"/>
+              <w:gridCol w:w="2701"/>
+            </w:tblGrid>
+            <w:tr>
+              <w:trPr>
+                <w:trHeight w:val="260" w:hRule="exact"/>
+              </w:trPr>
+              <w:tc>
+                <w:tcPr>
+                  <w:tcW w:type="dxa" w:w="2701"/>
+                  <w:shd w:fill="F5D75A" w:color="auto" w:val="clear"/>
+                  <w:tcMar>
+                    <w:top w:type="dxa" w:w="0"/>
+                    <w:left w:type="dxa" w:w="0"/>
+                    <w:bottom w:type="dxa" w:w="0"/>
+                    <w:right w:type="dxa" w:w="0"/>
+                  </w:tcMar>
+                </w:tcPr>
+                <w:p>
+                  <w:pPr>
+                    <w:spacing w:after="0" w:line="200" w:lineRule="exact"/>
+                  </w:pPr>
+                  <w:r>
+                    <w:rPr>
+                      <w:sz w:val="8"/>
+                      <w:szCs w:val="8"/>
+                    </w:rPr>
+                    <w:t xml:space="preserve"/>
+                  </w:r>
+                </w:p>
+              </w:tc>
+              <w:tc>
+                <w:tcPr>
+                  <w:tcW w:type="dxa" w:w="900"/>
+                  <w:shd w:fill="F2B27A" w:color="auto" w:val="clear"/>
+                  <w:tcMar>
+                    <w:top w:type="dxa" w:w="0"/>
+                    <w:left w:type="dxa" w:w="0"/>
+                    <w:bottom w:type="dxa" w:w="0"/>
+                    <w:right w:type="dxa" w:w="0"/>
+                  </w:tcMar>
+                </w:tcPr>
+                <w:p>
+                  <w:pPr>
+                    <w:spacing w:after="0" w:line="200" w:lineRule="exact"/>
+                  </w:pPr>
+                  <w:r>
+                    <w:rPr>
+                      <w:sz w:val="8"/>
+                      <w:szCs w:val="8"/>
+                    </w:rPr>
+                    <w:t xml:space="preserve"/>
+                  </w:r>
+                </w:p>
+              </w:tc>
+              <w:tc>
+                <w:tcPr>
+                  <w:tcW w:type="dxa" w:w="2701"/>
+                  <w:shd w:fill="7FB3E6" w:color="auto" w:val="clear"/>
+                  <w:tcMar>
+                    <w:top w:type="dxa" w:w="0"/>
+                    <w:left w:type="dxa" w:w="0"/>
+                    <w:bottom w:type="dxa" w:w="0"/>
+                    <w:right w:type="dxa" w:w="0"/>
+                  </w:tcMar>
+                </w:tcPr>
+                <w:p>
+                  <w:pPr>
+                    <w:spacing w:after="0" w:line="200" w:lineRule="exact"/>
+                  </w:pPr>
+                  <w:r>
+                    <w:rPr>
+                      <w:sz w:val="8"/>
+                      <w:szCs w:val="8"/>
+                    </w:rPr>
+                    <w:t xml:space="preserve"/>
+                  </w:r>
+                </w:p>
+              </w:tc>
+              <w:tc>
+                <w:tcPr>
+                  <w:tcW w:type="dxa" w:w="2701"/>
+                  <w:shd w:fill="8FD39A" w:color="auto" w:val="clear"/>
+                  <w:tcMar>
+                    <w:top w:type="dxa" w:w="0"/>
+                    <w:left w:type="dxa" w:w="0"/>
+                    <w:bottom w:type="dxa" w:w="0"/>
+                    <w:right w:type="dxa" w:w="0"/>
+                  </w:tcMar>
+                </w:tcPr>
+                <w:p>
+                  <w:pPr>
+                    <w:spacing w:after="0" w:line="200" w:lineRule="exact"/>
+                  </w:pPr>
+                  <w:r>
+                    <w:rPr>
+                      <w:sz w:val="8"/>
+                      <w:szCs w:val="8"/>
+                    </w:rPr>
+                    <w:t xml:space="preserve"/>
+                  </w:r>
+                </w:p>
+              </w:tc>
+            </w:tr>
+          </w:tbl>
+          <w:p/>
+        </w:tc>
+      </w:tr>
+      <w:tr>
+        <w:trPr>
+          <w:trHeight w:val="420" w:hRule="atLeast"/>
+        </w:trPr>
+        <w:tc>
+          <w:tcPr>
+            <w:tcW w:type="dxa" w:w="900"/>
+            <w:tcMar>
+              <w:top w:type="dxa" w:w="60"/>
+              <w:left w:type="dxa" w:w="120"/>
+              <w:bottom w:type="dxa" w:w="60"/>
+              <w:right w:type="dxa" w:w="60"/>
+            </w:tcMar>
+          </w:tcPr>
+          <w:p>
+            <w:r>
+              <w:rPr>
+                <w:rFonts w:ascii="Calibri" w:cs="Calibri" w:eastAsia="Calibri" w:hAnsi="Calibri"/>
+                <w:b/>
+                <w:bCs/>
+                <w:color w:val="A83232"/>
+                <w:sz w:val="26"/>
+                <w:szCs w:val="26"/>
+              </w:rPr>
+              <w:t xml:space="preserve">E</w:t>
+            </w:r>
+          </w:p>
+        </w:tc>
+        <w:tc>
+          <w:tcPr>
+            <w:tcW w:type="dxa" w:w="9006"/>
+            <w:tcMar>
+              <w:top w:type="dxa" w:w="80"/>
+              <w:left w:type="dxa" w:w="0"/>
+              <w:bottom w:type="dxa" w:w="80"/>
+              <w:right w:type="dxa" w:w="0"/>
+            </w:tcMar>
+          </w:tcPr>
+          <w:tbl>
+            <w:tblPr>
+              <w:tblW w:type="dxa" w:w="9003"/>
+              <w:tblBorders>
+                <w:top w:val="none" w:color="FFFFFF" w:sz="0"/>
+                <w:left w:val="none" w:color="FFFFFF" w:sz="0"/>
+                <w:bottom w:val="none" w:color="FFFFFF" w:sz="0"/>
+                <w:right w:val="none" w:color="FFFFFF" w:sz="0"/>
+                <w:insideH w:val="single" w:color="auto" w:sz="4"/>
+                <w:insideV w:val="single" w:color="auto" w:sz="4"/>
+              </w:tblBorders>
+            </w:tblPr>
+            <w:tblGrid>
+              <w:gridCol w:w="2701"/>
+              <w:gridCol w:w="900"/>
+              <w:gridCol w:w="2701"/>
+              <w:gridCol w:w="2701"/>
+            </w:tblGrid>
+            <w:tr>
+              <w:trPr>
+                <w:trHeight w:val="260" w:hRule="exact"/>
+              </w:trPr>
+              <w:tc>
+                <w:tcPr>
+                  <w:tcW w:type="dxa" w:w="2701"/>
+                  <w:shd w:fill="F5D75A" w:color="auto" w:val="clear"/>
+                  <w:tcMar>
+                    <w:top w:type="dxa" w:w="0"/>
+                    <w:left w:type="dxa" w:w="0"/>
+                    <w:bottom w:type="dxa" w:w="0"/>
+                    <w:right w:type="dxa" w:w="0"/>
+                  </w:tcMar>
+                </w:tcPr>
+                <w:p>
+                  <w:pPr>
+                    <w:spacing w:after="0" w:line="200" w:lineRule="exact"/>
+                  </w:pPr>
+                  <w:r>
+                    <w:rPr>
+                      <w:sz w:val="8"/>
+                      <w:szCs w:val="8"/>
+                    </w:rPr>
+                    <w:t xml:space="preserve"/>
+                  </w:r>
+                </w:p>
+              </w:tc>
+              <w:tc>
+                <w:tcPr>
+                  <w:tcW w:type="dxa" w:w="900"/>
+                  <w:shd w:fill="F2B27A" w:color="auto" w:val="clear"/>
+                  <w:tcMar>
+                    <w:top w:type="dxa" w:w="0"/>
+                    <w:left w:type="dxa" w:w="0"/>
+                    <w:bottom w:type="dxa" w:w="0"/>
+                    <w:right w:type="dxa" w:w="0"/>
+                  </w:tcMar>
+                </w:tcPr>
+                <w:p>
+                  <w:pPr>
+                    <w:spacing w:after="0" w:line="200" w:lineRule="exact"/>
+                  </w:pPr>
+                  <w:r>
+                    <w:rPr>
+                      <w:sz w:val="8"/>
+                      <w:szCs w:val="8"/>
+                    </w:rPr>
+                    <w:t xml:space="preserve"/>
+                  </w:r>
+                </w:p>
+              </w:tc>
+              <w:tc>
+                <w:tcPr>
+                  <w:tcW w:type="dxa" w:w="2701"/>
+                  <w:shd w:fill="7FB3E6" w:color="auto" w:val="clear"/>
+                  <w:tcMar>
+                    <w:top w:type="dxa" w:w="0"/>
+                    <w:left w:type="dxa" w:w="0"/>
+                    <w:bottom w:type="dxa" w:w="0"/>
+                    <w:right w:type="dxa" w:w="0"/>
+                  </w:tcMar>
+                </w:tcPr>
+                <w:p>
+                  <w:pPr>
+                    <w:spacing w:after="0" w:line="200" w:lineRule="exact"/>
+                  </w:pPr>
+                  <w:r>
+                    <w:rPr>
+                      <w:sz w:val="8"/>
+                      <w:szCs w:val="8"/>
+                    </w:rPr>
+                    <w:t xml:space="preserve"/>
+                  </w:r>
+                </w:p>
+              </w:tc>
+              <w:tc>
+                <w:tcPr>
+                  <w:tcW w:type="dxa" w:w="2701"/>
+                  <w:shd w:fill="8FD39A" w:color="auto" w:val="clear"/>
+                  <w:tcMar>
+                    <w:top w:type="dxa" w:w="0"/>
+                    <w:left w:type="dxa" w:w="0"/>
+                    <w:bottom w:type="dxa" w:w="0"/>
+                    <w:right w:type="dxa" w:w="0"/>
+                  </w:tcMar>
+                </w:tcPr>
+                <w:p>
+                  <w:pPr>
+                    <w:spacing w:after="0" w:line="200" w:lineRule="exact"/>
+                  </w:pPr>
+                  <w:r>
+                    <w:rPr>
+                      <w:sz w:val="8"/>
+                      <w:szCs w:val="8"/>
+                    </w:rPr>
+                    <w:t xml:space="preserve"/>
+                  </w:r>
+                </w:p>
+              </w:tc>
+            </w:tr>
+          </w:tbl>
+          <w:p/>
+        </w:tc>
+      </w:tr>
+      <w:tr>
+        <w:trPr>
+          <w:trHeight w:val="420" w:hRule="atLeast"/>
+        </w:trPr>
+        <w:tc>
+          <w:tcPr>
+            <w:tcW w:type="dxa" w:w="900"/>
+            <w:tcMar>
+              <w:top w:type="dxa" w:w="60"/>
+              <w:left w:type="dxa" w:w="120"/>
+              <w:bottom w:type="dxa" w:w="60"/>
+              <w:right w:type="dxa" w:w="60"/>
+            </w:tcMar>
+          </w:tcPr>
+          <w:p>
+            <w:r>
+              <w:rPr>
+                <w:rFonts w:ascii="Calibri" w:cs="Calibri" w:eastAsia="Calibri" w:hAnsi="Calibri"/>
+                <w:b/>
+                <w:bCs/>
+                <w:color w:val="A83232"/>
+                <w:sz w:val="26"/>
+                <w:szCs w:val="26"/>
+              </w:rPr>
+              <w:t xml:space="preserve">L</w:t>
+            </w:r>
+          </w:p>
+        </w:tc>
+        <w:tc>
+          <w:tcPr>
+            <w:tcW w:type="dxa" w:w="9006"/>
+            <w:tcMar>
+              <w:top w:type="dxa" w:w="80"/>
+              <w:left w:type="dxa" w:w="0"/>
+              <w:bottom w:type="dxa" w:w="80"/>
+              <w:right w:type="dxa" w:w="0"/>
+            </w:tcMar>
+          </w:tcPr>
+          <w:tbl>
+            <w:tblPr>
+              <w:tblW w:type="dxa" w:w="9005"/>
+              <w:tblBorders>
+                <w:top w:val="none" w:color="FFFFFF" w:sz="0"/>
+                <w:left w:val="none" w:color="FFFFFF" w:sz="0"/>
+                <w:bottom w:val="none" w:color="FFFFFF" w:sz="0"/>
+                <w:right w:val="none" w:color="FFFFFF" w:sz="0"/>
+                <w:insideH w:val="single" w:color="auto" w:sz="4"/>
+                <w:insideV w:val="single" w:color="auto" w:sz="4"/>
+              </w:tblBorders>
+            </w:tblPr>
+            <w:tblGrid>
+              <w:gridCol w:w="2573"/>
+              <w:gridCol w:w="2573"/>
+              <w:gridCol w:w="3859"/>
+            </w:tblGrid>
+            <w:tr>
+              <w:trPr>
+                <w:trHeight w:val="260" w:hRule="exact"/>
+              </w:trPr>
+              <w:tc>
+                <w:tcPr>
+                  <w:tcW w:type="dxa" w:w="2573"/>
+                  <w:shd w:fill="7FB3E6" w:color="auto" w:val="clear"/>
+                  <w:tcMar>
+                    <w:top w:type="dxa" w:w="0"/>
+                    <w:left w:type="dxa" w:w="0"/>
+                    <w:bottom w:type="dxa" w:w="0"/>
+                    <w:right w:type="dxa" w:w="0"/>
+                  </w:tcMar>
+                </w:tcPr>
+                <w:p>
+                  <w:pPr>
+                    <w:spacing w:after="0" w:line="200" w:lineRule="exact"/>
+                  </w:pPr>
+                  <w:r>
+                    <w:rPr>
+                      <w:sz w:val="8"/>
+                      <w:szCs w:val="8"/>
+                    </w:rPr>
+                    <w:t xml:space="preserve"/>
+                  </w:r>
+                </w:p>
+              </w:tc>
+              <w:tc>
+                <w:tcPr>
+                  <w:tcW w:type="dxa" w:w="2573"/>
+                  <w:shd w:fill="7FB3E6" w:color="auto" w:val="clear"/>
+                  <w:tcMar>
+                    <w:top w:type="dxa" w:w="0"/>
+                    <w:left w:type="dxa" w:w="0"/>
+                    <w:bottom w:type="dxa" w:w="0"/>
+                    <w:right w:type="dxa" w:w="0"/>
+                  </w:tcMar>
+                </w:tcPr>
+                <w:p>
+                  <w:pPr>
+                    <w:spacing w:after="0" w:line="200" w:lineRule="exact"/>
+                  </w:pPr>
+                  <w:r>
+                    <w:rPr>
+                      <w:sz w:val="8"/>
+                      <w:szCs w:val="8"/>
+                    </w:rPr>
+                    <w:t xml:space="preserve"/>
+                  </w:r>
+                </w:p>
+              </w:tc>
+              <w:tc>
+                <w:tcPr>
+                  <w:tcW w:type="dxa" w:w="3859"/>
+                  <w:shd w:fill="8FD39A" w:color="auto" w:val="clear"/>
+                  <w:tcMar>
+                    <w:top w:type="dxa" w:w="0"/>
+                    <w:left w:type="dxa" w:w="0"/>
+                    <w:bottom w:type="dxa" w:w="0"/>
+                    <w:right w:type="dxa" w:w="0"/>
+                  </w:tcMar>
+                </w:tcPr>
+                <w:p>
+                  <w:pPr>
+                    <w:spacing w:after="0" w:line="200" w:lineRule="exact"/>
+                  </w:pPr>
+                  <w:r>
+                    <w:rPr>
+                      <w:sz w:val="8"/>
+                      <w:szCs w:val="8"/>
+                    </w:rPr>
+                    <w:t xml:space="preserve"/>
+                  </w:r>
+                </w:p>
+              </w:tc>
+            </w:tr>
+          </w:tbl>
+          <w:p/>
+        </w:tc>
+      </w:tr>
+    </w:tbl>
     <w:tbl>
       <w:tblPr>
         <w:tblW w:type="dxa" w:w="9906"/>

</xml_diff>

<commit_message>
TEEL deck: the whole essay stacked beside notes on what an essay is, a press zooms to P1; sheet takes the teacher's edits and fuller notes
Co-Authored-By: Claude Fable 5.1 <noreply@anthropic.com>
Claude-Session: https://claude.ai/code/session_01TX2KYiJGekMNoBBPASQh6e
</commit_message>
<xml_diff>
--- a/BoneSparrow-TEEL-template.docx
+++ b/BoneSparrow-TEEL-template.docx
@@ -57,7 +57,8 @@
     </w:p>
     <w:p>
       <w:pPr>
-        <w:spacing w:after="120"/>
+        <w:spacing w:after="60"/>
+        <w:ind w:left="400" w:hanging="240"/>
       </w:pPr>
       <w:r>
         <w:rPr>
@@ -66,13 +67,8 @@
           <w:sz w:val="22"/>
           <w:szCs w:val="22"/>
         </w:rPr>
-        <w:t xml:space="preserve">An essay is an argument. It says one thing about the novel and then proves it, one paragraph at a time. It is written in full sentences and paragraphs, in formal language, for a reader who has already read the book. That reader does not need the story retold. They need to be shown why your idea is true.</w:t>
-      </w:r>
-    </w:p>
-    <w:p>
-      <w:pPr>
-        <w:spacing w:after="120"/>
-      </w:pPr>
+        <w:t xml:space="preserve">•  </w:t>
+      </w:r>
       <w:r>
         <w:rPr>
           <w:rFonts w:ascii="Georgia" w:cs="Georgia" w:eastAsia="Georgia" w:hAnsi="Georgia"/>
@@ -80,7 +76,167 @@
           <w:sz w:val="22"/>
           <w:szCs w:val="22"/>
         </w:rPr>
-        <w:t xml:space="preserve">A text response essay has an introduction, three body paragraphs, and a conclusion. Every body paragraph does the same job: it takes one part of your argument, gives evidence from the novel, and explains what that evidence shows and why the author wrote it that way.</w:t>
+        <w:t xml:space="preserve">A long piece of non-fiction writing about one idea, in proper sentences and paragraphs.</w:t>
+      </w:r>
+    </w:p>
+    <w:p>
+      <w:pPr>
+        <w:spacing w:after="60"/>
+        <w:ind w:left="400" w:hanging="240"/>
+      </w:pPr>
+      <w:r>
+        <w:rPr>
+          <w:rFonts w:ascii="Georgia" w:cs="Georgia" w:eastAsia="Georgia" w:hAnsi="Georgia"/>
+          <w:color w:val="1E211F"/>
+          <w:sz w:val="22"/>
+          <w:szCs w:val="22"/>
+        </w:rPr>
+        <w:t xml:space="preserve">•  </w:t>
+      </w:r>
+      <w:r>
+        <w:rPr>
+          <w:rFonts w:ascii="Georgia" w:cs="Georgia" w:eastAsia="Georgia" w:hAnsi="Georgia"/>
+          <w:color w:val="1E211F"/>
+          <w:sz w:val="22"/>
+          <w:szCs w:val="22"/>
+        </w:rPr>
+        <w:t xml:space="preserve">It can show what you understand, explain an idea, or argue for a point of view. This one argues: it says one thing about the novel and then proves it, one paragraph at a time.</w:t>
+      </w:r>
+    </w:p>
+    <w:p>
+      <w:pPr>
+        <w:spacing w:after="80" w:before="260"/>
+      </w:pPr>
+      <w:r>
+        <w:rPr>
+          <w:rFonts w:ascii="Georgia" w:cs="Georgia" w:eastAsia="Georgia" w:hAnsi="Georgia"/>
+          <w:b/>
+          <w:bCs/>
+          <w:color w:val="1D3C34"/>
+          <w:sz w:val="24"/>
+          <w:szCs w:val="24"/>
+        </w:rPr>
+        <w:t xml:space="preserve">What a text response essay is</w:t>
+      </w:r>
+    </w:p>
+    <w:p>
+      <w:pPr>
+        <w:spacing w:after="60"/>
+        <w:ind w:left="400" w:hanging="240"/>
+      </w:pPr>
+      <w:r>
+        <w:rPr>
+          <w:rFonts w:ascii="Georgia" w:cs="Georgia" w:eastAsia="Georgia" w:hAnsi="Georgia"/>
+          <w:color w:val="1E211F"/>
+          <w:sz w:val="22"/>
+          <w:szCs w:val="22"/>
+        </w:rPr>
+        <w:t xml:space="preserve">•  </w:t>
+      </w:r>
+      <w:r>
+        <w:rPr>
+          <w:rFonts w:ascii="Georgia" w:cs="Georgia" w:eastAsia="Georgia" w:hAnsi="Georgia"/>
+          <w:color w:val="1E211F"/>
+          <w:sz w:val="22"/>
+          <w:szCs w:val="22"/>
+        </w:rPr>
+        <w:t xml:space="preserve">It explains a novel to people who have already read it, in formal language. It does not retell the story.</w:t>
+      </w:r>
+    </w:p>
+    <w:p>
+      <w:pPr>
+        <w:spacing w:after="60"/>
+        <w:ind w:left="400" w:hanging="240"/>
+      </w:pPr>
+      <w:r>
+        <w:rPr>
+          <w:rFonts w:ascii="Georgia" w:cs="Georgia" w:eastAsia="Georgia" w:hAnsi="Georgia"/>
+          <w:color w:val="1E211F"/>
+          <w:sz w:val="22"/>
+          <w:szCs w:val="22"/>
+        </w:rPr>
+        <w:t xml:space="preserve">•  </w:t>
+      </w:r>
+      <w:r>
+        <w:rPr>
+          <w:rFonts w:ascii="Georgia" w:cs="Georgia" w:eastAsia="Georgia" w:hAnsi="Georgia"/>
+          <w:color w:val="1E211F"/>
+          <w:sz w:val="22"/>
+          <w:szCs w:val="22"/>
+        </w:rPr>
+        <w:t xml:space="preserve">It answers a prompt or question.</w:t>
+      </w:r>
+    </w:p>
+    <w:p>
+      <w:pPr>
+        <w:spacing w:after="60"/>
+        <w:ind w:left="400" w:hanging="240"/>
+      </w:pPr>
+      <w:r>
+        <w:rPr>
+          <w:rFonts w:ascii="Georgia" w:cs="Georgia" w:eastAsia="Georgia" w:hAnsi="Georgia"/>
+          <w:color w:val="1E211F"/>
+          <w:sz w:val="22"/>
+          <w:szCs w:val="22"/>
+        </w:rPr>
+        <w:t xml:space="preserve">•  </w:t>
+      </w:r>
+      <w:r>
+        <w:rPr>
+          <w:rFonts w:ascii="Georgia" w:cs="Georgia" w:eastAsia="Georgia" w:hAnsi="Georgia"/>
+          <w:color w:val="1E211F"/>
+          <w:sz w:val="22"/>
+          <w:szCs w:val="22"/>
+        </w:rPr>
+        <w:t xml:space="preserve">It shows what you know about the big ideas, the events and the characters.</w:t>
+      </w:r>
+    </w:p>
+    <w:p>
+      <w:pPr>
+        <w:spacing w:after="60"/>
+        <w:ind w:left="400" w:hanging="240"/>
+      </w:pPr>
+      <w:r>
+        <w:rPr>
+          <w:rFonts w:ascii="Georgia" w:cs="Georgia" w:eastAsia="Georgia" w:hAnsi="Georgia"/>
+          <w:color w:val="1E211F"/>
+          <w:sz w:val="22"/>
+          <w:szCs w:val="22"/>
+        </w:rPr>
+        <w:t xml:space="preserve">•  </w:t>
+      </w:r>
+      <w:r>
+        <w:rPr>
+          <w:rFonts w:ascii="Georgia" w:cs="Georgia" w:eastAsia="Georgia" w:hAnsi="Georgia"/>
+          <w:color w:val="1E211F"/>
+          <w:sz w:val="22"/>
+          <w:szCs w:val="22"/>
+        </w:rPr>
+        <w:t xml:space="preserve">It looks at how the author has written about those things.</w:t>
+      </w:r>
+    </w:p>
+    <w:p>
+      <w:pPr>
+        <w:spacing w:after="60"/>
+        <w:ind w:left="400" w:hanging="240"/>
+      </w:pPr>
+      <w:r>
+        <w:rPr>
+          <w:rFonts w:ascii="Georgia" w:cs="Georgia" w:eastAsia="Georgia" w:hAnsi="Georgia"/>
+          <w:color w:val="1E211F"/>
+          <w:sz w:val="22"/>
+          <w:szCs w:val="22"/>
+        </w:rPr>
+        <w:t xml:space="preserve">•  </w:t>
+      </w:r>
+      <w:r>
+        <w:rPr>
+          <w:rFonts w:ascii="Georgia" w:cs="Georgia" w:eastAsia="Georgia" w:hAnsi="Georgia"/>
+          <w:color w:val="1E211F"/>
+          <w:sz w:val="22"/>
+          <w:szCs w:val="22"/>
+        </w:rPr>
+        <w:t xml:space="preserve">It has an introduction, two to four body paragraphs (one for each reason), and a conclusion. Every body paragraph gives evidence from the novel and explains what that evidence shows and why the author wrote it that way.</w:t>
       </w:r>
     </w:p>
     <w:p>
@@ -852,7 +1008,7 @@
           <w:sz w:val="18"/>
           <w:szCs w:val="18"/>
         </w:rPr>
-        <w:t xml:space="preserve">T  the idea, and why it matters.   E  a quote, what it shows, what it does to the reader.   L  A and B, back to the main idea.</w:t>
+        <w:t xml:space="preserve">T  the idea, and why it matters.   E  a quote, what it shows, what it does to the reader.   L  link the ideas together and back to the prompt.</w:t>
       </w:r>
     </w:p>
     <w:p>
@@ -887,7 +1043,7 @@
           <w:sz w:val="22"/>
           <w:szCs w:val="22"/>
         </w:rPr>
-        <w:t xml:space="preserve">Colour each sentence to match its bar: </w:t>
+        <w:t xml:space="preserve">Colour each word or phrase to match its bar: </w:t>
       </w:r>
       <w:r>
         <w:rPr>
@@ -972,6 +1128,20 @@
           <w:szCs w:val="22"/>
         </w:rPr>
         <w:t xml:space="preserve">.</w:t>
+      </w:r>
+    </w:p>
+    <w:p>
+      <w:pPr>
+        <w:spacing w:after="120"/>
+      </w:pPr>
+      <w:r>
+        <w:rPr>
+          <w:rFonts w:ascii="Calibri" w:cs="Calibri" w:eastAsia="Calibri" w:hAnsi="Calibri"/>
+          <w:color w:val="645D54"/>
+          <w:sz w:val="19"/>
+          <w:szCs w:val="19"/>
+        </w:rPr>
+        <w:t xml:space="preserve">No colours? Underline the ideas, circle the purpose and draw a box around the evidence.</w:t>
       </w:r>
     </w:p>
     <w:tbl>
@@ -1573,7 +1743,7 @@
                 <w:sz w:val="23"/>
                 <w:szCs w:val="23"/>
               </w:rPr>
-              <w:t xml:space="preserve">Imagination is essential to Subhi's survival because it gives him somewhere to go when he cannot leave and it keeps his hope alive.</w:t>
+              <w:t xml:space="preserve">Imagination is essential to Subhi's survival because it gives him somewhere to go when he cannot leave and stories make him brave.</w:t>
             </w:r>
           </w:p>
           <w:p>
@@ -1587,7 +1757,7 @@
                 <w:sz w:val="23"/>
                 <w:szCs w:val="23"/>
               </w:rPr>
-              <w:t xml:space="preserve">When the novel opens, “Sometimes, at night, the dirt outside turns into a beautiful ocean.” This shows that imagination gives Subhi somewhere to go, which lets the reader see the camp the way Subhi sees it.</w:t>
+              <w:t xml:space="preserve">When Subhi explains the Night Sea, “A bit like my Night Sea that goes straight into my eyes that no one else can see.” This shows that imagination gives him somewhere to go when he cannot leave, which makes the reader feel how private and how precious that escape is.</w:t>
             </w:r>
           </w:p>
           <w:p>
@@ -1601,7 +1771,7 @@
                 <w:sz w:val="23"/>
                 <w:szCs w:val="23"/>
               </w:rPr>
-              <w:t xml:space="preserve">Later, “…knowing that Jimmie has a whole real book in her hands gives me a sort of brave that I haven't felt since Eli got taken.” This shows that imagination keeps his hope alive, which makes the reader understand where Subhi's courage comes from.</w:t>
+              <w:t xml:space="preserve">When Jimmie brings her mother's book, “…knowing that Jimmie has a whole real book in her hands gives me a sort of brave that I haven't felt since Eli got taken.” This shows that stories make him brave, which makes the reader understand where Subhi's courage comes from.</w:t>
             </w:r>
           </w:p>
           <w:p>
@@ -1615,7 +1785,7 @@
                 <w:sz w:val="23"/>
                 <w:szCs w:val="23"/>
               </w:rPr>
-              <w:t xml:space="preserve">So, because it gives him somewhere to go and it keeps his hope alive, imagination is what keeps Subhi alive inside the fence.</w:t>
+              <w:t xml:space="preserve">So imagination gives Subhi somewhere to go and courage, and that is what keeps him alive inside the fence.</w:t>
             </w:r>
           </w:p>
         </w:tc>
@@ -1716,7 +1886,7 @@
       </w:tblGrid>
       <w:tr>
         <w:trPr>
-          <w:trHeight w:val="1300" w:hRule="atLeast"/>
+          <w:trHeight w:val="1100" w:hRule="atLeast"/>
         </w:trPr>
         <w:tc>
           <w:tcPr>
@@ -1783,7 +1953,7 @@
       </w:tr>
       <w:tr>
         <w:trPr>
-          <w:trHeight w:val="2000" w:hRule="atLeast"/>
+          <w:trHeight w:val="1800" w:hRule="atLeast"/>
         </w:trPr>
         <w:tc>
           <w:tcPr>
@@ -1864,7 +2034,7 @@
       </w:tr>
       <w:tr>
         <w:trPr>
-          <w:trHeight w:val="2000" w:hRule="atLeast"/>
+          <w:trHeight w:val="1800" w:hRule="atLeast"/>
         </w:trPr>
         <w:tc>
           <w:tcPr>
@@ -1945,7 +2115,7 @@
       </w:tr>
       <w:tr>
         <w:trPr>
-          <w:trHeight w:val="1300" w:hRule="atLeast"/>
+          <w:trHeight w:val="1600" w:hRule="atLeast"/>
         </w:trPr>
         <w:tc>
           <w:tcPr>
@@ -1967,7 +2137,7 @@
                 <w:sz w:val="40"/>
                 <w:szCs w:val="40"/>
               </w:rPr>
-              <w:t xml:space="preserve">L</w:t>
+              <w:t xml:space="preserve">E</w:t>
             </w:r>
           </w:p>
         </w:tc>
@@ -1993,7 +2163,74 @@
                 <w:sz w:val="17"/>
                 <w:szCs w:val="17"/>
               </w:rPr>
-              <w:t xml:space="preserve">So, because A and B, friendship is what …</w:t>
+              <w:t xml:space="preserve">A third piece of evidence, if you have one.</w:t>
+            </w:r>
+          </w:p>
+        </w:tc>
+        <w:tc>
+          <w:tcPr>
+            <w:tcW w:type="dxa" w:w="6606"/>
+            <w:tcMar>
+              <w:top w:type="dxa" w:w="100"/>
+              <w:left w:type="dxa" w:w="120"/>
+              <w:bottom w:type="dxa" w:w="100"/>
+              <w:right w:type="dxa" w:w="120"/>
+            </w:tcMar>
+          </w:tcPr>
+          <w:p/>
+        </w:tc>
+      </w:tr>
+      <w:tr>
+        <w:trPr>
+          <w:trHeight w:val="1300" w:hRule="atLeast"/>
+        </w:trPr>
+        <w:tc>
+          <w:tcPr>
+            <w:tcW w:type="dxa" w:w="700"/>
+            <w:tcMar>
+              <w:top w:type="dxa" w:w="100"/>
+              <w:left w:type="dxa" w:w="120"/>
+              <w:bottom w:type="dxa" w:w="100"/>
+              <w:right w:type="dxa" w:w="60"/>
+            </w:tcMar>
+          </w:tcPr>
+          <w:p>
+            <w:r>
+              <w:rPr>
+                <w:rFonts w:ascii="Georgia" w:cs="Georgia" w:eastAsia="Georgia" w:hAnsi="Georgia"/>
+                <w:b/>
+                <w:bCs/>
+                <w:color w:val="1D3C34"/>
+                <w:sz w:val="40"/>
+                <w:szCs w:val="40"/>
+              </w:rPr>
+              <w:t xml:space="preserve">L</w:t>
+            </w:r>
+          </w:p>
+        </w:tc>
+        <w:tc>
+          <w:tcPr>
+            <w:tcW w:type="dxa" w:w="2600"/>
+            <w:shd w:fill="F6F1E6" w:color="auto" w:val="clear"/>
+            <w:tcMar>
+              <w:top w:type="dxa" w:w="100"/>
+              <w:left w:type="dxa" w:w="100"/>
+              <w:bottom w:type="dxa" w:w="100"/>
+              <w:right w:type="dxa" w:w="100"/>
+            </w:tcMar>
+          </w:tcPr>
+          <w:p>
+            <w:pPr>
+              <w:spacing w:after="40"/>
+            </w:pPr>
+            <w:r>
+              <w:rPr>
+                <w:rFonts w:ascii="Calibri" w:cs="Calibri" w:eastAsia="Calibri" w:hAnsi="Calibri"/>
+                <w:color w:val="645D54"/>
+                <w:sz w:val="17"/>
+                <w:szCs w:val="17"/>
+              </w:rPr>
+              <w:t xml:space="preserve">So friendship gives Subhi A and B, and that is what …</w:t>
             </w:r>
           </w:p>
         </w:tc>

</xml_diff>

<commit_message>
Essay notes: a way of organising your thinking, and what it is for
Co-Authored-By: Claude Fable 5.1 <noreply@anthropic.com>
Claude-Session: https://claude.ai/code/session_01TX2KYiJGekMNoBBPASQh6e
</commit_message>
<xml_diff>
--- a/BoneSparrow-TEEL-template.docx
+++ b/BoneSparrow-TEEL-template.docx
@@ -76,7 +76,7 @@
           <w:sz w:val="22"/>
           <w:szCs w:val="22"/>
         </w:rPr>
-        <w:t xml:space="preserve">A long piece of non-fiction writing about one idea, in proper sentences and paragraphs.</w:t>
+        <w:t xml:space="preserve">An essay is a way of organising your thinking so that someone else can follow it.</w:t>
       </w:r>
     </w:p>
     <w:p>
@@ -100,7 +100,31 @@
           <w:sz w:val="22"/>
           <w:szCs w:val="22"/>
         </w:rPr>
-        <w:t xml:space="preserve">It can show what you understand, explain an idea, or argue for a point of view. This one argues: it says one thing about the novel and then proves it, one paragraph at a time.</w:t>
+        <w:t xml:space="preserve">What is it for? To work out what you think about something, and to show that thinking to a reader who cannot see inside your head.</w:t>
+      </w:r>
+    </w:p>
+    <w:p>
+      <w:pPr>
+        <w:spacing w:after="60"/>
+        <w:ind w:left="400" w:hanging="240"/>
+      </w:pPr>
+      <w:r>
+        <w:rPr>
+          <w:rFonts w:ascii="Georgia" w:cs="Georgia" w:eastAsia="Georgia" w:hAnsi="Georgia"/>
+          <w:color w:val="1E211F"/>
+          <w:sz w:val="22"/>
+          <w:szCs w:val="22"/>
+        </w:rPr>
+        <w:t xml:space="preserve">•  </w:t>
+      </w:r>
+      <w:r>
+        <w:rPr>
+          <w:rFonts w:ascii="Georgia" w:cs="Georgia" w:eastAsia="Georgia" w:hAnsi="Georgia"/>
+          <w:color w:val="1E211F"/>
+          <w:sz w:val="22"/>
+          <w:szCs w:val="22"/>
+        </w:rPr>
+        <w:t xml:space="preserve">Sometimes an essay explains. Sometimes it argues. This one argues: it says one thing about the novel and then proves it, one paragraph at a time.</w:t>
       </w:r>
     </w:p>
     <w:p>
@@ -140,7 +164,7 @@
           <w:sz w:val="22"/>
           <w:szCs w:val="22"/>
         </w:rPr>
-        <w:t xml:space="preserve">It explains a novel to people who have already read it, in formal language. It does not retell the story.</w:t>
+        <w:t xml:space="preserve">Your thinking about a novel, written in formal language for people who have already read it. Not the story again. What you make of it.</w:t>
       </w:r>
     </w:p>
     <w:p>
@@ -188,7 +212,7 @@
           <w:sz w:val="22"/>
           <w:szCs w:val="22"/>
         </w:rPr>
-        <w:t xml:space="preserve">It shows what you know about the big ideas, the events and the characters.</w:t>
+        <w:t xml:space="preserve">It uses the big ideas, the events and the characters.</w:t>
       </w:r>
     </w:p>
     <w:p>
@@ -236,7 +260,7 @@
           <w:sz w:val="22"/>
           <w:szCs w:val="22"/>
         </w:rPr>
-        <w:t xml:space="preserve">It has an introduction, two to four body paragraphs (one for each reason), and a conclusion. Every body paragraph gives evidence from the novel and explains what that evidence shows and why the author wrote it that way.</w:t>
+        <w:t xml:space="preserve">The shape: an introduction that says what you think, two to four body paragraphs (one for each reason), and a conclusion that says what it all adds up to.</w:t>
       </w:r>
     </w:p>
     <w:p>

</xml_diff>

<commit_message>
Essay notes: the steps from a question to a written essay
Co-Authored-By: Claude Fable 5.1 <noreply@anthropic.com>
Claude-Session: https://claude.ai/code/session_01TX2KYiJGekMNoBBPASQh6e
</commit_message>
<xml_diff>
--- a/BoneSparrow-TEEL-template.docx
+++ b/BoneSparrow-TEEL-template.docx
@@ -57,6 +57,20 @@
     </w:p>
     <w:p>
       <w:pPr>
+        <w:spacing w:after="120"/>
+      </w:pPr>
+      <w:r>
+        <w:rPr>
+          <w:rFonts w:ascii="Georgia" w:cs="Georgia" w:eastAsia="Georgia" w:hAnsi="Georgia"/>
+          <w:color w:val="1E211F"/>
+          <w:sz w:val="22"/>
+          <w:szCs w:val="22"/>
+        </w:rPr>
+        <w:t xml:space="preserve">An essay is a way of organising your thinking so that someone else can follow it. It is for working out what you think, and showing that thinking to a reader who cannot see inside your head.</w:t>
+      </w:r>
+    </w:p>
+    <w:p>
+      <w:pPr>
         <w:spacing w:after="60"/>
         <w:ind w:left="400" w:hanging="240"/>
       </w:pPr>
@@ -76,7 +90,7 @@
           <w:sz w:val="22"/>
           <w:szCs w:val="22"/>
         </w:rPr>
-        <w:t xml:space="preserve">An essay is a way of organising your thinking so that someone else can follow it.</w:t>
+        <w:t xml:space="preserve">1   You get a question about the text.</w:t>
       </w:r>
     </w:p>
     <w:p>
@@ -100,7 +114,7 @@
           <w:sz w:val="22"/>
           <w:szCs w:val="22"/>
         </w:rPr>
-        <w:t xml:space="preserve">What is it for? To work out what you think about something, and to show that thinking to a reader who cannot see inside your head.</w:t>
+        <w:t xml:space="preserve">2   You explore it. Think, talk, argue.</w:t>
       </w:r>
     </w:p>
     <w:p>
@@ -124,7 +138,55 @@
           <w:sz w:val="22"/>
           <w:szCs w:val="22"/>
         </w:rPr>
-        <w:t xml:space="preserve">Sometimes an essay explains. Sometimes it argues. This one argues: it says one thing about the novel and then proves it, one paragraph at a time.</w:t>
+        <w:t xml:space="preserve">3   You sort your ideas into groups.</w:t>
+      </w:r>
+    </w:p>
+    <w:p>
+      <w:pPr>
+        <w:spacing w:after="60"/>
+        <w:ind w:left="400" w:hanging="240"/>
+      </w:pPr>
+      <w:r>
+        <w:rPr>
+          <w:rFonts w:ascii="Georgia" w:cs="Georgia" w:eastAsia="Georgia" w:hAnsi="Georgia"/>
+          <w:color w:val="1E211F"/>
+          <w:sz w:val="22"/>
+          <w:szCs w:val="22"/>
+        </w:rPr>
+        <w:t xml:space="preserve">•  </w:t>
+      </w:r>
+      <w:r>
+        <w:rPr>
+          <w:rFonts w:ascii="Georgia" w:cs="Georgia" w:eastAsia="Georgia" w:hAnsi="Georgia"/>
+          <w:color w:val="1E211F"/>
+          <w:sz w:val="22"/>
+          <w:szCs w:val="22"/>
+        </w:rPr>
+        <w:t xml:space="preserve">4   You collect evidence from the novel for each group.</w:t>
+      </w:r>
+    </w:p>
+    <w:p>
+      <w:pPr>
+        <w:spacing w:after="60"/>
+        <w:ind w:left="400" w:hanging="240"/>
+      </w:pPr>
+      <w:r>
+        <w:rPr>
+          <w:rFonts w:ascii="Georgia" w:cs="Georgia" w:eastAsia="Georgia" w:hAnsi="Georgia"/>
+          <w:color w:val="1E211F"/>
+          <w:sz w:val="22"/>
+          <w:szCs w:val="22"/>
+        </w:rPr>
+        <w:t xml:space="preserve">•  </w:t>
+      </w:r>
+      <w:r>
+        <w:rPr>
+          <w:rFonts w:ascii="Georgia" w:cs="Georgia" w:eastAsia="Georgia" w:hAnsi="Georgia"/>
+          <w:color w:val="1E211F"/>
+          <w:sz w:val="22"/>
+          <w:szCs w:val="22"/>
+        </w:rPr>
+        <w:t xml:space="preserve">5   You write: an introduction that says what you think, a paragraph for each group, and a conclusion that says what it all adds up to.</w:t>
       </w:r>
     </w:p>
     <w:p>
@@ -188,7 +250,7 @@
           <w:sz w:val="22"/>
           <w:szCs w:val="22"/>
         </w:rPr>
-        <w:t xml:space="preserve">It answers a prompt or question.</w:t>
+        <w:t xml:space="preserve">It answers a prompt or question, uses the big ideas, the events and the characters, and looks at how the author has written about them.</w:t>
       </w:r>
     </w:p>
     <w:p>
@@ -212,55 +274,7 @@
           <w:sz w:val="22"/>
           <w:szCs w:val="22"/>
         </w:rPr>
-        <w:t xml:space="preserve">It uses the big ideas, the events and the characters.</w:t>
-      </w:r>
-    </w:p>
-    <w:p>
-      <w:pPr>
-        <w:spacing w:after="60"/>
-        <w:ind w:left="400" w:hanging="240"/>
-      </w:pPr>
-      <w:r>
-        <w:rPr>
-          <w:rFonts w:ascii="Georgia" w:cs="Georgia" w:eastAsia="Georgia" w:hAnsi="Georgia"/>
-          <w:color w:val="1E211F"/>
-          <w:sz w:val="22"/>
-          <w:szCs w:val="22"/>
-        </w:rPr>
-        <w:t xml:space="preserve">•  </w:t>
-      </w:r>
-      <w:r>
-        <w:rPr>
-          <w:rFonts w:ascii="Georgia" w:cs="Georgia" w:eastAsia="Georgia" w:hAnsi="Georgia"/>
-          <w:color w:val="1E211F"/>
-          <w:sz w:val="22"/>
-          <w:szCs w:val="22"/>
-        </w:rPr>
-        <w:t xml:space="preserve">It looks at how the author has written about those things.</w:t>
-      </w:r>
-    </w:p>
-    <w:p>
-      <w:pPr>
-        <w:spacing w:after="60"/>
-        <w:ind w:left="400" w:hanging="240"/>
-      </w:pPr>
-      <w:r>
-        <w:rPr>
-          <w:rFonts w:ascii="Georgia" w:cs="Georgia" w:eastAsia="Georgia" w:hAnsi="Georgia"/>
-          <w:color w:val="1E211F"/>
-          <w:sz w:val="22"/>
-          <w:szCs w:val="22"/>
-        </w:rPr>
-        <w:t xml:space="preserve">•  </w:t>
-      </w:r>
-      <w:r>
-        <w:rPr>
-          <w:rFonts w:ascii="Georgia" w:cs="Georgia" w:eastAsia="Georgia" w:hAnsi="Georgia"/>
-          <w:color w:val="1E211F"/>
-          <w:sz w:val="22"/>
-          <w:szCs w:val="22"/>
-        </w:rPr>
-        <w:t xml:space="preserve">The shape: an introduction that says what you think, two to four body paragraphs (one for each reason), and a conclusion that says what it all adds up to.</w:t>
+        <w:t xml:space="preserve">Two to four body paragraphs, one for each group of ideas.</w:t>
       </w:r>
     </w:p>
     <w:p>

</xml_diff>

<commit_message>
TEEL sheet: restore the teacher's edits
Co-Authored-By: Claude Fable 5.1 <noreply@anthropic.com>
Claude-Session: https://claude.ai/code/session_01TX2KYiJGekMNoBBPASQh6e
</commit_message>
<xml_diff>
--- a/BoneSparrow-TEEL-template.docx
+++ b/BoneSparrow-TEEL-template.docx
@@ -274,7 +274,7 @@
           <w:sz w:val="22"/>
           <w:szCs w:val="22"/>
         </w:rPr>
-        <w:t xml:space="preserve">Two to four body paragraphs, one for each group of ideas.</w:t>
+        <w:t xml:space="preserve">It usually has an introduction, two to four body paragraphs, and a conclusion. Every body paragraph takes one part of your argument, gives evidence from the novel, and explains what that evidence shows and why the author wrote it that way.</w:t>
       </w:r>
     </w:p>
     <w:p>
@@ -472,6 +472,789 @@
           <w:shd w:fill="DFF0E2" w:val="clear"/>
         </w:rPr>
         <w:t xml:space="preserve">  purpose  </w:t>
+      </w:r>
+    </w:p>
+    <w:tbl>
+      <w:tblPr>
+        <w:tblW w:type="dxa" w:w="9906"/>
+        <w:tblBorders>
+          <w:top w:val="none" w:color="FFFFFF" w:sz="0"/>
+          <w:left w:val="none" w:color="FFFFFF" w:sz="0"/>
+          <w:bottom w:val="none" w:color="FFFFFF" w:sz="0"/>
+          <w:right w:val="none" w:color="FFFFFF" w:sz="0"/>
+          <w:insideH w:val="single" w:color="auto" w:sz="4"/>
+          <w:insideV w:val="single" w:color="auto" w:sz="4"/>
+        </w:tblBorders>
+      </w:tblPr>
+      <w:tblGrid>
+        <w:gridCol w:w="900"/>
+        <w:gridCol w:w="4806"/>
+        <w:gridCol w:w="4200"/>
+      </w:tblGrid>
+      <w:tr>
+        <w:trPr>
+          <w:trHeight w:val="420" w:hRule="atLeast"/>
+        </w:trPr>
+        <w:tc>
+          <w:tcPr>
+            <w:tcW w:type="dxa" w:w="900"/>
+            <w:tcMar>
+              <w:top w:type="dxa" w:w="60"/>
+              <w:left w:type="dxa" w:w="120"/>
+              <w:bottom w:type="dxa" w:w="60"/>
+              <w:right w:type="dxa" w:w="60"/>
+            </w:tcMar>
+          </w:tcPr>
+          <w:p>
+            <w:r>
+              <w:rPr>
+                <w:rFonts w:ascii="Calibri" w:cs="Calibri" w:eastAsia="Calibri" w:hAnsi="Calibri"/>
+                <w:b/>
+                <w:bCs/>
+                <w:color w:val="A83232"/>
+                <w:sz w:val="26"/>
+                <w:szCs w:val="26"/>
+              </w:rPr>
+              <w:t xml:space="preserve">T</w:t>
+            </w:r>
+          </w:p>
+        </w:tc>
+        <w:tc>
+          <w:tcPr>
+            <w:tcW w:type="dxa" w:w="4806"/>
+            <w:tcMar>
+              <w:top w:type="dxa" w:w="80"/>
+              <w:left w:type="dxa" w:w="0"/>
+              <w:bottom w:type="dxa" w:w="80"/>
+              <w:right w:type="dxa" w:w="0"/>
+            </w:tcMar>
+          </w:tcPr>
+          <w:tbl>
+            <w:tblPr>
+              <w:tblW w:type="dxa" w:w="4806"/>
+              <w:tblBorders>
+                <w:top w:val="none" w:color="FFFFFF" w:sz="0"/>
+                <w:left w:val="none" w:color="FFFFFF" w:sz="0"/>
+                <w:bottom w:val="none" w:color="FFFFFF" w:sz="0"/>
+                <w:right w:val="none" w:color="FFFFFF" w:sz="0"/>
+                <w:insideH w:val="single" w:color="auto" w:sz="4"/>
+                <w:insideV w:val="single" w:color="auto" w:sz="4"/>
+              </w:tblBorders>
+            </w:tblPr>
+            <w:tblGrid>
+              <w:gridCol w:w="4806"/>
+            </w:tblGrid>
+            <w:tr>
+              <w:trPr>
+                <w:trHeight w:val="260" w:hRule="exact"/>
+              </w:trPr>
+              <w:tc>
+                <w:tcPr>
+                  <w:tcW w:type="dxa" w:w="4806"/>
+                  <w:shd w:fill="7FB3E6" w:color="auto" w:val="clear"/>
+                  <w:tcMar>
+                    <w:top w:type="dxa" w:w="0"/>
+                    <w:left w:type="dxa" w:w="0"/>
+                    <w:bottom w:type="dxa" w:w="0"/>
+                    <w:right w:type="dxa" w:w="0"/>
+                  </w:tcMar>
+                </w:tcPr>
+                <w:p>
+                  <w:pPr>
+                    <w:spacing w:after="0" w:line="200" w:lineRule="exact"/>
+                  </w:pPr>
+                  <w:r>
+                    <w:rPr>
+                      <w:sz w:val="8"/>
+                      <w:szCs w:val="8"/>
+                    </w:rPr>
+                    <w:t xml:space="preserve"/>
+                  </w:r>
+                </w:p>
+              </w:tc>
+            </w:tr>
+          </w:tbl>
+          <w:p/>
+        </w:tc>
+        <w:tc>
+          <w:tcPr>
+            <w:tcW w:type="dxa" w:w="4200"/>
+            <w:tcMar>
+              <w:top w:type="dxa" w:w="60"/>
+              <w:left w:type="dxa" w:w="160"/>
+              <w:bottom w:type="dxa" w:w="60"/>
+              <w:right w:type="dxa" w:w="60"/>
+            </w:tcMar>
+          </w:tcPr>
+          <w:p>
+            <w:r>
+              <w:rPr>
+                <w:rFonts w:ascii="Calibri" w:cs="Calibri" w:eastAsia="Calibri" w:hAnsi="Calibri"/>
+                <w:color w:val="645D54"/>
+                <w:sz w:val="17"/>
+                <w:szCs w:val="17"/>
+              </w:rPr>
+              <w:t xml:space="preserve">the idea, and why it matters</w:t>
+            </w:r>
+          </w:p>
+        </w:tc>
+      </w:tr>
+      <w:tr>
+        <w:trPr>
+          <w:trHeight w:val="420" w:hRule="atLeast"/>
+        </w:trPr>
+        <w:tc>
+          <w:tcPr>
+            <w:tcW w:type="dxa" w:w="900"/>
+            <w:tcMar>
+              <w:top w:type="dxa" w:w="60"/>
+              <w:left w:type="dxa" w:w="120"/>
+              <w:bottom w:type="dxa" w:w="60"/>
+              <w:right w:type="dxa" w:w="60"/>
+            </w:tcMar>
+          </w:tcPr>
+          <w:p>
+            <w:r>
+              <w:rPr>
+                <w:rFonts w:ascii="Calibri" w:cs="Calibri" w:eastAsia="Calibri" w:hAnsi="Calibri"/>
+                <w:b/>
+                <w:bCs/>
+                <w:color w:val="A83232"/>
+                <w:sz w:val="26"/>
+                <w:szCs w:val="26"/>
+              </w:rPr>
+              <w:t xml:space="preserve">E</w:t>
+            </w:r>
+          </w:p>
+        </w:tc>
+        <w:tc>
+          <w:tcPr>
+            <w:tcW w:type="dxa" w:w="4806"/>
+            <w:tcMar>
+              <w:top w:type="dxa" w:w="80"/>
+              <w:left w:type="dxa" w:w="0"/>
+              <w:bottom w:type="dxa" w:w="80"/>
+              <w:right w:type="dxa" w:w="0"/>
+            </w:tcMar>
+          </w:tcPr>
+          <w:tbl>
+            <w:tblPr>
+              <w:tblW w:type="dxa" w:w="4803"/>
+              <w:tblBorders>
+                <w:top w:val="none" w:color="FFFFFF" w:sz="0"/>
+                <w:left w:val="none" w:color="FFFFFF" w:sz="0"/>
+                <w:bottom w:val="none" w:color="FFFFFF" w:sz="0"/>
+                <w:right w:val="none" w:color="FFFFFF" w:sz="0"/>
+                <w:insideH w:val="single" w:color="auto" w:sz="4"/>
+                <w:insideV w:val="single" w:color="auto" w:sz="4"/>
+              </w:tblBorders>
+            </w:tblPr>
+            <w:tblGrid>
+              <w:gridCol w:w="1441"/>
+              <w:gridCol w:w="480"/>
+              <w:gridCol w:w="1441"/>
+              <w:gridCol w:w="1441"/>
+            </w:tblGrid>
+            <w:tr>
+              <w:trPr>
+                <w:trHeight w:val="260" w:hRule="exact"/>
+              </w:trPr>
+              <w:tc>
+                <w:tcPr>
+                  <w:tcW w:type="dxa" w:w="1441"/>
+                  <w:shd w:fill="F5D75A" w:color="auto" w:val="clear"/>
+                  <w:tcMar>
+                    <w:top w:type="dxa" w:w="0"/>
+                    <w:left w:type="dxa" w:w="0"/>
+                    <w:bottom w:type="dxa" w:w="0"/>
+                    <w:right w:type="dxa" w:w="0"/>
+                  </w:tcMar>
+                </w:tcPr>
+                <w:p>
+                  <w:pPr>
+                    <w:spacing w:after="0" w:line="200" w:lineRule="exact"/>
+                  </w:pPr>
+                  <w:r>
+                    <w:rPr>
+                      <w:sz w:val="8"/>
+                      <w:szCs w:val="8"/>
+                    </w:rPr>
+                    <w:t xml:space="preserve"/>
+                  </w:r>
+                </w:p>
+              </w:tc>
+              <w:tc>
+                <w:tcPr>
+                  <w:tcW w:type="dxa" w:w="480"/>
+                  <w:shd w:fill="F2B27A" w:color="auto" w:val="clear"/>
+                  <w:tcMar>
+                    <w:top w:type="dxa" w:w="0"/>
+                    <w:left w:type="dxa" w:w="0"/>
+                    <w:bottom w:type="dxa" w:w="0"/>
+                    <w:right w:type="dxa" w:w="0"/>
+                  </w:tcMar>
+                </w:tcPr>
+                <w:p>
+                  <w:pPr>
+                    <w:spacing w:after="0" w:line="200" w:lineRule="exact"/>
+                  </w:pPr>
+                  <w:r>
+                    <w:rPr>
+                      <w:sz w:val="8"/>
+                      <w:szCs w:val="8"/>
+                    </w:rPr>
+                    <w:t xml:space="preserve"/>
+                  </w:r>
+                </w:p>
+              </w:tc>
+              <w:tc>
+                <w:tcPr>
+                  <w:tcW w:type="dxa" w:w="1441"/>
+                  <w:shd w:fill="7FB3E6" w:color="auto" w:val="clear"/>
+                  <w:tcMar>
+                    <w:top w:type="dxa" w:w="0"/>
+                    <w:left w:type="dxa" w:w="0"/>
+                    <w:bottom w:type="dxa" w:w="0"/>
+                    <w:right w:type="dxa" w:w="0"/>
+                  </w:tcMar>
+                </w:tcPr>
+                <w:p>
+                  <w:pPr>
+                    <w:spacing w:after="0" w:line="200" w:lineRule="exact"/>
+                  </w:pPr>
+                  <w:r>
+                    <w:rPr>
+                      <w:sz w:val="8"/>
+                      <w:szCs w:val="8"/>
+                    </w:rPr>
+                    <w:t xml:space="preserve"/>
+                  </w:r>
+                </w:p>
+              </w:tc>
+              <w:tc>
+                <w:tcPr>
+                  <w:tcW w:type="dxa" w:w="1441"/>
+                  <w:shd w:fill="8FD39A" w:color="auto" w:val="clear"/>
+                  <w:tcMar>
+                    <w:top w:type="dxa" w:w="0"/>
+                    <w:left w:type="dxa" w:w="0"/>
+                    <w:bottom w:type="dxa" w:w="0"/>
+                    <w:right w:type="dxa" w:w="0"/>
+                  </w:tcMar>
+                </w:tcPr>
+                <w:p>
+                  <w:pPr>
+                    <w:spacing w:after="0" w:line="200" w:lineRule="exact"/>
+                  </w:pPr>
+                  <w:r>
+                    <w:rPr>
+                      <w:sz w:val="8"/>
+                      <w:szCs w:val="8"/>
+                    </w:rPr>
+                    <w:t xml:space="preserve"/>
+                  </w:r>
+                </w:p>
+              </w:tc>
+            </w:tr>
+          </w:tbl>
+          <w:p/>
+        </w:tc>
+        <w:tc>
+          <w:tcPr>
+            <w:tcW w:type="dxa" w:w="4200"/>
+            <w:tcMar>
+              <w:top w:type="dxa" w:w="60"/>
+              <w:left w:type="dxa" w:w="160"/>
+              <w:bottom w:type="dxa" w:w="60"/>
+              <w:right w:type="dxa" w:w="60"/>
+            </w:tcMar>
+          </w:tcPr>
+          <w:p>
+            <w:r>
+              <w:rPr>
+                <w:rFonts w:ascii="Calibri" w:cs="Calibri" w:eastAsia="Calibri" w:hAnsi="Calibri"/>
+                <w:color w:val="645D54"/>
+                <w:sz w:val="17"/>
+                <w:szCs w:val="17"/>
+              </w:rPr>
+              <w:t xml:space="preserve">a quote, what it shows, what it does to the reader</w:t>
+            </w:r>
+          </w:p>
+        </w:tc>
+      </w:tr>
+      <w:tr>
+        <w:trPr>
+          <w:trHeight w:val="420" w:hRule="atLeast"/>
+        </w:trPr>
+        <w:tc>
+          <w:tcPr>
+            <w:tcW w:type="dxa" w:w="900"/>
+            <w:tcMar>
+              <w:top w:type="dxa" w:w="60"/>
+              <w:left w:type="dxa" w:w="120"/>
+              <w:bottom w:type="dxa" w:w="60"/>
+              <w:right w:type="dxa" w:w="60"/>
+            </w:tcMar>
+          </w:tcPr>
+          <w:p>
+            <w:r>
+              <w:rPr>
+                <w:rFonts w:ascii="Calibri" w:cs="Calibri" w:eastAsia="Calibri" w:hAnsi="Calibri"/>
+                <w:b/>
+                <w:bCs/>
+                <w:color w:val="A83232"/>
+                <w:sz w:val="26"/>
+                <w:szCs w:val="26"/>
+              </w:rPr>
+              <w:t xml:space="preserve">E</w:t>
+            </w:r>
+          </w:p>
+        </w:tc>
+        <w:tc>
+          <w:tcPr>
+            <w:tcW w:type="dxa" w:w="4806"/>
+            <w:tcMar>
+              <w:top w:type="dxa" w:w="80"/>
+              <w:left w:type="dxa" w:w="0"/>
+              <w:bottom w:type="dxa" w:w="80"/>
+              <w:right w:type="dxa" w:w="0"/>
+            </w:tcMar>
+          </w:tcPr>
+          <w:tbl>
+            <w:tblPr>
+              <w:tblW w:type="dxa" w:w="4803"/>
+              <w:tblBorders>
+                <w:top w:val="none" w:color="FFFFFF" w:sz="0"/>
+                <w:left w:val="none" w:color="FFFFFF" w:sz="0"/>
+                <w:bottom w:val="none" w:color="FFFFFF" w:sz="0"/>
+                <w:right w:val="none" w:color="FFFFFF" w:sz="0"/>
+                <w:insideH w:val="single" w:color="auto" w:sz="4"/>
+                <w:insideV w:val="single" w:color="auto" w:sz="4"/>
+              </w:tblBorders>
+            </w:tblPr>
+            <w:tblGrid>
+              <w:gridCol w:w="1441"/>
+              <w:gridCol w:w="480"/>
+              <w:gridCol w:w="1441"/>
+              <w:gridCol w:w="1441"/>
+            </w:tblGrid>
+            <w:tr>
+              <w:trPr>
+                <w:trHeight w:val="260" w:hRule="exact"/>
+              </w:trPr>
+              <w:tc>
+                <w:tcPr>
+                  <w:tcW w:type="dxa" w:w="1441"/>
+                  <w:shd w:fill="F5D75A" w:color="auto" w:val="clear"/>
+                  <w:tcMar>
+                    <w:top w:type="dxa" w:w="0"/>
+                    <w:left w:type="dxa" w:w="0"/>
+                    <w:bottom w:type="dxa" w:w="0"/>
+                    <w:right w:type="dxa" w:w="0"/>
+                  </w:tcMar>
+                </w:tcPr>
+                <w:p>
+                  <w:pPr>
+                    <w:spacing w:after="0" w:line="200" w:lineRule="exact"/>
+                  </w:pPr>
+                  <w:r>
+                    <w:rPr>
+                      <w:sz w:val="8"/>
+                      <w:szCs w:val="8"/>
+                    </w:rPr>
+                    <w:t xml:space="preserve"/>
+                  </w:r>
+                </w:p>
+              </w:tc>
+              <w:tc>
+                <w:tcPr>
+                  <w:tcW w:type="dxa" w:w="480"/>
+                  <w:shd w:fill="F2B27A" w:color="auto" w:val="clear"/>
+                  <w:tcMar>
+                    <w:top w:type="dxa" w:w="0"/>
+                    <w:left w:type="dxa" w:w="0"/>
+                    <w:bottom w:type="dxa" w:w="0"/>
+                    <w:right w:type="dxa" w:w="0"/>
+                  </w:tcMar>
+                </w:tcPr>
+                <w:p>
+                  <w:pPr>
+                    <w:spacing w:after="0" w:line="200" w:lineRule="exact"/>
+                  </w:pPr>
+                  <w:r>
+                    <w:rPr>
+                      <w:sz w:val="8"/>
+                      <w:szCs w:val="8"/>
+                    </w:rPr>
+                    <w:t xml:space="preserve"/>
+                  </w:r>
+                </w:p>
+              </w:tc>
+              <w:tc>
+                <w:tcPr>
+                  <w:tcW w:type="dxa" w:w="1441"/>
+                  <w:shd w:fill="7FB3E6" w:color="auto" w:val="clear"/>
+                  <w:tcMar>
+                    <w:top w:type="dxa" w:w="0"/>
+                    <w:left w:type="dxa" w:w="0"/>
+                    <w:bottom w:type="dxa" w:w="0"/>
+                    <w:right w:type="dxa" w:w="0"/>
+                  </w:tcMar>
+                </w:tcPr>
+                <w:p>
+                  <w:pPr>
+                    <w:spacing w:after="0" w:line="200" w:lineRule="exact"/>
+                  </w:pPr>
+                  <w:r>
+                    <w:rPr>
+                      <w:sz w:val="8"/>
+                      <w:szCs w:val="8"/>
+                    </w:rPr>
+                    <w:t xml:space="preserve"/>
+                  </w:r>
+                </w:p>
+              </w:tc>
+              <w:tc>
+                <w:tcPr>
+                  <w:tcW w:type="dxa" w:w="1441"/>
+                  <w:shd w:fill="8FD39A" w:color="auto" w:val="clear"/>
+                  <w:tcMar>
+                    <w:top w:type="dxa" w:w="0"/>
+                    <w:left w:type="dxa" w:w="0"/>
+                    <w:bottom w:type="dxa" w:w="0"/>
+                    <w:right w:type="dxa" w:w="0"/>
+                  </w:tcMar>
+                </w:tcPr>
+                <w:p>
+                  <w:pPr>
+                    <w:spacing w:after="0" w:line="200" w:lineRule="exact"/>
+                  </w:pPr>
+                  <w:r>
+                    <w:rPr>
+                      <w:sz w:val="8"/>
+                      <w:szCs w:val="8"/>
+                    </w:rPr>
+                    <w:t xml:space="preserve"/>
+                  </w:r>
+                </w:p>
+              </w:tc>
+            </w:tr>
+          </w:tbl>
+          <w:p/>
+        </w:tc>
+        <w:tc>
+          <w:tcPr>
+            <w:tcW w:type="dxa" w:w="4200"/>
+            <w:tcMar>
+              <w:top w:type="dxa" w:w="60"/>
+              <w:left w:type="dxa" w:w="160"/>
+              <w:bottom w:type="dxa" w:w="60"/>
+              <w:right w:type="dxa" w:w="60"/>
+            </w:tcMar>
+          </w:tcPr>
+          <w:p>
+            <w:r>
+              <w:rPr>
+                <w:rFonts w:ascii="Calibri" w:cs="Calibri" w:eastAsia="Calibri" w:hAnsi="Calibri"/>
+                <w:color w:val="645D54"/>
+                <w:sz w:val="17"/>
+                <w:szCs w:val="17"/>
+              </w:rPr>
+              <w:t xml:space="preserve">a quote, what it shows, what it does to the reader</w:t>
+            </w:r>
+          </w:p>
+        </w:tc>
+      </w:tr>
+      <w:tr>
+        <w:trPr>
+          <w:trHeight w:val="420" w:hRule="atLeast"/>
+        </w:trPr>
+        <w:tc>
+          <w:tcPr>
+            <w:tcW w:type="dxa" w:w="900"/>
+            <w:tcMar>
+              <w:top w:type="dxa" w:w="60"/>
+              <w:left w:type="dxa" w:w="120"/>
+              <w:bottom w:type="dxa" w:w="60"/>
+              <w:right w:type="dxa" w:w="60"/>
+            </w:tcMar>
+          </w:tcPr>
+          <w:p>
+            <w:r>
+              <w:rPr>
+                <w:rFonts w:ascii="Calibri" w:cs="Calibri" w:eastAsia="Calibri" w:hAnsi="Calibri"/>
+                <w:b/>
+                <w:bCs/>
+                <w:color w:val="A83232"/>
+                <w:sz w:val="26"/>
+                <w:szCs w:val="26"/>
+              </w:rPr>
+              <w:t xml:space="preserve">L</w:t>
+            </w:r>
+          </w:p>
+        </w:tc>
+        <w:tc>
+          <w:tcPr>
+            <w:tcW w:type="dxa" w:w="4806"/>
+            <w:tcMar>
+              <w:top w:type="dxa" w:w="80"/>
+              <w:left w:type="dxa" w:w="0"/>
+              <w:bottom w:type="dxa" w:w="80"/>
+              <w:right w:type="dxa" w:w="0"/>
+            </w:tcMar>
+          </w:tcPr>
+          <w:tbl>
+            <w:tblPr>
+              <w:tblW w:type="dxa" w:w="4805"/>
+              <w:tblBorders>
+                <w:top w:val="none" w:color="FFFFFF" w:sz="0"/>
+                <w:left w:val="none" w:color="FFFFFF" w:sz="0"/>
+                <w:bottom w:val="none" w:color="FFFFFF" w:sz="0"/>
+                <w:right w:val="none" w:color="FFFFFF" w:sz="0"/>
+                <w:insideH w:val="single" w:color="auto" w:sz="4"/>
+                <w:insideV w:val="single" w:color="auto" w:sz="4"/>
+              </w:tblBorders>
+            </w:tblPr>
+            <w:tblGrid>
+              <w:gridCol w:w="1373"/>
+              <w:gridCol w:w="1373"/>
+              <w:gridCol w:w="2059"/>
+            </w:tblGrid>
+            <w:tr>
+              <w:trPr>
+                <w:trHeight w:val="260" w:hRule="exact"/>
+              </w:trPr>
+              <w:tc>
+                <w:tcPr>
+                  <w:tcW w:type="dxa" w:w="1373"/>
+                  <w:shd w:fill="7FB3E6" w:color="auto" w:val="clear"/>
+                  <w:tcMar>
+                    <w:top w:type="dxa" w:w="0"/>
+                    <w:left w:type="dxa" w:w="0"/>
+                    <w:bottom w:type="dxa" w:w="0"/>
+                    <w:right w:type="dxa" w:w="0"/>
+                  </w:tcMar>
+                </w:tcPr>
+                <w:p>
+                  <w:pPr>
+                    <w:spacing w:after="0" w:line="200" w:lineRule="exact"/>
+                  </w:pPr>
+                  <w:r>
+                    <w:rPr>
+                      <w:sz w:val="8"/>
+                      <w:szCs w:val="8"/>
+                    </w:rPr>
+                    <w:t xml:space="preserve"/>
+                  </w:r>
+                </w:p>
+              </w:tc>
+              <w:tc>
+                <w:tcPr>
+                  <w:tcW w:type="dxa" w:w="1373"/>
+                  <w:shd w:fill="7FB3E6" w:color="auto" w:val="clear"/>
+                  <w:tcMar>
+                    <w:top w:type="dxa" w:w="0"/>
+                    <w:left w:type="dxa" w:w="0"/>
+                    <w:bottom w:type="dxa" w:w="0"/>
+                    <w:right w:type="dxa" w:w="0"/>
+                  </w:tcMar>
+                </w:tcPr>
+                <w:p>
+                  <w:pPr>
+                    <w:spacing w:after="0" w:line="200" w:lineRule="exact"/>
+                  </w:pPr>
+                  <w:r>
+                    <w:rPr>
+                      <w:sz w:val="8"/>
+                      <w:szCs w:val="8"/>
+                    </w:rPr>
+                    <w:t xml:space="preserve"/>
+                  </w:r>
+                </w:p>
+              </w:tc>
+              <w:tc>
+                <w:tcPr>
+                  <w:tcW w:type="dxa" w:w="2059"/>
+                  <w:shd w:fill="8FD39A" w:color="auto" w:val="clear"/>
+                  <w:tcMar>
+                    <w:top w:type="dxa" w:w="0"/>
+                    <w:left w:type="dxa" w:w="0"/>
+                    <w:bottom w:type="dxa" w:w="0"/>
+                    <w:right w:type="dxa" w:w="0"/>
+                  </w:tcMar>
+                </w:tcPr>
+                <w:p>
+                  <w:pPr>
+                    <w:spacing w:after="0" w:line="200" w:lineRule="exact"/>
+                  </w:pPr>
+                  <w:r>
+                    <w:rPr>
+                      <w:sz w:val="8"/>
+                      <w:szCs w:val="8"/>
+                    </w:rPr>
+                    <w:t xml:space="preserve"/>
+                  </w:r>
+                </w:p>
+              </w:tc>
+            </w:tr>
+          </w:tbl>
+          <w:p/>
+        </w:tc>
+        <w:tc>
+          <w:tcPr>
+            <w:tcW w:type="dxa" w:w="4200"/>
+            <w:tcMar>
+              <w:top w:type="dxa" w:w="60"/>
+              <w:left w:type="dxa" w:w="160"/>
+              <w:bottom w:type="dxa" w:w="60"/>
+              <w:right w:type="dxa" w:w="60"/>
+            </w:tcMar>
+          </w:tcPr>
+          <w:p>
+            <w:r>
+              <w:rPr>
+                <w:rFonts w:ascii="Calibri" w:cs="Calibri" w:eastAsia="Calibri" w:hAnsi="Calibri"/>
+                <w:color w:val="645D54"/>
+                <w:sz w:val="17"/>
+                <w:szCs w:val="17"/>
+              </w:rPr>
+              <w:t xml:space="preserve">link the ideas together and back to the prompt</w:t>
+            </w:r>
+          </w:p>
+        </w:tc>
+      </w:tr>
+    </w:tbl>
+    <w:p>
+      <w:r>
+        <w:br w:type="page"/>
+      </w:r>
+    </w:p>
+    <w:p>
+      <w:pPr>
+        <w:spacing w:after="80" w:before="260"/>
+      </w:pPr>
+      <w:r>
+        <w:rPr>
+          <w:rFonts w:ascii="Georgia" w:cs="Georgia" w:eastAsia="Georgia" w:hAnsi="Georgia"/>
+          <w:b/>
+          <w:bCs/>
+          <w:color w:val="1D3C34"/>
+          <w:sz w:val="24"/>
+          <w:szCs w:val="24"/>
+        </w:rPr>
+        <w:t xml:space="preserve">Colour the worked paragraph</w:t>
+      </w:r>
+    </w:p>
+    <w:p>
+      <w:pPr>
+        <w:spacing w:after="120"/>
+      </w:pPr>
+      <w:r>
+        <w:rPr>
+          <w:rFonts w:ascii="Georgia" w:cs="Georgia" w:eastAsia="Georgia" w:hAnsi="Georgia"/>
+          <w:color w:val="1E211F"/>
+          <w:sz w:val="22"/>
+          <w:szCs w:val="22"/>
+        </w:rPr>
+        <w:t xml:space="preserve">Colour each word or phrase using the colour scheme: </w:t>
+      </w:r>
+      <w:r>
+        <w:rPr>
+          <w:rFonts w:ascii="Calibri" w:cs="Calibri" w:eastAsia="Calibri" w:hAnsi="Calibri"/>
+          <w:b/>
+          <w:bCs/>
+          <w:color w:val="0B447C"/>
+          <w:sz w:val="20"/>
+          <w:szCs w:val="20"/>
+          <w:shd w:fill="D6EAFC" w:val="clear"/>
+        </w:rPr>
+        <w:t xml:space="preserve">  idea  </w:t>
+      </w:r>
+      <w:r>
+        <w:rPr>
+          <w:rFonts w:ascii="Georgia" w:cs="Georgia" w:eastAsia="Georgia" w:hAnsi="Georgia"/>
+          <w:color w:val="1E211F"/>
+          <w:sz w:val="22"/>
+          <w:szCs w:val="22"/>
+        </w:rPr>
+        <w:t xml:space="preserve">, </w:t>
+      </w:r>
+      <w:r>
+        <w:rPr>
+          <w:rFonts w:ascii="Calibri" w:cs="Calibri" w:eastAsia="Calibri" w:hAnsi="Calibri"/>
+          <w:b/>
+          <w:bCs/>
+          <w:color w:val="8A4B12"/>
+          <w:sz w:val="20"/>
+          <w:szCs w:val="20"/>
+          <w:shd w:fill="FAE3CF" w:val="clear"/>
+        </w:rPr>
+        <w:t xml:space="preserve">  verb  </w:t>
+      </w:r>
+      <w:r>
+        <w:rPr>
+          <w:rFonts w:ascii="Georgia" w:cs="Georgia" w:eastAsia="Georgia" w:hAnsi="Georgia"/>
+          <w:color w:val="1E211F"/>
+          <w:sz w:val="22"/>
+          <w:szCs w:val="22"/>
+        </w:rPr>
+        <w:t xml:space="preserve">, </w:t>
+      </w:r>
+      <w:r>
+        <w:rPr>
+          <w:rFonts w:ascii="Calibri" w:cs="Calibri" w:eastAsia="Calibri" w:hAnsi="Calibri"/>
+          <w:b/>
+          <w:bCs/>
+          <w:color w:val="7A5A00"/>
+          <w:sz w:val="20"/>
+          <w:szCs w:val="20"/>
+          <w:shd w:fill="FFF3B0" w:val="clear"/>
+        </w:rPr>
+        <w:t xml:space="preserve">  evidence  </w:t>
+      </w:r>
+      <w:r>
+        <w:rPr>
+          <w:rFonts w:ascii="Georgia" w:cs="Georgia" w:eastAsia="Georgia" w:hAnsi="Georgia"/>
+          <w:color w:val="1E211F"/>
+          <w:sz w:val="22"/>
+          <w:szCs w:val="22"/>
+        </w:rPr>
+        <w:t xml:space="preserve">, </w:t>
+      </w:r>
+      <w:r>
+        <w:rPr>
+          <w:rFonts w:ascii="Calibri" w:cs="Calibri" w:eastAsia="Calibri" w:hAnsi="Calibri"/>
+          <w:b/>
+          <w:bCs/>
+          <w:color w:val="1F5C33"/>
+          <w:sz w:val="20"/>
+          <w:szCs w:val="20"/>
+          <w:shd w:fill="DFF0E2" w:val="clear"/>
+        </w:rPr>
+        <w:t xml:space="preserve">  purpose  </w:t>
+      </w:r>
+      <w:r>
+        <w:rPr>
+          <w:rFonts w:ascii="Georgia" w:cs="Georgia" w:eastAsia="Georgia" w:hAnsi="Georgia"/>
+          <w:color w:val="1E211F"/>
+          <w:sz w:val="22"/>
+          <w:szCs w:val="22"/>
+        </w:rPr>
+        <w:t xml:space="preserve">.</w:t>
+      </w:r>
+    </w:p>
+    <w:p>
+      <w:pPr>
+        <w:spacing w:after="120"/>
+      </w:pPr>
+      <w:r>
+        <w:rPr>
+          <w:rFonts w:ascii="Georgia" w:cs="Georgia" w:eastAsia="Georgia" w:hAnsi="Georgia"/>
+          <w:color w:val="1E211F"/>
+          <w:sz w:val="22"/>
+          <w:szCs w:val="22"/>
+        </w:rPr>
+        <w:t xml:space="preserve">OR if you don’t have the colours, underline the ideas, circle the purpose and draw a box around the evidence.</w:t>
       </w:r>
     </w:p>
     <w:tbl>
@@ -1035,714 +1818,6 @@
         </w:tc>
       </w:tr>
     </w:tbl>
-    <w:p>
-      <w:pPr>
-        <w:spacing w:after="120" w:before="120"/>
-      </w:pPr>
-      <w:r>
-        <w:rPr>
-          <w:rFonts w:ascii="Calibri" w:cs="Calibri" w:eastAsia="Calibri" w:hAnsi="Calibri"/>
-          <w:color w:val="645D54"/>
-          <w:sz w:val="18"/>
-          <w:szCs w:val="18"/>
-        </w:rPr>
-        <w:t xml:space="preserve">T  the idea, and why it matters.   E  a quote, what it shows, what it does to the reader.   L  link the ideas together and back to the prompt.</w:t>
-      </w:r>
-    </w:p>
-    <w:p>
-      <w:r>
-        <w:br w:type="page"/>
-      </w:r>
-    </w:p>
-    <w:p>
-      <w:pPr>
-        <w:spacing w:after="80" w:before="260"/>
-      </w:pPr>
-      <w:r>
-        <w:rPr>
-          <w:rFonts w:ascii="Georgia" w:cs="Georgia" w:eastAsia="Georgia" w:hAnsi="Georgia"/>
-          <w:b/>
-          <w:bCs/>
-          <w:color w:val="1D3C34"/>
-          <w:sz w:val="24"/>
-          <w:szCs w:val="24"/>
-        </w:rPr>
-        <w:t xml:space="preserve">Colour the worked paragraph</w:t>
-      </w:r>
-    </w:p>
-    <w:p>
-      <w:pPr>
-        <w:spacing w:after="120"/>
-      </w:pPr>
-      <w:r>
-        <w:rPr>
-          <w:rFonts w:ascii="Georgia" w:cs="Georgia" w:eastAsia="Georgia" w:hAnsi="Georgia"/>
-          <w:color w:val="1E211F"/>
-          <w:sz w:val="22"/>
-          <w:szCs w:val="22"/>
-        </w:rPr>
-        <w:t xml:space="preserve">Colour each word or phrase to match its bar: </w:t>
-      </w:r>
-      <w:r>
-        <w:rPr>
-          <w:rFonts w:ascii="Calibri" w:cs="Calibri" w:eastAsia="Calibri" w:hAnsi="Calibri"/>
-          <w:b/>
-          <w:bCs/>
-          <w:color w:val="0B447C"/>
-          <w:sz w:val="20"/>
-          <w:szCs w:val="20"/>
-          <w:shd w:fill="D6EAFC" w:val="clear"/>
-        </w:rPr>
-        <w:t xml:space="preserve">  idea  </w:t>
-      </w:r>
-      <w:r>
-        <w:rPr>
-          <w:rFonts w:ascii="Georgia" w:cs="Georgia" w:eastAsia="Georgia" w:hAnsi="Georgia"/>
-          <w:color w:val="1E211F"/>
-          <w:sz w:val="22"/>
-          <w:szCs w:val="22"/>
-        </w:rPr>
-        <w:t xml:space="preserve">, </w:t>
-      </w:r>
-      <w:r>
-        <w:rPr>
-          <w:rFonts w:ascii="Calibri" w:cs="Calibri" w:eastAsia="Calibri" w:hAnsi="Calibri"/>
-          <w:b/>
-          <w:bCs/>
-          <w:color w:val="8A4B12"/>
-          <w:sz w:val="20"/>
-          <w:szCs w:val="20"/>
-          <w:shd w:fill="FAE3CF" w:val="clear"/>
-        </w:rPr>
-        <w:t xml:space="preserve">  verb  </w:t>
-      </w:r>
-      <w:r>
-        <w:rPr>
-          <w:rFonts w:ascii="Georgia" w:cs="Georgia" w:eastAsia="Georgia" w:hAnsi="Georgia"/>
-          <w:color w:val="1E211F"/>
-          <w:sz w:val="22"/>
-          <w:szCs w:val="22"/>
-        </w:rPr>
-        <w:t xml:space="preserve">, </w:t>
-      </w:r>
-      <w:r>
-        <w:rPr>
-          <w:rFonts w:ascii="Calibri" w:cs="Calibri" w:eastAsia="Calibri" w:hAnsi="Calibri"/>
-          <w:b/>
-          <w:bCs/>
-          <w:color w:val="7A5A00"/>
-          <w:sz w:val="20"/>
-          <w:szCs w:val="20"/>
-          <w:shd w:fill="FFF3B0" w:val="clear"/>
-        </w:rPr>
-        <w:t xml:space="preserve">  evidence  </w:t>
-      </w:r>
-      <w:r>
-        <w:rPr>
-          <w:rFonts w:ascii="Georgia" w:cs="Georgia" w:eastAsia="Georgia" w:hAnsi="Georgia"/>
-          <w:color w:val="1E211F"/>
-          <w:sz w:val="22"/>
-          <w:szCs w:val="22"/>
-        </w:rPr>
-        <w:t xml:space="preserve">, </w:t>
-      </w:r>
-      <w:r>
-        <w:rPr>
-          <w:rFonts w:ascii="Calibri" w:cs="Calibri" w:eastAsia="Calibri" w:hAnsi="Calibri"/>
-          <w:b/>
-          <w:bCs/>
-          <w:color w:val="1F5C33"/>
-          <w:sz w:val="20"/>
-          <w:szCs w:val="20"/>
-          <w:shd w:fill="DFF0E2" w:val="clear"/>
-        </w:rPr>
-        <w:t xml:space="preserve">  purpose  </w:t>
-      </w:r>
-      <w:r>
-        <w:rPr>
-          <w:rFonts w:ascii="Georgia" w:cs="Georgia" w:eastAsia="Georgia" w:hAnsi="Georgia"/>
-          <w:color w:val="1E211F"/>
-          <w:sz w:val="22"/>
-          <w:szCs w:val="22"/>
-        </w:rPr>
-        <w:t xml:space="preserve">.</w:t>
-      </w:r>
-    </w:p>
-    <w:p>
-      <w:pPr>
-        <w:spacing w:after="120"/>
-      </w:pPr>
-      <w:r>
-        <w:rPr>
-          <w:rFonts w:ascii="Calibri" w:cs="Calibri" w:eastAsia="Calibri" w:hAnsi="Calibri"/>
-          <w:color w:val="645D54"/>
-          <w:sz w:val="19"/>
-          <w:szCs w:val="19"/>
-        </w:rPr>
-        <w:t xml:space="preserve">No colours? Underline the ideas, circle the purpose and draw a box around the evidence.</w:t>
-      </w:r>
-    </w:p>
-    <w:tbl>
-      <w:tblPr>
-        <w:tblW w:type="dxa" w:w="9906"/>
-        <w:tblBorders>
-          <w:top w:val="none" w:color="FFFFFF" w:sz="0"/>
-          <w:left w:val="none" w:color="FFFFFF" w:sz="0"/>
-          <w:bottom w:val="none" w:color="FFFFFF" w:sz="0"/>
-          <w:right w:val="none" w:color="FFFFFF" w:sz="0"/>
-          <w:insideH w:val="single" w:color="auto" w:sz="4"/>
-          <w:insideV w:val="single" w:color="auto" w:sz="4"/>
-        </w:tblBorders>
-      </w:tblPr>
-      <w:tblGrid>
-        <w:gridCol w:w="900"/>
-        <w:gridCol w:w="9006"/>
-      </w:tblGrid>
-      <w:tr>
-        <w:trPr>
-          <w:trHeight w:val="420" w:hRule="atLeast"/>
-        </w:trPr>
-        <w:tc>
-          <w:tcPr>
-            <w:tcW w:type="dxa" w:w="900"/>
-            <w:tcMar>
-              <w:top w:type="dxa" w:w="60"/>
-              <w:left w:type="dxa" w:w="120"/>
-              <w:bottom w:type="dxa" w:w="60"/>
-              <w:right w:type="dxa" w:w="60"/>
-            </w:tcMar>
-          </w:tcPr>
-          <w:p>
-            <w:r>
-              <w:rPr>
-                <w:rFonts w:ascii="Calibri" w:cs="Calibri" w:eastAsia="Calibri" w:hAnsi="Calibri"/>
-                <w:b/>
-                <w:bCs/>
-                <w:color w:val="A83232"/>
-                <w:sz w:val="26"/>
-                <w:szCs w:val="26"/>
-              </w:rPr>
-              <w:t xml:space="preserve">T</w:t>
-            </w:r>
-          </w:p>
-        </w:tc>
-        <w:tc>
-          <w:tcPr>
-            <w:tcW w:type="dxa" w:w="9006"/>
-            <w:tcMar>
-              <w:top w:type="dxa" w:w="80"/>
-              <w:left w:type="dxa" w:w="0"/>
-              <w:bottom w:type="dxa" w:w="80"/>
-              <w:right w:type="dxa" w:w="0"/>
-            </w:tcMar>
-          </w:tcPr>
-          <w:tbl>
-            <w:tblPr>
-              <w:tblW w:type="dxa" w:w="9006"/>
-              <w:tblBorders>
-                <w:top w:val="none" w:color="FFFFFF" w:sz="0"/>
-                <w:left w:val="none" w:color="FFFFFF" w:sz="0"/>
-                <w:bottom w:val="none" w:color="FFFFFF" w:sz="0"/>
-                <w:right w:val="none" w:color="FFFFFF" w:sz="0"/>
-                <w:insideH w:val="single" w:color="auto" w:sz="4"/>
-                <w:insideV w:val="single" w:color="auto" w:sz="4"/>
-              </w:tblBorders>
-            </w:tblPr>
-            <w:tblGrid>
-              <w:gridCol w:w="9006"/>
-            </w:tblGrid>
-            <w:tr>
-              <w:trPr>
-                <w:trHeight w:val="260" w:hRule="exact"/>
-              </w:trPr>
-              <w:tc>
-                <w:tcPr>
-                  <w:tcW w:type="dxa" w:w="9006"/>
-                  <w:shd w:fill="7FB3E6" w:color="auto" w:val="clear"/>
-                  <w:tcMar>
-                    <w:top w:type="dxa" w:w="0"/>
-                    <w:left w:type="dxa" w:w="0"/>
-                    <w:bottom w:type="dxa" w:w="0"/>
-                    <w:right w:type="dxa" w:w="0"/>
-                  </w:tcMar>
-                </w:tcPr>
-                <w:p>
-                  <w:pPr>
-                    <w:spacing w:after="0" w:line="200" w:lineRule="exact"/>
-                  </w:pPr>
-                  <w:r>
-                    <w:rPr>
-                      <w:sz w:val="8"/>
-                      <w:szCs w:val="8"/>
-                    </w:rPr>
-                    <w:t xml:space="preserve"/>
-                  </w:r>
-                </w:p>
-              </w:tc>
-            </w:tr>
-          </w:tbl>
-          <w:p/>
-        </w:tc>
-      </w:tr>
-      <w:tr>
-        <w:trPr>
-          <w:trHeight w:val="420" w:hRule="atLeast"/>
-        </w:trPr>
-        <w:tc>
-          <w:tcPr>
-            <w:tcW w:type="dxa" w:w="900"/>
-            <w:tcMar>
-              <w:top w:type="dxa" w:w="60"/>
-              <w:left w:type="dxa" w:w="120"/>
-              <w:bottom w:type="dxa" w:w="60"/>
-              <w:right w:type="dxa" w:w="60"/>
-            </w:tcMar>
-          </w:tcPr>
-          <w:p>
-            <w:r>
-              <w:rPr>
-                <w:rFonts w:ascii="Calibri" w:cs="Calibri" w:eastAsia="Calibri" w:hAnsi="Calibri"/>
-                <w:b/>
-                <w:bCs/>
-                <w:color w:val="A83232"/>
-                <w:sz w:val="26"/>
-                <w:szCs w:val="26"/>
-              </w:rPr>
-              <w:t xml:space="preserve">E</w:t>
-            </w:r>
-          </w:p>
-        </w:tc>
-        <w:tc>
-          <w:tcPr>
-            <w:tcW w:type="dxa" w:w="9006"/>
-            <w:tcMar>
-              <w:top w:type="dxa" w:w="80"/>
-              <w:left w:type="dxa" w:w="0"/>
-              <w:bottom w:type="dxa" w:w="80"/>
-              <w:right w:type="dxa" w:w="0"/>
-            </w:tcMar>
-          </w:tcPr>
-          <w:tbl>
-            <w:tblPr>
-              <w:tblW w:type="dxa" w:w="9003"/>
-              <w:tblBorders>
-                <w:top w:val="none" w:color="FFFFFF" w:sz="0"/>
-                <w:left w:val="none" w:color="FFFFFF" w:sz="0"/>
-                <w:bottom w:val="none" w:color="FFFFFF" w:sz="0"/>
-                <w:right w:val="none" w:color="FFFFFF" w:sz="0"/>
-                <w:insideH w:val="single" w:color="auto" w:sz="4"/>
-                <w:insideV w:val="single" w:color="auto" w:sz="4"/>
-              </w:tblBorders>
-            </w:tblPr>
-            <w:tblGrid>
-              <w:gridCol w:w="2701"/>
-              <w:gridCol w:w="900"/>
-              <w:gridCol w:w="2701"/>
-              <w:gridCol w:w="2701"/>
-            </w:tblGrid>
-            <w:tr>
-              <w:trPr>
-                <w:trHeight w:val="260" w:hRule="exact"/>
-              </w:trPr>
-              <w:tc>
-                <w:tcPr>
-                  <w:tcW w:type="dxa" w:w="2701"/>
-                  <w:shd w:fill="F5D75A" w:color="auto" w:val="clear"/>
-                  <w:tcMar>
-                    <w:top w:type="dxa" w:w="0"/>
-                    <w:left w:type="dxa" w:w="0"/>
-                    <w:bottom w:type="dxa" w:w="0"/>
-                    <w:right w:type="dxa" w:w="0"/>
-                  </w:tcMar>
-                </w:tcPr>
-                <w:p>
-                  <w:pPr>
-                    <w:spacing w:after="0" w:line="200" w:lineRule="exact"/>
-                  </w:pPr>
-                  <w:r>
-                    <w:rPr>
-                      <w:sz w:val="8"/>
-                      <w:szCs w:val="8"/>
-                    </w:rPr>
-                    <w:t xml:space="preserve"/>
-                  </w:r>
-                </w:p>
-              </w:tc>
-              <w:tc>
-                <w:tcPr>
-                  <w:tcW w:type="dxa" w:w="900"/>
-                  <w:shd w:fill="F2B27A" w:color="auto" w:val="clear"/>
-                  <w:tcMar>
-                    <w:top w:type="dxa" w:w="0"/>
-                    <w:left w:type="dxa" w:w="0"/>
-                    <w:bottom w:type="dxa" w:w="0"/>
-                    <w:right w:type="dxa" w:w="0"/>
-                  </w:tcMar>
-                </w:tcPr>
-                <w:p>
-                  <w:pPr>
-                    <w:spacing w:after="0" w:line="200" w:lineRule="exact"/>
-                  </w:pPr>
-                  <w:r>
-                    <w:rPr>
-                      <w:sz w:val="8"/>
-                      <w:szCs w:val="8"/>
-                    </w:rPr>
-                    <w:t xml:space="preserve"/>
-                  </w:r>
-                </w:p>
-              </w:tc>
-              <w:tc>
-                <w:tcPr>
-                  <w:tcW w:type="dxa" w:w="2701"/>
-                  <w:shd w:fill="7FB3E6" w:color="auto" w:val="clear"/>
-                  <w:tcMar>
-                    <w:top w:type="dxa" w:w="0"/>
-                    <w:left w:type="dxa" w:w="0"/>
-                    <w:bottom w:type="dxa" w:w="0"/>
-                    <w:right w:type="dxa" w:w="0"/>
-                  </w:tcMar>
-                </w:tcPr>
-                <w:p>
-                  <w:pPr>
-                    <w:spacing w:after="0" w:line="200" w:lineRule="exact"/>
-                  </w:pPr>
-                  <w:r>
-                    <w:rPr>
-                      <w:sz w:val="8"/>
-                      <w:szCs w:val="8"/>
-                    </w:rPr>
-                    <w:t xml:space="preserve"/>
-                  </w:r>
-                </w:p>
-              </w:tc>
-              <w:tc>
-                <w:tcPr>
-                  <w:tcW w:type="dxa" w:w="2701"/>
-                  <w:shd w:fill="8FD39A" w:color="auto" w:val="clear"/>
-                  <w:tcMar>
-                    <w:top w:type="dxa" w:w="0"/>
-                    <w:left w:type="dxa" w:w="0"/>
-                    <w:bottom w:type="dxa" w:w="0"/>
-                    <w:right w:type="dxa" w:w="0"/>
-                  </w:tcMar>
-                </w:tcPr>
-                <w:p>
-                  <w:pPr>
-                    <w:spacing w:after="0" w:line="200" w:lineRule="exact"/>
-                  </w:pPr>
-                  <w:r>
-                    <w:rPr>
-                      <w:sz w:val="8"/>
-                      <w:szCs w:val="8"/>
-                    </w:rPr>
-                    <w:t xml:space="preserve"/>
-                  </w:r>
-                </w:p>
-              </w:tc>
-            </w:tr>
-          </w:tbl>
-          <w:p/>
-        </w:tc>
-      </w:tr>
-      <w:tr>
-        <w:trPr>
-          <w:trHeight w:val="420" w:hRule="atLeast"/>
-        </w:trPr>
-        <w:tc>
-          <w:tcPr>
-            <w:tcW w:type="dxa" w:w="900"/>
-            <w:tcMar>
-              <w:top w:type="dxa" w:w="60"/>
-              <w:left w:type="dxa" w:w="120"/>
-              <w:bottom w:type="dxa" w:w="60"/>
-              <w:right w:type="dxa" w:w="60"/>
-            </w:tcMar>
-          </w:tcPr>
-          <w:p>
-            <w:r>
-              <w:rPr>
-                <w:rFonts w:ascii="Calibri" w:cs="Calibri" w:eastAsia="Calibri" w:hAnsi="Calibri"/>
-                <w:b/>
-                <w:bCs/>
-                <w:color w:val="A83232"/>
-                <w:sz w:val="26"/>
-                <w:szCs w:val="26"/>
-              </w:rPr>
-              <w:t xml:space="preserve">E</w:t>
-            </w:r>
-          </w:p>
-        </w:tc>
-        <w:tc>
-          <w:tcPr>
-            <w:tcW w:type="dxa" w:w="9006"/>
-            <w:tcMar>
-              <w:top w:type="dxa" w:w="80"/>
-              <w:left w:type="dxa" w:w="0"/>
-              <w:bottom w:type="dxa" w:w="80"/>
-              <w:right w:type="dxa" w:w="0"/>
-            </w:tcMar>
-          </w:tcPr>
-          <w:tbl>
-            <w:tblPr>
-              <w:tblW w:type="dxa" w:w="9003"/>
-              <w:tblBorders>
-                <w:top w:val="none" w:color="FFFFFF" w:sz="0"/>
-                <w:left w:val="none" w:color="FFFFFF" w:sz="0"/>
-                <w:bottom w:val="none" w:color="FFFFFF" w:sz="0"/>
-                <w:right w:val="none" w:color="FFFFFF" w:sz="0"/>
-                <w:insideH w:val="single" w:color="auto" w:sz="4"/>
-                <w:insideV w:val="single" w:color="auto" w:sz="4"/>
-              </w:tblBorders>
-            </w:tblPr>
-            <w:tblGrid>
-              <w:gridCol w:w="2701"/>
-              <w:gridCol w:w="900"/>
-              <w:gridCol w:w="2701"/>
-              <w:gridCol w:w="2701"/>
-            </w:tblGrid>
-            <w:tr>
-              <w:trPr>
-                <w:trHeight w:val="260" w:hRule="exact"/>
-              </w:trPr>
-              <w:tc>
-                <w:tcPr>
-                  <w:tcW w:type="dxa" w:w="2701"/>
-                  <w:shd w:fill="F5D75A" w:color="auto" w:val="clear"/>
-                  <w:tcMar>
-                    <w:top w:type="dxa" w:w="0"/>
-                    <w:left w:type="dxa" w:w="0"/>
-                    <w:bottom w:type="dxa" w:w="0"/>
-                    <w:right w:type="dxa" w:w="0"/>
-                  </w:tcMar>
-                </w:tcPr>
-                <w:p>
-                  <w:pPr>
-                    <w:spacing w:after="0" w:line="200" w:lineRule="exact"/>
-                  </w:pPr>
-                  <w:r>
-                    <w:rPr>
-                      <w:sz w:val="8"/>
-                      <w:szCs w:val="8"/>
-                    </w:rPr>
-                    <w:t xml:space="preserve"/>
-                  </w:r>
-                </w:p>
-              </w:tc>
-              <w:tc>
-                <w:tcPr>
-                  <w:tcW w:type="dxa" w:w="900"/>
-                  <w:shd w:fill="F2B27A" w:color="auto" w:val="clear"/>
-                  <w:tcMar>
-                    <w:top w:type="dxa" w:w="0"/>
-                    <w:left w:type="dxa" w:w="0"/>
-                    <w:bottom w:type="dxa" w:w="0"/>
-                    <w:right w:type="dxa" w:w="0"/>
-                  </w:tcMar>
-                </w:tcPr>
-                <w:p>
-                  <w:pPr>
-                    <w:spacing w:after="0" w:line="200" w:lineRule="exact"/>
-                  </w:pPr>
-                  <w:r>
-                    <w:rPr>
-                      <w:sz w:val="8"/>
-                      <w:szCs w:val="8"/>
-                    </w:rPr>
-                    <w:t xml:space="preserve"/>
-                  </w:r>
-                </w:p>
-              </w:tc>
-              <w:tc>
-                <w:tcPr>
-                  <w:tcW w:type="dxa" w:w="2701"/>
-                  <w:shd w:fill="7FB3E6" w:color="auto" w:val="clear"/>
-                  <w:tcMar>
-                    <w:top w:type="dxa" w:w="0"/>
-                    <w:left w:type="dxa" w:w="0"/>
-                    <w:bottom w:type="dxa" w:w="0"/>
-                    <w:right w:type="dxa" w:w="0"/>
-                  </w:tcMar>
-                </w:tcPr>
-                <w:p>
-                  <w:pPr>
-                    <w:spacing w:after="0" w:line="200" w:lineRule="exact"/>
-                  </w:pPr>
-                  <w:r>
-                    <w:rPr>
-                      <w:sz w:val="8"/>
-                      <w:szCs w:val="8"/>
-                    </w:rPr>
-                    <w:t xml:space="preserve"/>
-                  </w:r>
-                </w:p>
-              </w:tc>
-              <w:tc>
-                <w:tcPr>
-                  <w:tcW w:type="dxa" w:w="2701"/>
-                  <w:shd w:fill="8FD39A" w:color="auto" w:val="clear"/>
-                  <w:tcMar>
-                    <w:top w:type="dxa" w:w="0"/>
-                    <w:left w:type="dxa" w:w="0"/>
-                    <w:bottom w:type="dxa" w:w="0"/>
-                    <w:right w:type="dxa" w:w="0"/>
-                  </w:tcMar>
-                </w:tcPr>
-                <w:p>
-                  <w:pPr>
-                    <w:spacing w:after="0" w:line="200" w:lineRule="exact"/>
-                  </w:pPr>
-                  <w:r>
-                    <w:rPr>
-                      <w:sz w:val="8"/>
-                      <w:szCs w:val="8"/>
-                    </w:rPr>
-                    <w:t xml:space="preserve"/>
-                  </w:r>
-                </w:p>
-              </w:tc>
-            </w:tr>
-          </w:tbl>
-          <w:p/>
-        </w:tc>
-      </w:tr>
-      <w:tr>
-        <w:trPr>
-          <w:trHeight w:val="420" w:hRule="atLeast"/>
-        </w:trPr>
-        <w:tc>
-          <w:tcPr>
-            <w:tcW w:type="dxa" w:w="900"/>
-            <w:tcMar>
-              <w:top w:type="dxa" w:w="60"/>
-              <w:left w:type="dxa" w:w="120"/>
-              <w:bottom w:type="dxa" w:w="60"/>
-              <w:right w:type="dxa" w:w="60"/>
-            </w:tcMar>
-          </w:tcPr>
-          <w:p>
-            <w:r>
-              <w:rPr>
-                <w:rFonts w:ascii="Calibri" w:cs="Calibri" w:eastAsia="Calibri" w:hAnsi="Calibri"/>
-                <w:b/>
-                <w:bCs/>
-                <w:color w:val="A83232"/>
-                <w:sz w:val="26"/>
-                <w:szCs w:val="26"/>
-              </w:rPr>
-              <w:t xml:space="preserve">L</w:t>
-            </w:r>
-          </w:p>
-        </w:tc>
-        <w:tc>
-          <w:tcPr>
-            <w:tcW w:type="dxa" w:w="9006"/>
-            <w:tcMar>
-              <w:top w:type="dxa" w:w="80"/>
-              <w:left w:type="dxa" w:w="0"/>
-              <w:bottom w:type="dxa" w:w="80"/>
-              <w:right w:type="dxa" w:w="0"/>
-            </w:tcMar>
-          </w:tcPr>
-          <w:tbl>
-            <w:tblPr>
-              <w:tblW w:type="dxa" w:w="9005"/>
-              <w:tblBorders>
-                <w:top w:val="none" w:color="FFFFFF" w:sz="0"/>
-                <w:left w:val="none" w:color="FFFFFF" w:sz="0"/>
-                <w:bottom w:val="none" w:color="FFFFFF" w:sz="0"/>
-                <w:right w:val="none" w:color="FFFFFF" w:sz="0"/>
-                <w:insideH w:val="single" w:color="auto" w:sz="4"/>
-                <w:insideV w:val="single" w:color="auto" w:sz="4"/>
-              </w:tblBorders>
-            </w:tblPr>
-            <w:tblGrid>
-              <w:gridCol w:w="2573"/>
-              <w:gridCol w:w="2573"/>
-              <w:gridCol w:w="3859"/>
-            </w:tblGrid>
-            <w:tr>
-              <w:trPr>
-                <w:trHeight w:val="260" w:hRule="exact"/>
-              </w:trPr>
-              <w:tc>
-                <w:tcPr>
-                  <w:tcW w:type="dxa" w:w="2573"/>
-                  <w:shd w:fill="7FB3E6" w:color="auto" w:val="clear"/>
-                  <w:tcMar>
-                    <w:top w:type="dxa" w:w="0"/>
-                    <w:left w:type="dxa" w:w="0"/>
-                    <w:bottom w:type="dxa" w:w="0"/>
-                    <w:right w:type="dxa" w:w="0"/>
-                  </w:tcMar>
-                </w:tcPr>
-                <w:p>
-                  <w:pPr>
-                    <w:spacing w:after="0" w:line="200" w:lineRule="exact"/>
-                  </w:pPr>
-                  <w:r>
-                    <w:rPr>
-                      <w:sz w:val="8"/>
-                      <w:szCs w:val="8"/>
-                    </w:rPr>
-                    <w:t xml:space="preserve"/>
-                  </w:r>
-                </w:p>
-              </w:tc>
-              <w:tc>
-                <w:tcPr>
-                  <w:tcW w:type="dxa" w:w="2573"/>
-                  <w:shd w:fill="7FB3E6" w:color="auto" w:val="clear"/>
-                  <w:tcMar>
-                    <w:top w:type="dxa" w:w="0"/>
-                    <w:left w:type="dxa" w:w="0"/>
-                    <w:bottom w:type="dxa" w:w="0"/>
-                    <w:right w:type="dxa" w:w="0"/>
-                  </w:tcMar>
-                </w:tcPr>
-                <w:p>
-                  <w:pPr>
-                    <w:spacing w:after="0" w:line="200" w:lineRule="exact"/>
-                  </w:pPr>
-                  <w:r>
-                    <w:rPr>
-                      <w:sz w:val="8"/>
-                      <w:szCs w:val="8"/>
-                    </w:rPr>
-                    <w:t xml:space="preserve"/>
-                  </w:r>
-                </w:p>
-              </w:tc>
-              <w:tc>
-                <w:tcPr>
-                  <w:tcW w:type="dxa" w:w="3859"/>
-                  <w:shd w:fill="8FD39A" w:color="auto" w:val="clear"/>
-                  <w:tcMar>
-                    <w:top w:type="dxa" w:w="0"/>
-                    <w:left w:type="dxa" w:w="0"/>
-                    <w:bottom w:type="dxa" w:w="0"/>
-                    <w:right w:type="dxa" w:w="0"/>
-                  </w:tcMar>
-                </w:tcPr>
-                <w:p>
-                  <w:pPr>
-                    <w:spacing w:after="0" w:line="200" w:lineRule="exact"/>
-                  </w:pPr>
-                  <w:r>
-                    <w:rPr>
-                      <w:sz w:val="8"/>
-                      <w:szCs w:val="8"/>
-                    </w:rPr>
-                    <w:t xml:space="preserve"/>
-                  </w:r>
-                </w:p>
-              </w:tc>
-            </w:tr>
-          </w:tbl>
-          <w:p/>
-        </w:tc>
-      </w:tr>
-    </w:tbl>
     <w:tbl>
       <w:tblPr>
         <w:tblW w:type="dxa" w:w="9906"/>
@@ -2201,7 +2276,21 @@
                 <w:sz w:val="17"/>
                 <w:szCs w:val="17"/>
               </w:rPr>
-              <w:t xml:space="preserve">A third piece of evidence, if you have one.</w:t>
+              <w:t xml:space="preserve">Later, “…”.</w:t>
+            </w:r>
+          </w:p>
+          <w:p>
+            <w:pPr>
+              <w:spacing w:after="40"/>
+            </w:pPr>
+            <w:r>
+              <w:rPr>
+                <w:rFonts w:ascii="Calibri" w:cs="Calibri" w:eastAsia="Calibri" w:hAnsi="Calibri"/>
+                <w:color w:val="645D54"/>
+                <w:sz w:val="17"/>
+                <w:szCs w:val="17"/>
+              </w:rPr>
+              <w:t xml:space="preserve">This shows that B, which …</w:t>
             </w:r>
           </w:p>
         </w:tc>
@@ -2268,7 +2357,7 @@
                 <w:sz w:val="17"/>
                 <w:szCs w:val="17"/>
               </w:rPr>
-              <w:t xml:space="preserve">So friendship gives Subhi A and B, and that is what …</w:t>
+              <w:t xml:space="preserve">So, because A and B, friendship is what …</w:t>
             </w:r>
           </w:p>
         </w:tc>

</xml_diff>

<commit_message>
TEEL deck opens on the prompt every time; sheet matches the teacher's two-page layout with mini bars
Co-Authored-By: Claude Fable 5.1 <noreply@anthropic.com>
Claude-Session: https://claude.ai/code/session_01TX2KYiJGekMNoBBPASQh6e
</commit_message>
<xml_diff>
--- a/BoneSparrow-TEEL-template.docx
+++ b/BoneSparrow-TEEL-template.docx
@@ -57,224 +57,30 @@
     </w:p>
     <w:p>
       <w:pPr>
-        <w:spacing w:after="120"/>
+        <w:spacing w:after="80"/>
       </w:pPr>
       <w:r>
         <w:rPr>
           <w:rFonts w:ascii="Georgia" w:cs="Georgia" w:eastAsia="Georgia" w:hAnsi="Georgia"/>
           <w:color w:val="1E211F"/>
-          <w:sz w:val="22"/>
-          <w:szCs w:val="22"/>
-        </w:rPr>
-        <w:t xml:space="preserve">An essay is a way of organising your thinking so that someone else can follow it. It is for working out what you think, and showing that thinking to a reader who cannot see inside your head.</w:t>
+          <w:sz w:val="20"/>
+          <w:szCs w:val="20"/>
+        </w:rPr>
+        <w:t xml:space="preserve">An essay is a way of organising your thinking so that someone else can follow it. It is for working out what you think, and showing that thinking to a reader who cannot see inside your head. You get a question about the text. You explore it. You sort your ideas into groups. You collect evidence from the novel for each group. Then you write: an introduction that says what you think, a paragraph for each group, and a conclusion that says what it all adds up to.</w:t>
       </w:r>
     </w:p>
     <w:p>
       <w:pPr>
         <w:spacing w:after="60"/>
-        <w:ind w:left="400" w:hanging="240"/>
       </w:pPr>
       <w:r>
         <w:rPr>
           <w:rFonts w:ascii="Georgia" w:cs="Georgia" w:eastAsia="Georgia" w:hAnsi="Georgia"/>
           <w:color w:val="1E211F"/>
-          <w:sz w:val="22"/>
-          <w:szCs w:val="22"/>
-        </w:rPr>
-        <w:t xml:space="preserve">•  </w:t>
-      </w:r>
-      <w:r>
-        <w:rPr>
-          <w:rFonts w:ascii="Georgia" w:cs="Georgia" w:eastAsia="Georgia" w:hAnsi="Georgia"/>
-          <w:color w:val="1E211F"/>
-          <w:sz w:val="22"/>
-          <w:szCs w:val="22"/>
-        </w:rPr>
-        <w:t xml:space="preserve">1   You get a question about the text.</w:t>
-      </w:r>
-    </w:p>
-    <w:p>
-      <w:pPr>
-        <w:spacing w:after="60"/>
-        <w:ind w:left="400" w:hanging="240"/>
-      </w:pPr>
-      <w:r>
-        <w:rPr>
-          <w:rFonts w:ascii="Georgia" w:cs="Georgia" w:eastAsia="Georgia" w:hAnsi="Georgia"/>
-          <w:color w:val="1E211F"/>
-          <w:sz w:val="22"/>
-          <w:szCs w:val="22"/>
-        </w:rPr>
-        <w:t xml:space="preserve">•  </w:t>
-      </w:r>
-      <w:r>
-        <w:rPr>
-          <w:rFonts w:ascii="Georgia" w:cs="Georgia" w:eastAsia="Georgia" w:hAnsi="Georgia"/>
-          <w:color w:val="1E211F"/>
-          <w:sz w:val="22"/>
-          <w:szCs w:val="22"/>
-        </w:rPr>
-        <w:t xml:space="preserve">2   You explore it. Think, talk, argue.</w:t>
-      </w:r>
-    </w:p>
-    <w:p>
-      <w:pPr>
-        <w:spacing w:after="60"/>
-        <w:ind w:left="400" w:hanging="240"/>
-      </w:pPr>
-      <w:r>
-        <w:rPr>
-          <w:rFonts w:ascii="Georgia" w:cs="Georgia" w:eastAsia="Georgia" w:hAnsi="Georgia"/>
-          <w:color w:val="1E211F"/>
-          <w:sz w:val="22"/>
-          <w:szCs w:val="22"/>
-        </w:rPr>
-        <w:t xml:space="preserve">•  </w:t>
-      </w:r>
-      <w:r>
-        <w:rPr>
-          <w:rFonts w:ascii="Georgia" w:cs="Georgia" w:eastAsia="Georgia" w:hAnsi="Georgia"/>
-          <w:color w:val="1E211F"/>
-          <w:sz w:val="22"/>
-          <w:szCs w:val="22"/>
-        </w:rPr>
-        <w:t xml:space="preserve">3   You sort your ideas into groups.</w:t>
-      </w:r>
-    </w:p>
-    <w:p>
-      <w:pPr>
-        <w:spacing w:after="60"/>
-        <w:ind w:left="400" w:hanging="240"/>
-      </w:pPr>
-      <w:r>
-        <w:rPr>
-          <w:rFonts w:ascii="Georgia" w:cs="Georgia" w:eastAsia="Georgia" w:hAnsi="Georgia"/>
-          <w:color w:val="1E211F"/>
-          <w:sz w:val="22"/>
-          <w:szCs w:val="22"/>
-        </w:rPr>
-        <w:t xml:space="preserve">•  </w:t>
-      </w:r>
-      <w:r>
-        <w:rPr>
-          <w:rFonts w:ascii="Georgia" w:cs="Georgia" w:eastAsia="Georgia" w:hAnsi="Georgia"/>
-          <w:color w:val="1E211F"/>
-          <w:sz w:val="22"/>
-          <w:szCs w:val="22"/>
-        </w:rPr>
-        <w:t xml:space="preserve">4   You collect evidence from the novel for each group.</w:t>
-      </w:r>
-    </w:p>
-    <w:p>
-      <w:pPr>
-        <w:spacing w:after="60"/>
-        <w:ind w:left="400" w:hanging="240"/>
-      </w:pPr>
-      <w:r>
-        <w:rPr>
-          <w:rFonts w:ascii="Georgia" w:cs="Georgia" w:eastAsia="Georgia" w:hAnsi="Georgia"/>
-          <w:color w:val="1E211F"/>
-          <w:sz w:val="22"/>
-          <w:szCs w:val="22"/>
-        </w:rPr>
-        <w:t xml:space="preserve">•  </w:t>
-      </w:r>
-      <w:r>
-        <w:rPr>
-          <w:rFonts w:ascii="Georgia" w:cs="Georgia" w:eastAsia="Georgia" w:hAnsi="Georgia"/>
-          <w:color w:val="1E211F"/>
-          <w:sz w:val="22"/>
-          <w:szCs w:val="22"/>
-        </w:rPr>
-        <w:t xml:space="preserve">5   You write: an introduction that says what you think, a paragraph for each group, and a conclusion that says what it all adds up to.</w:t>
-      </w:r>
-    </w:p>
-    <w:p>
-      <w:pPr>
-        <w:spacing w:after="80" w:before="260"/>
-      </w:pPr>
-      <w:r>
-        <w:rPr>
-          <w:rFonts w:ascii="Georgia" w:cs="Georgia" w:eastAsia="Georgia" w:hAnsi="Georgia"/>
-          <w:b/>
-          <w:bCs/>
-          <w:color w:val="1D3C34"/>
-          <w:sz w:val="24"/>
-          <w:szCs w:val="24"/>
-        </w:rPr>
-        <w:t xml:space="preserve">What a text response essay is</w:t>
-      </w:r>
-    </w:p>
-    <w:p>
-      <w:pPr>
-        <w:spacing w:after="60"/>
-        <w:ind w:left="400" w:hanging="240"/>
-      </w:pPr>
-      <w:r>
-        <w:rPr>
-          <w:rFonts w:ascii="Georgia" w:cs="Georgia" w:eastAsia="Georgia" w:hAnsi="Georgia"/>
-          <w:color w:val="1E211F"/>
-          <w:sz w:val="22"/>
-          <w:szCs w:val="22"/>
-        </w:rPr>
-        <w:t xml:space="preserve">•  </w:t>
-      </w:r>
-      <w:r>
-        <w:rPr>
-          <w:rFonts w:ascii="Georgia" w:cs="Georgia" w:eastAsia="Georgia" w:hAnsi="Georgia"/>
-          <w:color w:val="1E211F"/>
-          <w:sz w:val="22"/>
-          <w:szCs w:val="22"/>
-        </w:rPr>
-        <w:t xml:space="preserve">Your thinking about a novel, written in formal language for people who have already read it. Not the story again. What you make of it.</w:t>
-      </w:r>
-    </w:p>
-    <w:p>
-      <w:pPr>
-        <w:spacing w:after="60"/>
-        <w:ind w:left="400" w:hanging="240"/>
-      </w:pPr>
-      <w:r>
-        <w:rPr>
-          <w:rFonts w:ascii="Georgia" w:cs="Georgia" w:eastAsia="Georgia" w:hAnsi="Georgia"/>
-          <w:color w:val="1E211F"/>
-          <w:sz w:val="22"/>
-          <w:szCs w:val="22"/>
-        </w:rPr>
-        <w:t xml:space="preserve">•  </w:t>
-      </w:r>
-      <w:r>
-        <w:rPr>
-          <w:rFonts w:ascii="Georgia" w:cs="Georgia" w:eastAsia="Georgia" w:hAnsi="Georgia"/>
-          <w:color w:val="1E211F"/>
-          <w:sz w:val="22"/>
-          <w:szCs w:val="22"/>
-        </w:rPr>
-        <w:t xml:space="preserve">It answers a prompt or question, uses the big ideas, the events and the characters, and looks at how the author has written about them.</w:t>
-      </w:r>
-    </w:p>
-    <w:p>
-      <w:pPr>
-        <w:spacing w:after="60"/>
-        <w:ind w:left="400" w:hanging="240"/>
-      </w:pPr>
-      <w:r>
-        <w:rPr>
-          <w:rFonts w:ascii="Georgia" w:cs="Georgia" w:eastAsia="Georgia" w:hAnsi="Georgia"/>
-          <w:color w:val="1E211F"/>
-          <w:sz w:val="22"/>
-          <w:szCs w:val="22"/>
-        </w:rPr>
-        <w:t xml:space="preserve">•  </w:t>
-      </w:r>
-      <w:r>
-        <w:rPr>
-          <w:rFonts w:ascii="Georgia" w:cs="Georgia" w:eastAsia="Georgia" w:hAnsi="Georgia"/>
-          <w:color w:val="1E211F"/>
-          <w:sz w:val="22"/>
-          <w:szCs w:val="22"/>
-        </w:rPr>
-        <w:t xml:space="preserve">It usually has an introduction, two to four body paragraphs, and a conclusion. Every body paragraph takes one part of your argument, gives evidence from the novel, and explains what that evidence shows and why the author wrote it that way.</w:t>
+          <w:sz w:val="20"/>
+          <w:szCs w:val="20"/>
+        </w:rPr>
+        <w:t xml:space="preserve">A text response essay is your thinking about a novel, written in formal language for people who have already read it. Not the story again. What you make of it, and how the author wrote it. It usually has an introduction, two to four body paragraphs, and a conclusion. Every body paragraph takes one part of your argument, gives evidence from the novel, and explains what that evidence shows and why the author wrote it that way.</w:t>
       </w:r>
     </w:p>
     <w:p>
@@ -472,789 +278,6 @@
           <w:shd w:fill="DFF0E2" w:val="clear"/>
         </w:rPr>
         <w:t xml:space="preserve">  purpose  </w:t>
-      </w:r>
-    </w:p>
-    <w:tbl>
-      <w:tblPr>
-        <w:tblW w:type="dxa" w:w="9906"/>
-        <w:tblBorders>
-          <w:top w:val="none" w:color="FFFFFF" w:sz="0"/>
-          <w:left w:val="none" w:color="FFFFFF" w:sz="0"/>
-          <w:bottom w:val="none" w:color="FFFFFF" w:sz="0"/>
-          <w:right w:val="none" w:color="FFFFFF" w:sz="0"/>
-          <w:insideH w:val="single" w:color="auto" w:sz="4"/>
-          <w:insideV w:val="single" w:color="auto" w:sz="4"/>
-        </w:tblBorders>
-      </w:tblPr>
-      <w:tblGrid>
-        <w:gridCol w:w="900"/>
-        <w:gridCol w:w="4806"/>
-        <w:gridCol w:w="4200"/>
-      </w:tblGrid>
-      <w:tr>
-        <w:trPr>
-          <w:trHeight w:val="420" w:hRule="atLeast"/>
-        </w:trPr>
-        <w:tc>
-          <w:tcPr>
-            <w:tcW w:type="dxa" w:w="900"/>
-            <w:tcMar>
-              <w:top w:type="dxa" w:w="60"/>
-              <w:left w:type="dxa" w:w="120"/>
-              <w:bottom w:type="dxa" w:w="60"/>
-              <w:right w:type="dxa" w:w="60"/>
-            </w:tcMar>
-          </w:tcPr>
-          <w:p>
-            <w:r>
-              <w:rPr>
-                <w:rFonts w:ascii="Calibri" w:cs="Calibri" w:eastAsia="Calibri" w:hAnsi="Calibri"/>
-                <w:b/>
-                <w:bCs/>
-                <w:color w:val="A83232"/>
-                <w:sz w:val="26"/>
-                <w:szCs w:val="26"/>
-              </w:rPr>
-              <w:t xml:space="preserve">T</w:t>
-            </w:r>
-          </w:p>
-        </w:tc>
-        <w:tc>
-          <w:tcPr>
-            <w:tcW w:type="dxa" w:w="4806"/>
-            <w:tcMar>
-              <w:top w:type="dxa" w:w="80"/>
-              <w:left w:type="dxa" w:w="0"/>
-              <w:bottom w:type="dxa" w:w="80"/>
-              <w:right w:type="dxa" w:w="0"/>
-            </w:tcMar>
-          </w:tcPr>
-          <w:tbl>
-            <w:tblPr>
-              <w:tblW w:type="dxa" w:w="4806"/>
-              <w:tblBorders>
-                <w:top w:val="none" w:color="FFFFFF" w:sz="0"/>
-                <w:left w:val="none" w:color="FFFFFF" w:sz="0"/>
-                <w:bottom w:val="none" w:color="FFFFFF" w:sz="0"/>
-                <w:right w:val="none" w:color="FFFFFF" w:sz="0"/>
-                <w:insideH w:val="single" w:color="auto" w:sz="4"/>
-                <w:insideV w:val="single" w:color="auto" w:sz="4"/>
-              </w:tblBorders>
-            </w:tblPr>
-            <w:tblGrid>
-              <w:gridCol w:w="4806"/>
-            </w:tblGrid>
-            <w:tr>
-              <w:trPr>
-                <w:trHeight w:val="260" w:hRule="exact"/>
-              </w:trPr>
-              <w:tc>
-                <w:tcPr>
-                  <w:tcW w:type="dxa" w:w="4806"/>
-                  <w:shd w:fill="7FB3E6" w:color="auto" w:val="clear"/>
-                  <w:tcMar>
-                    <w:top w:type="dxa" w:w="0"/>
-                    <w:left w:type="dxa" w:w="0"/>
-                    <w:bottom w:type="dxa" w:w="0"/>
-                    <w:right w:type="dxa" w:w="0"/>
-                  </w:tcMar>
-                </w:tcPr>
-                <w:p>
-                  <w:pPr>
-                    <w:spacing w:after="0" w:line="200" w:lineRule="exact"/>
-                  </w:pPr>
-                  <w:r>
-                    <w:rPr>
-                      <w:sz w:val="8"/>
-                      <w:szCs w:val="8"/>
-                    </w:rPr>
-                    <w:t xml:space="preserve"/>
-                  </w:r>
-                </w:p>
-              </w:tc>
-            </w:tr>
-          </w:tbl>
-          <w:p/>
-        </w:tc>
-        <w:tc>
-          <w:tcPr>
-            <w:tcW w:type="dxa" w:w="4200"/>
-            <w:tcMar>
-              <w:top w:type="dxa" w:w="60"/>
-              <w:left w:type="dxa" w:w="160"/>
-              <w:bottom w:type="dxa" w:w="60"/>
-              <w:right w:type="dxa" w:w="60"/>
-            </w:tcMar>
-          </w:tcPr>
-          <w:p>
-            <w:r>
-              <w:rPr>
-                <w:rFonts w:ascii="Calibri" w:cs="Calibri" w:eastAsia="Calibri" w:hAnsi="Calibri"/>
-                <w:color w:val="645D54"/>
-                <w:sz w:val="17"/>
-                <w:szCs w:val="17"/>
-              </w:rPr>
-              <w:t xml:space="preserve">the idea, and why it matters</w:t>
-            </w:r>
-          </w:p>
-        </w:tc>
-      </w:tr>
-      <w:tr>
-        <w:trPr>
-          <w:trHeight w:val="420" w:hRule="atLeast"/>
-        </w:trPr>
-        <w:tc>
-          <w:tcPr>
-            <w:tcW w:type="dxa" w:w="900"/>
-            <w:tcMar>
-              <w:top w:type="dxa" w:w="60"/>
-              <w:left w:type="dxa" w:w="120"/>
-              <w:bottom w:type="dxa" w:w="60"/>
-              <w:right w:type="dxa" w:w="60"/>
-            </w:tcMar>
-          </w:tcPr>
-          <w:p>
-            <w:r>
-              <w:rPr>
-                <w:rFonts w:ascii="Calibri" w:cs="Calibri" w:eastAsia="Calibri" w:hAnsi="Calibri"/>
-                <w:b/>
-                <w:bCs/>
-                <w:color w:val="A83232"/>
-                <w:sz w:val="26"/>
-                <w:szCs w:val="26"/>
-              </w:rPr>
-              <w:t xml:space="preserve">E</w:t>
-            </w:r>
-          </w:p>
-        </w:tc>
-        <w:tc>
-          <w:tcPr>
-            <w:tcW w:type="dxa" w:w="4806"/>
-            <w:tcMar>
-              <w:top w:type="dxa" w:w="80"/>
-              <w:left w:type="dxa" w:w="0"/>
-              <w:bottom w:type="dxa" w:w="80"/>
-              <w:right w:type="dxa" w:w="0"/>
-            </w:tcMar>
-          </w:tcPr>
-          <w:tbl>
-            <w:tblPr>
-              <w:tblW w:type="dxa" w:w="4803"/>
-              <w:tblBorders>
-                <w:top w:val="none" w:color="FFFFFF" w:sz="0"/>
-                <w:left w:val="none" w:color="FFFFFF" w:sz="0"/>
-                <w:bottom w:val="none" w:color="FFFFFF" w:sz="0"/>
-                <w:right w:val="none" w:color="FFFFFF" w:sz="0"/>
-                <w:insideH w:val="single" w:color="auto" w:sz="4"/>
-                <w:insideV w:val="single" w:color="auto" w:sz="4"/>
-              </w:tblBorders>
-            </w:tblPr>
-            <w:tblGrid>
-              <w:gridCol w:w="1441"/>
-              <w:gridCol w:w="480"/>
-              <w:gridCol w:w="1441"/>
-              <w:gridCol w:w="1441"/>
-            </w:tblGrid>
-            <w:tr>
-              <w:trPr>
-                <w:trHeight w:val="260" w:hRule="exact"/>
-              </w:trPr>
-              <w:tc>
-                <w:tcPr>
-                  <w:tcW w:type="dxa" w:w="1441"/>
-                  <w:shd w:fill="F5D75A" w:color="auto" w:val="clear"/>
-                  <w:tcMar>
-                    <w:top w:type="dxa" w:w="0"/>
-                    <w:left w:type="dxa" w:w="0"/>
-                    <w:bottom w:type="dxa" w:w="0"/>
-                    <w:right w:type="dxa" w:w="0"/>
-                  </w:tcMar>
-                </w:tcPr>
-                <w:p>
-                  <w:pPr>
-                    <w:spacing w:after="0" w:line="200" w:lineRule="exact"/>
-                  </w:pPr>
-                  <w:r>
-                    <w:rPr>
-                      <w:sz w:val="8"/>
-                      <w:szCs w:val="8"/>
-                    </w:rPr>
-                    <w:t xml:space="preserve"/>
-                  </w:r>
-                </w:p>
-              </w:tc>
-              <w:tc>
-                <w:tcPr>
-                  <w:tcW w:type="dxa" w:w="480"/>
-                  <w:shd w:fill="F2B27A" w:color="auto" w:val="clear"/>
-                  <w:tcMar>
-                    <w:top w:type="dxa" w:w="0"/>
-                    <w:left w:type="dxa" w:w="0"/>
-                    <w:bottom w:type="dxa" w:w="0"/>
-                    <w:right w:type="dxa" w:w="0"/>
-                  </w:tcMar>
-                </w:tcPr>
-                <w:p>
-                  <w:pPr>
-                    <w:spacing w:after="0" w:line="200" w:lineRule="exact"/>
-                  </w:pPr>
-                  <w:r>
-                    <w:rPr>
-                      <w:sz w:val="8"/>
-                      <w:szCs w:val="8"/>
-                    </w:rPr>
-                    <w:t xml:space="preserve"/>
-                  </w:r>
-                </w:p>
-              </w:tc>
-              <w:tc>
-                <w:tcPr>
-                  <w:tcW w:type="dxa" w:w="1441"/>
-                  <w:shd w:fill="7FB3E6" w:color="auto" w:val="clear"/>
-                  <w:tcMar>
-                    <w:top w:type="dxa" w:w="0"/>
-                    <w:left w:type="dxa" w:w="0"/>
-                    <w:bottom w:type="dxa" w:w="0"/>
-                    <w:right w:type="dxa" w:w="0"/>
-                  </w:tcMar>
-                </w:tcPr>
-                <w:p>
-                  <w:pPr>
-                    <w:spacing w:after="0" w:line="200" w:lineRule="exact"/>
-                  </w:pPr>
-                  <w:r>
-                    <w:rPr>
-                      <w:sz w:val="8"/>
-                      <w:szCs w:val="8"/>
-                    </w:rPr>
-                    <w:t xml:space="preserve"/>
-                  </w:r>
-                </w:p>
-              </w:tc>
-              <w:tc>
-                <w:tcPr>
-                  <w:tcW w:type="dxa" w:w="1441"/>
-                  <w:shd w:fill="8FD39A" w:color="auto" w:val="clear"/>
-                  <w:tcMar>
-                    <w:top w:type="dxa" w:w="0"/>
-                    <w:left w:type="dxa" w:w="0"/>
-                    <w:bottom w:type="dxa" w:w="0"/>
-                    <w:right w:type="dxa" w:w="0"/>
-                  </w:tcMar>
-                </w:tcPr>
-                <w:p>
-                  <w:pPr>
-                    <w:spacing w:after="0" w:line="200" w:lineRule="exact"/>
-                  </w:pPr>
-                  <w:r>
-                    <w:rPr>
-                      <w:sz w:val="8"/>
-                      <w:szCs w:val="8"/>
-                    </w:rPr>
-                    <w:t xml:space="preserve"/>
-                  </w:r>
-                </w:p>
-              </w:tc>
-            </w:tr>
-          </w:tbl>
-          <w:p/>
-        </w:tc>
-        <w:tc>
-          <w:tcPr>
-            <w:tcW w:type="dxa" w:w="4200"/>
-            <w:tcMar>
-              <w:top w:type="dxa" w:w="60"/>
-              <w:left w:type="dxa" w:w="160"/>
-              <w:bottom w:type="dxa" w:w="60"/>
-              <w:right w:type="dxa" w:w="60"/>
-            </w:tcMar>
-          </w:tcPr>
-          <w:p>
-            <w:r>
-              <w:rPr>
-                <w:rFonts w:ascii="Calibri" w:cs="Calibri" w:eastAsia="Calibri" w:hAnsi="Calibri"/>
-                <w:color w:val="645D54"/>
-                <w:sz w:val="17"/>
-                <w:szCs w:val="17"/>
-              </w:rPr>
-              <w:t xml:space="preserve">a quote, what it shows, what it does to the reader</w:t>
-            </w:r>
-          </w:p>
-        </w:tc>
-      </w:tr>
-      <w:tr>
-        <w:trPr>
-          <w:trHeight w:val="420" w:hRule="atLeast"/>
-        </w:trPr>
-        <w:tc>
-          <w:tcPr>
-            <w:tcW w:type="dxa" w:w="900"/>
-            <w:tcMar>
-              <w:top w:type="dxa" w:w="60"/>
-              <w:left w:type="dxa" w:w="120"/>
-              <w:bottom w:type="dxa" w:w="60"/>
-              <w:right w:type="dxa" w:w="60"/>
-            </w:tcMar>
-          </w:tcPr>
-          <w:p>
-            <w:r>
-              <w:rPr>
-                <w:rFonts w:ascii="Calibri" w:cs="Calibri" w:eastAsia="Calibri" w:hAnsi="Calibri"/>
-                <w:b/>
-                <w:bCs/>
-                <w:color w:val="A83232"/>
-                <w:sz w:val="26"/>
-                <w:szCs w:val="26"/>
-              </w:rPr>
-              <w:t xml:space="preserve">E</w:t>
-            </w:r>
-          </w:p>
-        </w:tc>
-        <w:tc>
-          <w:tcPr>
-            <w:tcW w:type="dxa" w:w="4806"/>
-            <w:tcMar>
-              <w:top w:type="dxa" w:w="80"/>
-              <w:left w:type="dxa" w:w="0"/>
-              <w:bottom w:type="dxa" w:w="80"/>
-              <w:right w:type="dxa" w:w="0"/>
-            </w:tcMar>
-          </w:tcPr>
-          <w:tbl>
-            <w:tblPr>
-              <w:tblW w:type="dxa" w:w="4803"/>
-              <w:tblBorders>
-                <w:top w:val="none" w:color="FFFFFF" w:sz="0"/>
-                <w:left w:val="none" w:color="FFFFFF" w:sz="0"/>
-                <w:bottom w:val="none" w:color="FFFFFF" w:sz="0"/>
-                <w:right w:val="none" w:color="FFFFFF" w:sz="0"/>
-                <w:insideH w:val="single" w:color="auto" w:sz="4"/>
-                <w:insideV w:val="single" w:color="auto" w:sz="4"/>
-              </w:tblBorders>
-            </w:tblPr>
-            <w:tblGrid>
-              <w:gridCol w:w="1441"/>
-              <w:gridCol w:w="480"/>
-              <w:gridCol w:w="1441"/>
-              <w:gridCol w:w="1441"/>
-            </w:tblGrid>
-            <w:tr>
-              <w:trPr>
-                <w:trHeight w:val="260" w:hRule="exact"/>
-              </w:trPr>
-              <w:tc>
-                <w:tcPr>
-                  <w:tcW w:type="dxa" w:w="1441"/>
-                  <w:shd w:fill="F5D75A" w:color="auto" w:val="clear"/>
-                  <w:tcMar>
-                    <w:top w:type="dxa" w:w="0"/>
-                    <w:left w:type="dxa" w:w="0"/>
-                    <w:bottom w:type="dxa" w:w="0"/>
-                    <w:right w:type="dxa" w:w="0"/>
-                  </w:tcMar>
-                </w:tcPr>
-                <w:p>
-                  <w:pPr>
-                    <w:spacing w:after="0" w:line="200" w:lineRule="exact"/>
-                  </w:pPr>
-                  <w:r>
-                    <w:rPr>
-                      <w:sz w:val="8"/>
-                      <w:szCs w:val="8"/>
-                    </w:rPr>
-                    <w:t xml:space="preserve"/>
-                  </w:r>
-                </w:p>
-              </w:tc>
-              <w:tc>
-                <w:tcPr>
-                  <w:tcW w:type="dxa" w:w="480"/>
-                  <w:shd w:fill="F2B27A" w:color="auto" w:val="clear"/>
-                  <w:tcMar>
-                    <w:top w:type="dxa" w:w="0"/>
-                    <w:left w:type="dxa" w:w="0"/>
-                    <w:bottom w:type="dxa" w:w="0"/>
-                    <w:right w:type="dxa" w:w="0"/>
-                  </w:tcMar>
-                </w:tcPr>
-                <w:p>
-                  <w:pPr>
-                    <w:spacing w:after="0" w:line="200" w:lineRule="exact"/>
-                  </w:pPr>
-                  <w:r>
-                    <w:rPr>
-                      <w:sz w:val="8"/>
-                      <w:szCs w:val="8"/>
-                    </w:rPr>
-                    <w:t xml:space="preserve"/>
-                  </w:r>
-                </w:p>
-              </w:tc>
-              <w:tc>
-                <w:tcPr>
-                  <w:tcW w:type="dxa" w:w="1441"/>
-                  <w:shd w:fill="7FB3E6" w:color="auto" w:val="clear"/>
-                  <w:tcMar>
-                    <w:top w:type="dxa" w:w="0"/>
-                    <w:left w:type="dxa" w:w="0"/>
-                    <w:bottom w:type="dxa" w:w="0"/>
-                    <w:right w:type="dxa" w:w="0"/>
-                  </w:tcMar>
-                </w:tcPr>
-                <w:p>
-                  <w:pPr>
-                    <w:spacing w:after="0" w:line="200" w:lineRule="exact"/>
-                  </w:pPr>
-                  <w:r>
-                    <w:rPr>
-                      <w:sz w:val="8"/>
-                      <w:szCs w:val="8"/>
-                    </w:rPr>
-                    <w:t xml:space="preserve"/>
-                  </w:r>
-                </w:p>
-              </w:tc>
-              <w:tc>
-                <w:tcPr>
-                  <w:tcW w:type="dxa" w:w="1441"/>
-                  <w:shd w:fill="8FD39A" w:color="auto" w:val="clear"/>
-                  <w:tcMar>
-                    <w:top w:type="dxa" w:w="0"/>
-                    <w:left w:type="dxa" w:w="0"/>
-                    <w:bottom w:type="dxa" w:w="0"/>
-                    <w:right w:type="dxa" w:w="0"/>
-                  </w:tcMar>
-                </w:tcPr>
-                <w:p>
-                  <w:pPr>
-                    <w:spacing w:after="0" w:line="200" w:lineRule="exact"/>
-                  </w:pPr>
-                  <w:r>
-                    <w:rPr>
-                      <w:sz w:val="8"/>
-                      <w:szCs w:val="8"/>
-                    </w:rPr>
-                    <w:t xml:space="preserve"/>
-                  </w:r>
-                </w:p>
-              </w:tc>
-            </w:tr>
-          </w:tbl>
-          <w:p/>
-        </w:tc>
-        <w:tc>
-          <w:tcPr>
-            <w:tcW w:type="dxa" w:w="4200"/>
-            <w:tcMar>
-              <w:top w:type="dxa" w:w="60"/>
-              <w:left w:type="dxa" w:w="160"/>
-              <w:bottom w:type="dxa" w:w="60"/>
-              <w:right w:type="dxa" w:w="60"/>
-            </w:tcMar>
-          </w:tcPr>
-          <w:p>
-            <w:r>
-              <w:rPr>
-                <w:rFonts w:ascii="Calibri" w:cs="Calibri" w:eastAsia="Calibri" w:hAnsi="Calibri"/>
-                <w:color w:val="645D54"/>
-                <w:sz w:val="17"/>
-                <w:szCs w:val="17"/>
-              </w:rPr>
-              <w:t xml:space="preserve">a quote, what it shows, what it does to the reader</w:t>
-            </w:r>
-          </w:p>
-        </w:tc>
-      </w:tr>
-      <w:tr>
-        <w:trPr>
-          <w:trHeight w:val="420" w:hRule="atLeast"/>
-        </w:trPr>
-        <w:tc>
-          <w:tcPr>
-            <w:tcW w:type="dxa" w:w="900"/>
-            <w:tcMar>
-              <w:top w:type="dxa" w:w="60"/>
-              <w:left w:type="dxa" w:w="120"/>
-              <w:bottom w:type="dxa" w:w="60"/>
-              <w:right w:type="dxa" w:w="60"/>
-            </w:tcMar>
-          </w:tcPr>
-          <w:p>
-            <w:r>
-              <w:rPr>
-                <w:rFonts w:ascii="Calibri" w:cs="Calibri" w:eastAsia="Calibri" w:hAnsi="Calibri"/>
-                <w:b/>
-                <w:bCs/>
-                <w:color w:val="A83232"/>
-                <w:sz w:val="26"/>
-                <w:szCs w:val="26"/>
-              </w:rPr>
-              <w:t xml:space="preserve">L</w:t>
-            </w:r>
-          </w:p>
-        </w:tc>
-        <w:tc>
-          <w:tcPr>
-            <w:tcW w:type="dxa" w:w="4806"/>
-            <w:tcMar>
-              <w:top w:type="dxa" w:w="80"/>
-              <w:left w:type="dxa" w:w="0"/>
-              <w:bottom w:type="dxa" w:w="80"/>
-              <w:right w:type="dxa" w:w="0"/>
-            </w:tcMar>
-          </w:tcPr>
-          <w:tbl>
-            <w:tblPr>
-              <w:tblW w:type="dxa" w:w="4805"/>
-              <w:tblBorders>
-                <w:top w:val="none" w:color="FFFFFF" w:sz="0"/>
-                <w:left w:val="none" w:color="FFFFFF" w:sz="0"/>
-                <w:bottom w:val="none" w:color="FFFFFF" w:sz="0"/>
-                <w:right w:val="none" w:color="FFFFFF" w:sz="0"/>
-                <w:insideH w:val="single" w:color="auto" w:sz="4"/>
-                <w:insideV w:val="single" w:color="auto" w:sz="4"/>
-              </w:tblBorders>
-            </w:tblPr>
-            <w:tblGrid>
-              <w:gridCol w:w="1373"/>
-              <w:gridCol w:w="1373"/>
-              <w:gridCol w:w="2059"/>
-            </w:tblGrid>
-            <w:tr>
-              <w:trPr>
-                <w:trHeight w:val="260" w:hRule="exact"/>
-              </w:trPr>
-              <w:tc>
-                <w:tcPr>
-                  <w:tcW w:type="dxa" w:w="1373"/>
-                  <w:shd w:fill="7FB3E6" w:color="auto" w:val="clear"/>
-                  <w:tcMar>
-                    <w:top w:type="dxa" w:w="0"/>
-                    <w:left w:type="dxa" w:w="0"/>
-                    <w:bottom w:type="dxa" w:w="0"/>
-                    <w:right w:type="dxa" w:w="0"/>
-                  </w:tcMar>
-                </w:tcPr>
-                <w:p>
-                  <w:pPr>
-                    <w:spacing w:after="0" w:line="200" w:lineRule="exact"/>
-                  </w:pPr>
-                  <w:r>
-                    <w:rPr>
-                      <w:sz w:val="8"/>
-                      <w:szCs w:val="8"/>
-                    </w:rPr>
-                    <w:t xml:space="preserve"/>
-                  </w:r>
-                </w:p>
-              </w:tc>
-              <w:tc>
-                <w:tcPr>
-                  <w:tcW w:type="dxa" w:w="1373"/>
-                  <w:shd w:fill="7FB3E6" w:color="auto" w:val="clear"/>
-                  <w:tcMar>
-                    <w:top w:type="dxa" w:w="0"/>
-                    <w:left w:type="dxa" w:w="0"/>
-                    <w:bottom w:type="dxa" w:w="0"/>
-                    <w:right w:type="dxa" w:w="0"/>
-                  </w:tcMar>
-                </w:tcPr>
-                <w:p>
-                  <w:pPr>
-                    <w:spacing w:after="0" w:line="200" w:lineRule="exact"/>
-                  </w:pPr>
-                  <w:r>
-                    <w:rPr>
-                      <w:sz w:val="8"/>
-                      <w:szCs w:val="8"/>
-                    </w:rPr>
-                    <w:t xml:space="preserve"/>
-                  </w:r>
-                </w:p>
-              </w:tc>
-              <w:tc>
-                <w:tcPr>
-                  <w:tcW w:type="dxa" w:w="2059"/>
-                  <w:shd w:fill="8FD39A" w:color="auto" w:val="clear"/>
-                  <w:tcMar>
-                    <w:top w:type="dxa" w:w="0"/>
-                    <w:left w:type="dxa" w:w="0"/>
-                    <w:bottom w:type="dxa" w:w="0"/>
-                    <w:right w:type="dxa" w:w="0"/>
-                  </w:tcMar>
-                </w:tcPr>
-                <w:p>
-                  <w:pPr>
-                    <w:spacing w:after="0" w:line="200" w:lineRule="exact"/>
-                  </w:pPr>
-                  <w:r>
-                    <w:rPr>
-                      <w:sz w:val="8"/>
-                      <w:szCs w:val="8"/>
-                    </w:rPr>
-                    <w:t xml:space="preserve"/>
-                  </w:r>
-                </w:p>
-              </w:tc>
-            </w:tr>
-          </w:tbl>
-          <w:p/>
-        </w:tc>
-        <w:tc>
-          <w:tcPr>
-            <w:tcW w:type="dxa" w:w="4200"/>
-            <w:tcMar>
-              <w:top w:type="dxa" w:w="60"/>
-              <w:left w:type="dxa" w:w="160"/>
-              <w:bottom w:type="dxa" w:w="60"/>
-              <w:right w:type="dxa" w:w="60"/>
-            </w:tcMar>
-          </w:tcPr>
-          <w:p>
-            <w:r>
-              <w:rPr>
-                <w:rFonts w:ascii="Calibri" w:cs="Calibri" w:eastAsia="Calibri" w:hAnsi="Calibri"/>
-                <w:color w:val="645D54"/>
-                <w:sz w:val="17"/>
-                <w:szCs w:val="17"/>
-              </w:rPr>
-              <w:t xml:space="preserve">link the ideas together and back to the prompt</w:t>
-            </w:r>
-          </w:p>
-        </w:tc>
-      </w:tr>
-    </w:tbl>
-    <w:p>
-      <w:r>
-        <w:br w:type="page"/>
-      </w:r>
-    </w:p>
-    <w:p>
-      <w:pPr>
-        <w:spacing w:after="80" w:before="260"/>
-      </w:pPr>
-      <w:r>
-        <w:rPr>
-          <w:rFonts w:ascii="Georgia" w:cs="Georgia" w:eastAsia="Georgia" w:hAnsi="Georgia"/>
-          <w:b/>
-          <w:bCs/>
-          <w:color w:val="1D3C34"/>
-          <w:sz w:val="24"/>
-          <w:szCs w:val="24"/>
-        </w:rPr>
-        <w:t xml:space="preserve">Colour the worked paragraph</w:t>
-      </w:r>
-    </w:p>
-    <w:p>
-      <w:pPr>
-        <w:spacing w:after="120"/>
-      </w:pPr>
-      <w:r>
-        <w:rPr>
-          <w:rFonts w:ascii="Georgia" w:cs="Georgia" w:eastAsia="Georgia" w:hAnsi="Georgia"/>
-          <w:color w:val="1E211F"/>
-          <w:sz w:val="22"/>
-          <w:szCs w:val="22"/>
-        </w:rPr>
-        <w:t xml:space="preserve">Colour each word or phrase using the colour scheme: </w:t>
-      </w:r>
-      <w:r>
-        <w:rPr>
-          <w:rFonts w:ascii="Calibri" w:cs="Calibri" w:eastAsia="Calibri" w:hAnsi="Calibri"/>
-          <w:b/>
-          <w:bCs/>
-          <w:color w:val="0B447C"/>
-          <w:sz w:val="20"/>
-          <w:szCs w:val="20"/>
-          <w:shd w:fill="D6EAFC" w:val="clear"/>
-        </w:rPr>
-        <w:t xml:space="preserve">  idea  </w:t>
-      </w:r>
-      <w:r>
-        <w:rPr>
-          <w:rFonts w:ascii="Georgia" w:cs="Georgia" w:eastAsia="Georgia" w:hAnsi="Georgia"/>
-          <w:color w:val="1E211F"/>
-          <w:sz w:val="22"/>
-          <w:szCs w:val="22"/>
-        </w:rPr>
-        <w:t xml:space="preserve">, </w:t>
-      </w:r>
-      <w:r>
-        <w:rPr>
-          <w:rFonts w:ascii="Calibri" w:cs="Calibri" w:eastAsia="Calibri" w:hAnsi="Calibri"/>
-          <w:b/>
-          <w:bCs/>
-          <w:color w:val="8A4B12"/>
-          <w:sz w:val="20"/>
-          <w:szCs w:val="20"/>
-          <w:shd w:fill="FAE3CF" w:val="clear"/>
-        </w:rPr>
-        <w:t xml:space="preserve">  verb  </w:t>
-      </w:r>
-      <w:r>
-        <w:rPr>
-          <w:rFonts w:ascii="Georgia" w:cs="Georgia" w:eastAsia="Georgia" w:hAnsi="Georgia"/>
-          <w:color w:val="1E211F"/>
-          <w:sz w:val="22"/>
-          <w:szCs w:val="22"/>
-        </w:rPr>
-        <w:t xml:space="preserve">, </w:t>
-      </w:r>
-      <w:r>
-        <w:rPr>
-          <w:rFonts w:ascii="Calibri" w:cs="Calibri" w:eastAsia="Calibri" w:hAnsi="Calibri"/>
-          <w:b/>
-          <w:bCs/>
-          <w:color w:val="7A5A00"/>
-          <w:sz w:val="20"/>
-          <w:szCs w:val="20"/>
-          <w:shd w:fill="FFF3B0" w:val="clear"/>
-        </w:rPr>
-        <w:t xml:space="preserve">  evidence  </w:t>
-      </w:r>
-      <w:r>
-        <w:rPr>
-          <w:rFonts w:ascii="Georgia" w:cs="Georgia" w:eastAsia="Georgia" w:hAnsi="Georgia"/>
-          <w:color w:val="1E211F"/>
-          <w:sz w:val="22"/>
-          <w:szCs w:val="22"/>
-        </w:rPr>
-        <w:t xml:space="preserve">, </w:t>
-      </w:r>
-      <w:r>
-        <w:rPr>
-          <w:rFonts w:ascii="Calibri" w:cs="Calibri" w:eastAsia="Calibri" w:hAnsi="Calibri"/>
-          <w:b/>
-          <w:bCs/>
-          <w:color w:val="1F5C33"/>
-          <w:sz w:val="20"/>
-          <w:szCs w:val="20"/>
-          <w:shd w:fill="DFF0E2" w:val="clear"/>
-        </w:rPr>
-        <w:t xml:space="preserve">  purpose  </w:t>
-      </w:r>
-      <w:r>
-        <w:rPr>
-          <w:rFonts w:ascii="Georgia" w:cs="Georgia" w:eastAsia="Georgia" w:hAnsi="Georgia"/>
-          <w:color w:val="1E211F"/>
-          <w:sz w:val="22"/>
-          <w:szCs w:val="22"/>
-        </w:rPr>
-        <w:t xml:space="preserve">.</w:t>
-      </w:r>
-    </w:p>
-    <w:p>
-      <w:pPr>
-        <w:spacing w:after="120"/>
-      </w:pPr>
-      <w:r>
-        <w:rPr>
-          <w:rFonts w:ascii="Georgia" w:cs="Georgia" w:eastAsia="Georgia" w:hAnsi="Georgia"/>
-          <w:color w:val="1E211F"/>
-          <w:sz w:val="22"/>
-          <w:szCs w:val="22"/>
-        </w:rPr>
-        <w:t xml:space="preserve">OR if you don’t have the colours, underline the ideas, circle the purpose and draw a box around the evidence.</w:t>
       </w:r>
     </w:p>
     <w:tbl>
@@ -1356,7 +379,20 @@
               </w:tc>
             </w:tr>
           </w:tbl>
-          <w:p/>
+          <w:p>
+            <w:pPr>
+              <w:spacing w:after="0" w:before="40"/>
+            </w:pPr>
+            <w:r>
+              <w:rPr>
+                <w:rFonts w:ascii="Calibri" w:cs="Calibri" w:eastAsia="Calibri" w:hAnsi="Calibri"/>
+                <w:color w:val="645D54"/>
+                <w:sz w:val="16"/>
+                <w:szCs w:val="16"/>
+              </w:rPr>
+              <w:t xml:space="preserve">the idea, and why it matters</w:t>
+            </w:r>
+          </w:p>
         </w:tc>
       </w:tr>
       <w:tr>
@@ -1517,7 +553,20 @@
               </w:tc>
             </w:tr>
           </w:tbl>
-          <w:p/>
+          <w:p>
+            <w:pPr>
+              <w:spacing w:after="0" w:before="40"/>
+            </w:pPr>
+            <w:r>
+              <w:rPr>
+                <w:rFonts w:ascii="Calibri" w:cs="Calibri" w:eastAsia="Calibri" w:hAnsi="Calibri"/>
+                <w:color w:val="645D54"/>
+                <w:sz w:val="16"/>
+                <w:szCs w:val="16"/>
+              </w:rPr>
+              <w:t xml:space="preserve">a quote, what it shows, what it does to the reader</w:t>
+            </w:r>
+          </w:p>
         </w:tc>
       </w:tr>
       <w:tr>
@@ -1678,7 +727,20 @@
               </w:tc>
             </w:tr>
           </w:tbl>
-          <w:p/>
+          <w:p>
+            <w:pPr>
+              <w:spacing w:after="0" w:before="40"/>
+            </w:pPr>
+            <w:r>
+              <w:rPr>
+                <w:rFonts w:ascii="Calibri" w:cs="Calibri" w:eastAsia="Calibri" w:hAnsi="Calibri"/>
+                <w:color w:val="645D54"/>
+                <w:sz w:val="16"/>
+                <w:szCs w:val="16"/>
+              </w:rPr>
+              <w:t xml:space="preserve">a quote, what it shows, what it does to the reader</w:t>
+            </w:r>
+          </w:p>
         </w:tc>
       </w:tr>
       <w:tr>
@@ -1814,10 +876,151 @@
               </w:tc>
             </w:tr>
           </w:tbl>
-          <w:p/>
+          <w:p>
+            <w:pPr>
+              <w:spacing w:after="0" w:before="40"/>
+            </w:pPr>
+            <w:r>
+              <w:rPr>
+                <w:rFonts w:ascii="Calibri" w:cs="Calibri" w:eastAsia="Calibri" w:hAnsi="Calibri"/>
+                <w:color w:val="645D54"/>
+                <w:sz w:val="16"/>
+                <w:szCs w:val="16"/>
+              </w:rPr>
+              <w:t xml:space="preserve">link the ideas together and back to the prompt</w:t>
+            </w:r>
+          </w:p>
         </w:tc>
       </w:tr>
     </w:tbl>
+    <w:p>
+      <w:pPr>
+        <w:spacing w:after="80" w:before="260"/>
+      </w:pPr>
+      <w:r>
+        <w:rPr>
+          <w:rFonts w:ascii="Georgia" w:cs="Georgia" w:eastAsia="Georgia" w:hAnsi="Georgia"/>
+          <w:b/>
+          <w:bCs/>
+          <w:color w:val="1D3C34"/>
+          <w:sz w:val="24"/>
+          <w:szCs w:val="24"/>
+        </w:rPr>
+        <w:t xml:space="preserve">Colour the worked paragraph</w:t>
+      </w:r>
+    </w:p>
+    <w:p>
+      <w:pPr>
+        <w:spacing w:after="120"/>
+      </w:pPr>
+      <w:r>
+        <w:rPr>
+          <w:rFonts w:ascii="Georgia" w:cs="Georgia" w:eastAsia="Georgia" w:hAnsi="Georgia"/>
+          <w:color w:val="1E211F"/>
+          <w:sz w:val="22"/>
+          <w:szCs w:val="22"/>
+        </w:rPr>
+        <w:t xml:space="preserve">Colour each word or phrase using the colour scheme: </w:t>
+      </w:r>
+      <w:r>
+        <w:rPr>
+          <w:rFonts w:ascii="Calibri" w:cs="Calibri" w:eastAsia="Calibri" w:hAnsi="Calibri"/>
+          <w:b/>
+          <w:bCs/>
+          <w:color w:val="0B447C"/>
+          <w:sz w:val="20"/>
+          <w:szCs w:val="20"/>
+          <w:shd w:fill="D6EAFC" w:val="clear"/>
+        </w:rPr>
+        <w:t xml:space="preserve">  idea  </w:t>
+      </w:r>
+      <w:r>
+        <w:rPr>
+          <w:rFonts w:ascii="Georgia" w:cs="Georgia" w:eastAsia="Georgia" w:hAnsi="Georgia"/>
+          <w:color w:val="1E211F"/>
+          <w:sz w:val="22"/>
+          <w:szCs w:val="22"/>
+        </w:rPr>
+        <w:t xml:space="preserve">, </w:t>
+      </w:r>
+      <w:r>
+        <w:rPr>
+          <w:rFonts w:ascii="Calibri" w:cs="Calibri" w:eastAsia="Calibri" w:hAnsi="Calibri"/>
+          <w:b/>
+          <w:bCs/>
+          <w:color w:val="8A4B12"/>
+          <w:sz w:val="20"/>
+          <w:szCs w:val="20"/>
+          <w:shd w:fill="FAE3CF" w:val="clear"/>
+        </w:rPr>
+        <w:t xml:space="preserve">  verb  </w:t>
+      </w:r>
+      <w:r>
+        <w:rPr>
+          <w:rFonts w:ascii="Georgia" w:cs="Georgia" w:eastAsia="Georgia" w:hAnsi="Georgia"/>
+          <w:color w:val="1E211F"/>
+          <w:sz w:val="22"/>
+          <w:szCs w:val="22"/>
+        </w:rPr>
+        <w:t xml:space="preserve">, </w:t>
+      </w:r>
+      <w:r>
+        <w:rPr>
+          <w:rFonts w:ascii="Calibri" w:cs="Calibri" w:eastAsia="Calibri" w:hAnsi="Calibri"/>
+          <w:b/>
+          <w:bCs/>
+          <w:color w:val="7A5A00"/>
+          <w:sz w:val="20"/>
+          <w:szCs w:val="20"/>
+          <w:shd w:fill="FFF3B0" w:val="clear"/>
+        </w:rPr>
+        <w:t xml:space="preserve">  evidence  </w:t>
+      </w:r>
+      <w:r>
+        <w:rPr>
+          <w:rFonts w:ascii="Georgia" w:cs="Georgia" w:eastAsia="Georgia" w:hAnsi="Georgia"/>
+          <w:color w:val="1E211F"/>
+          <w:sz w:val="22"/>
+          <w:szCs w:val="22"/>
+        </w:rPr>
+        <w:t xml:space="preserve">, </w:t>
+      </w:r>
+      <w:r>
+        <w:rPr>
+          <w:rFonts w:ascii="Calibri" w:cs="Calibri" w:eastAsia="Calibri" w:hAnsi="Calibri"/>
+          <w:b/>
+          <w:bCs/>
+          <w:color w:val="1F5C33"/>
+          <w:sz w:val="20"/>
+          <w:szCs w:val="20"/>
+          <w:shd w:fill="DFF0E2" w:val="clear"/>
+        </w:rPr>
+        <w:t xml:space="preserve">  purpose  </w:t>
+      </w:r>
+      <w:r>
+        <w:rPr>
+          <w:rFonts w:ascii="Georgia" w:cs="Georgia" w:eastAsia="Georgia" w:hAnsi="Georgia"/>
+          <w:color w:val="1E211F"/>
+          <w:sz w:val="22"/>
+          <w:szCs w:val="22"/>
+        </w:rPr>
+        <w:t xml:space="preserve">.</w:t>
+      </w:r>
+    </w:p>
+    <w:p>
+      <w:pPr>
+        <w:spacing w:after="120"/>
+      </w:pPr>
+      <w:r>
+        <w:rPr>
+          <w:rFonts w:ascii="Georgia" w:cs="Georgia" w:eastAsia="Georgia" w:hAnsi="Georgia"/>
+          <w:color w:val="1E211F"/>
+          <w:sz w:val="22"/>
+          <w:szCs w:val="22"/>
+        </w:rPr>
+        <w:t xml:space="preserve">OR if you don’t have the colours, underline the ideas, circle the purpose and draw a box around the evidence.</w:t>
+      </w:r>
+    </w:p>
     <w:tbl>
       <w:tblPr>
         <w:tblW w:type="dxa" w:w="9906"/>
@@ -1905,6 +1108,11 @@
       </w:tr>
     </w:tbl>
     <w:p>
+      <w:r>
+        <w:br w:type="page"/>
+      </w:r>
+    </w:p>
+    <w:p>
       <w:pPr>
         <w:spacing w:after="80" w:before="260"/>
       </w:pPr>
@@ -1999,19 +1207,22 @@
       </w:tblGrid>
       <w:tr>
         <w:trPr>
-          <w:trHeight w:val="1100" w:hRule="atLeast"/>
+          <w:trHeight w:val="1500" w:hRule="atLeast"/>
         </w:trPr>
         <w:tc>
           <w:tcPr>
             <w:tcW w:type="dxa" w:w="700"/>
             <w:tcMar>
               <w:top w:type="dxa" w:w="100"/>
-              <w:left w:type="dxa" w:w="120"/>
+              <w:left w:type="dxa" w:w="100"/>
               <w:bottom w:type="dxa" w:w="100"/>
-              <w:right w:type="dxa" w:w="60"/>
+              <w:right w:type="dxa" w:w="40"/>
             </w:tcMar>
           </w:tcPr>
           <w:p>
+            <w:pPr>
+              <w:spacing w:after="40"/>
+            </w:pPr>
             <w:r>
               <w:rPr>
                 <w:rFonts w:ascii="Georgia" w:cs="Georgia" w:eastAsia="Georgia" w:hAnsi="Georgia"/>
@@ -2024,6 +1235,52 @@
               <w:t xml:space="preserve">T</w:t>
             </w:r>
           </w:p>
+          <w:tbl>
+            <w:tblPr>
+              <w:tblW w:type="dxa" w:w="560"/>
+              <w:tblBorders>
+                <w:top w:val="none" w:color="FFFFFF" w:sz="0"/>
+                <w:left w:val="none" w:color="FFFFFF" w:sz="0"/>
+                <w:bottom w:val="none" w:color="FFFFFF" w:sz="0"/>
+                <w:right w:val="none" w:color="FFFFFF" w:sz="0"/>
+                <w:insideH w:val="single" w:color="auto" w:sz="4"/>
+                <w:insideV w:val="single" w:color="auto" w:sz="4"/>
+              </w:tblBorders>
+            </w:tblPr>
+            <w:tblGrid>
+              <w:gridCol w:w="560"/>
+            </w:tblGrid>
+            <w:tr>
+              <w:trPr>
+                <w:trHeight w:val="160" w:hRule="exact"/>
+              </w:trPr>
+              <w:tc>
+                <w:tcPr>
+                  <w:tcW w:type="dxa" w:w="560"/>
+                  <w:shd w:fill="7FB3E6" w:color="auto" w:val="clear"/>
+                  <w:tcMar>
+                    <w:top w:type="dxa" w:w="0"/>
+                    <w:left w:type="dxa" w:w="0"/>
+                    <w:bottom w:type="dxa" w:w="0"/>
+                    <w:right w:type="dxa" w:w="0"/>
+                  </w:tcMar>
+                </w:tcPr>
+                <w:p>
+                  <w:pPr>
+                    <w:spacing w:after="0" w:line="120" w:lineRule="exact"/>
+                  </w:pPr>
+                  <w:r>
+                    <w:rPr>
+                      <w:sz w:val="6"/>
+                      <w:szCs w:val="6"/>
+                    </w:rPr>
+                    <w:t xml:space="preserve"/>
+                  </w:r>
+                </w:p>
+              </w:tc>
+            </w:tr>
+          </w:tbl>
+          <w:p/>
         </w:tc>
         <w:tc>
           <w:tcPr>
@@ -2066,19 +1323,22 @@
       </w:tr>
       <w:tr>
         <w:trPr>
-          <w:trHeight w:val="1800" w:hRule="atLeast"/>
+          <w:trHeight w:val="2200" w:hRule="atLeast"/>
         </w:trPr>
         <w:tc>
           <w:tcPr>
             <w:tcW w:type="dxa" w:w="700"/>
             <w:tcMar>
               <w:top w:type="dxa" w:w="100"/>
-              <w:left w:type="dxa" w:w="120"/>
+              <w:left w:type="dxa" w:w="100"/>
               <w:bottom w:type="dxa" w:w="100"/>
-              <w:right w:type="dxa" w:w="60"/>
+              <w:right w:type="dxa" w:w="40"/>
             </w:tcMar>
           </w:tcPr>
           <w:p>
+            <w:pPr>
+              <w:spacing w:after="40"/>
+            </w:pPr>
             <w:r>
               <w:rPr>
                 <w:rFonts w:ascii="Georgia" w:cs="Georgia" w:eastAsia="Georgia" w:hAnsi="Georgia"/>
@@ -2091,6 +1351,127 @@
               <w:t xml:space="preserve">E</w:t>
             </w:r>
           </w:p>
+          <w:tbl>
+            <w:tblPr>
+              <w:tblW w:type="dxa" w:w="560"/>
+              <w:tblBorders>
+                <w:top w:val="none" w:color="FFFFFF" w:sz="0"/>
+                <w:left w:val="none" w:color="FFFFFF" w:sz="0"/>
+                <w:bottom w:val="none" w:color="FFFFFF" w:sz="0"/>
+                <w:right w:val="none" w:color="FFFFFF" w:sz="0"/>
+                <w:insideH w:val="single" w:color="auto" w:sz="4"/>
+                <w:insideV w:val="single" w:color="auto" w:sz="4"/>
+              </w:tblBorders>
+            </w:tblPr>
+            <w:tblGrid>
+              <w:gridCol w:w="168"/>
+              <w:gridCol w:w="56"/>
+              <w:gridCol w:w="168"/>
+              <w:gridCol w:w="168"/>
+            </w:tblGrid>
+            <w:tr>
+              <w:trPr>
+                <w:trHeight w:val="160" w:hRule="exact"/>
+              </w:trPr>
+              <w:tc>
+                <w:tcPr>
+                  <w:tcW w:type="dxa" w:w="168"/>
+                  <w:shd w:fill="F5D75A" w:color="auto" w:val="clear"/>
+                  <w:tcMar>
+                    <w:top w:type="dxa" w:w="0"/>
+                    <w:left w:type="dxa" w:w="0"/>
+                    <w:bottom w:type="dxa" w:w="0"/>
+                    <w:right w:type="dxa" w:w="0"/>
+                  </w:tcMar>
+                </w:tcPr>
+                <w:p>
+                  <w:pPr>
+                    <w:spacing w:after="0" w:line="120" w:lineRule="exact"/>
+                  </w:pPr>
+                  <w:r>
+                    <w:rPr>
+                      <w:sz w:val="6"/>
+                      <w:szCs w:val="6"/>
+                    </w:rPr>
+                    <w:t xml:space="preserve"/>
+                  </w:r>
+                </w:p>
+              </w:tc>
+              <w:tc>
+                <w:tcPr>
+                  <w:tcW w:type="dxa" w:w="56"/>
+                  <w:shd w:fill="F2B27A" w:color="auto" w:val="clear"/>
+                  <w:tcMar>
+                    <w:top w:type="dxa" w:w="0"/>
+                    <w:left w:type="dxa" w:w="0"/>
+                    <w:bottom w:type="dxa" w:w="0"/>
+                    <w:right w:type="dxa" w:w="0"/>
+                  </w:tcMar>
+                </w:tcPr>
+                <w:p>
+                  <w:pPr>
+                    <w:spacing w:after="0" w:line="120" w:lineRule="exact"/>
+                  </w:pPr>
+                  <w:r>
+                    <w:rPr>
+                      <w:sz w:val="6"/>
+                      <w:szCs w:val="6"/>
+                    </w:rPr>
+                    <w:t xml:space="preserve"/>
+                  </w:r>
+                </w:p>
+              </w:tc>
+              <w:tc>
+                <w:tcPr>
+                  <w:tcW w:type="dxa" w:w="168"/>
+                  <w:shd w:fill="7FB3E6" w:color="auto" w:val="clear"/>
+                  <w:tcMar>
+                    <w:top w:type="dxa" w:w="0"/>
+                    <w:left w:type="dxa" w:w="0"/>
+                    <w:bottom w:type="dxa" w:w="0"/>
+                    <w:right w:type="dxa" w:w="0"/>
+                  </w:tcMar>
+                </w:tcPr>
+                <w:p>
+                  <w:pPr>
+                    <w:spacing w:after="0" w:line="120" w:lineRule="exact"/>
+                  </w:pPr>
+                  <w:r>
+                    <w:rPr>
+                      <w:sz w:val="6"/>
+                      <w:szCs w:val="6"/>
+                    </w:rPr>
+                    <w:t xml:space="preserve"/>
+                  </w:r>
+                </w:p>
+              </w:tc>
+              <w:tc>
+                <w:tcPr>
+                  <w:tcW w:type="dxa" w:w="168"/>
+                  <w:shd w:fill="8FD39A" w:color="auto" w:val="clear"/>
+                  <w:tcMar>
+                    <w:top w:type="dxa" w:w="0"/>
+                    <w:left w:type="dxa" w:w="0"/>
+                    <w:bottom w:type="dxa" w:w="0"/>
+                    <w:right w:type="dxa" w:w="0"/>
+                  </w:tcMar>
+                </w:tcPr>
+                <w:p>
+                  <w:pPr>
+                    <w:spacing w:after="0" w:line="120" w:lineRule="exact"/>
+                  </w:pPr>
+                  <w:r>
+                    <w:rPr>
+                      <w:sz w:val="6"/>
+                      <w:szCs w:val="6"/>
+                    </w:rPr>
+                    <w:t xml:space="preserve"/>
+                  </w:r>
+                </w:p>
+              </w:tc>
+            </w:tr>
+          </w:tbl>
+          <w:p/>
         </w:tc>
         <w:tc>
           <w:tcPr>
@@ -2147,19 +1528,22 @@
       </w:tr>
       <w:tr>
         <w:trPr>
-          <w:trHeight w:val="1800" w:hRule="atLeast"/>
+          <w:trHeight w:val="2200" w:hRule="atLeast"/>
         </w:trPr>
         <w:tc>
           <w:tcPr>
             <w:tcW w:type="dxa" w:w="700"/>
             <w:tcMar>
               <w:top w:type="dxa" w:w="100"/>
-              <w:left w:type="dxa" w:w="120"/>
+              <w:left w:type="dxa" w:w="100"/>
               <w:bottom w:type="dxa" w:w="100"/>
-              <w:right w:type="dxa" w:w="60"/>
+              <w:right w:type="dxa" w:w="40"/>
             </w:tcMar>
           </w:tcPr>
           <w:p>
+            <w:pPr>
+              <w:spacing w:after="40"/>
+            </w:pPr>
             <w:r>
               <w:rPr>
                 <w:rFonts w:ascii="Georgia" w:cs="Georgia" w:eastAsia="Georgia" w:hAnsi="Georgia"/>
@@ -2172,6 +1556,127 @@
               <w:t xml:space="preserve">E</w:t>
             </w:r>
           </w:p>
+          <w:tbl>
+            <w:tblPr>
+              <w:tblW w:type="dxa" w:w="560"/>
+              <w:tblBorders>
+                <w:top w:val="none" w:color="FFFFFF" w:sz="0"/>
+                <w:left w:val="none" w:color="FFFFFF" w:sz="0"/>
+                <w:bottom w:val="none" w:color="FFFFFF" w:sz="0"/>
+                <w:right w:val="none" w:color="FFFFFF" w:sz="0"/>
+                <w:insideH w:val="single" w:color="auto" w:sz="4"/>
+                <w:insideV w:val="single" w:color="auto" w:sz="4"/>
+              </w:tblBorders>
+            </w:tblPr>
+            <w:tblGrid>
+              <w:gridCol w:w="168"/>
+              <w:gridCol w:w="56"/>
+              <w:gridCol w:w="168"/>
+              <w:gridCol w:w="168"/>
+            </w:tblGrid>
+            <w:tr>
+              <w:trPr>
+                <w:trHeight w:val="160" w:hRule="exact"/>
+              </w:trPr>
+              <w:tc>
+                <w:tcPr>
+                  <w:tcW w:type="dxa" w:w="168"/>
+                  <w:shd w:fill="F5D75A" w:color="auto" w:val="clear"/>
+                  <w:tcMar>
+                    <w:top w:type="dxa" w:w="0"/>
+                    <w:left w:type="dxa" w:w="0"/>
+                    <w:bottom w:type="dxa" w:w="0"/>
+                    <w:right w:type="dxa" w:w="0"/>
+                  </w:tcMar>
+                </w:tcPr>
+                <w:p>
+                  <w:pPr>
+                    <w:spacing w:after="0" w:line="120" w:lineRule="exact"/>
+                  </w:pPr>
+                  <w:r>
+                    <w:rPr>
+                      <w:sz w:val="6"/>
+                      <w:szCs w:val="6"/>
+                    </w:rPr>
+                    <w:t xml:space="preserve"/>
+                  </w:r>
+                </w:p>
+              </w:tc>
+              <w:tc>
+                <w:tcPr>
+                  <w:tcW w:type="dxa" w:w="56"/>
+                  <w:shd w:fill="F2B27A" w:color="auto" w:val="clear"/>
+                  <w:tcMar>
+                    <w:top w:type="dxa" w:w="0"/>
+                    <w:left w:type="dxa" w:w="0"/>
+                    <w:bottom w:type="dxa" w:w="0"/>
+                    <w:right w:type="dxa" w:w="0"/>
+                  </w:tcMar>
+                </w:tcPr>
+                <w:p>
+                  <w:pPr>
+                    <w:spacing w:after="0" w:line="120" w:lineRule="exact"/>
+                  </w:pPr>
+                  <w:r>
+                    <w:rPr>
+                      <w:sz w:val="6"/>
+                      <w:szCs w:val="6"/>
+                    </w:rPr>
+                    <w:t xml:space="preserve"/>
+                  </w:r>
+                </w:p>
+              </w:tc>
+              <w:tc>
+                <w:tcPr>
+                  <w:tcW w:type="dxa" w:w="168"/>
+                  <w:shd w:fill="7FB3E6" w:color="auto" w:val="clear"/>
+                  <w:tcMar>
+                    <w:top w:type="dxa" w:w="0"/>
+                    <w:left w:type="dxa" w:w="0"/>
+                    <w:bottom w:type="dxa" w:w="0"/>
+                    <w:right w:type="dxa" w:w="0"/>
+                  </w:tcMar>
+                </w:tcPr>
+                <w:p>
+                  <w:pPr>
+                    <w:spacing w:after="0" w:line="120" w:lineRule="exact"/>
+                  </w:pPr>
+                  <w:r>
+                    <w:rPr>
+                      <w:sz w:val="6"/>
+                      <w:szCs w:val="6"/>
+                    </w:rPr>
+                    <w:t xml:space="preserve"/>
+                  </w:r>
+                </w:p>
+              </w:tc>
+              <w:tc>
+                <w:tcPr>
+                  <w:tcW w:type="dxa" w:w="168"/>
+                  <w:shd w:fill="8FD39A" w:color="auto" w:val="clear"/>
+                  <w:tcMar>
+                    <w:top w:type="dxa" w:w="0"/>
+                    <w:left w:type="dxa" w:w="0"/>
+                    <w:bottom w:type="dxa" w:w="0"/>
+                    <w:right w:type="dxa" w:w="0"/>
+                  </w:tcMar>
+                </w:tcPr>
+                <w:p>
+                  <w:pPr>
+                    <w:spacing w:after="0" w:line="120" w:lineRule="exact"/>
+                  </w:pPr>
+                  <w:r>
+                    <w:rPr>
+                      <w:sz w:val="6"/>
+                      <w:szCs w:val="6"/>
+                    </w:rPr>
+                    <w:t xml:space="preserve"/>
+                  </w:r>
+                </w:p>
+              </w:tc>
+            </w:tr>
+          </w:tbl>
+          <w:p/>
         </w:tc>
         <w:tc>
           <w:tcPr>
@@ -2228,19 +1733,22 @@
       </w:tr>
       <w:tr>
         <w:trPr>
-          <w:trHeight w:val="1600" w:hRule="atLeast"/>
+          <w:trHeight w:val="2200" w:hRule="atLeast"/>
         </w:trPr>
         <w:tc>
           <w:tcPr>
             <w:tcW w:type="dxa" w:w="700"/>
             <w:tcMar>
               <w:top w:type="dxa" w:w="100"/>
-              <w:left w:type="dxa" w:w="120"/>
+              <w:left w:type="dxa" w:w="100"/>
               <w:bottom w:type="dxa" w:w="100"/>
-              <w:right w:type="dxa" w:w="60"/>
+              <w:right w:type="dxa" w:w="40"/>
             </w:tcMar>
           </w:tcPr>
           <w:p>
+            <w:pPr>
+              <w:spacing w:after="40"/>
+            </w:pPr>
             <w:r>
               <w:rPr>
                 <w:rFonts w:ascii="Georgia" w:cs="Georgia" w:eastAsia="Georgia" w:hAnsi="Georgia"/>
@@ -2253,6 +1761,127 @@
               <w:t xml:space="preserve">E</w:t>
             </w:r>
           </w:p>
+          <w:tbl>
+            <w:tblPr>
+              <w:tblW w:type="dxa" w:w="560"/>
+              <w:tblBorders>
+                <w:top w:val="none" w:color="FFFFFF" w:sz="0"/>
+                <w:left w:val="none" w:color="FFFFFF" w:sz="0"/>
+                <w:bottom w:val="none" w:color="FFFFFF" w:sz="0"/>
+                <w:right w:val="none" w:color="FFFFFF" w:sz="0"/>
+                <w:insideH w:val="single" w:color="auto" w:sz="4"/>
+                <w:insideV w:val="single" w:color="auto" w:sz="4"/>
+              </w:tblBorders>
+            </w:tblPr>
+            <w:tblGrid>
+              <w:gridCol w:w="168"/>
+              <w:gridCol w:w="56"/>
+              <w:gridCol w:w="168"/>
+              <w:gridCol w:w="168"/>
+            </w:tblGrid>
+            <w:tr>
+              <w:trPr>
+                <w:trHeight w:val="160" w:hRule="exact"/>
+              </w:trPr>
+              <w:tc>
+                <w:tcPr>
+                  <w:tcW w:type="dxa" w:w="168"/>
+                  <w:shd w:fill="F5D75A" w:color="auto" w:val="clear"/>
+                  <w:tcMar>
+                    <w:top w:type="dxa" w:w="0"/>
+                    <w:left w:type="dxa" w:w="0"/>
+                    <w:bottom w:type="dxa" w:w="0"/>
+                    <w:right w:type="dxa" w:w="0"/>
+                  </w:tcMar>
+                </w:tcPr>
+                <w:p>
+                  <w:pPr>
+                    <w:spacing w:after="0" w:line="120" w:lineRule="exact"/>
+                  </w:pPr>
+                  <w:r>
+                    <w:rPr>
+                      <w:sz w:val="6"/>
+                      <w:szCs w:val="6"/>
+                    </w:rPr>
+                    <w:t xml:space="preserve"/>
+                  </w:r>
+                </w:p>
+              </w:tc>
+              <w:tc>
+                <w:tcPr>
+                  <w:tcW w:type="dxa" w:w="56"/>
+                  <w:shd w:fill="F2B27A" w:color="auto" w:val="clear"/>
+                  <w:tcMar>
+                    <w:top w:type="dxa" w:w="0"/>
+                    <w:left w:type="dxa" w:w="0"/>
+                    <w:bottom w:type="dxa" w:w="0"/>
+                    <w:right w:type="dxa" w:w="0"/>
+                  </w:tcMar>
+                </w:tcPr>
+                <w:p>
+                  <w:pPr>
+                    <w:spacing w:after="0" w:line="120" w:lineRule="exact"/>
+                  </w:pPr>
+                  <w:r>
+                    <w:rPr>
+                      <w:sz w:val="6"/>
+                      <w:szCs w:val="6"/>
+                    </w:rPr>
+                    <w:t xml:space="preserve"/>
+                  </w:r>
+                </w:p>
+              </w:tc>
+              <w:tc>
+                <w:tcPr>
+                  <w:tcW w:type="dxa" w:w="168"/>
+                  <w:shd w:fill="7FB3E6" w:color="auto" w:val="clear"/>
+                  <w:tcMar>
+                    <w:top w:type="dxa" w:w="0"/>
+                    <w:left w:type="dxa" w:w="0"/>
+                    <w:bottom w:type="dxa" w:w="0"/>
+                    <w:right w:type="dxa" w:w="0"/>
+                  </w:tcMar>
+                </w:tcPr>
+                <w:p>
+                  <w:pPr>
+                    <w:spacing w:after="0" w:line="120" w:lineRule="exact"/>
+                  </w:pPr>
+                  <w:r>
+                    <w:rPr>
+                      <w:sz w:val="6"/>
+                      <w:szCs w:val="6"/>
+                    </w:rPr>
+                    <w:t xml:space="preserve"/>
+                  </w:r>
+                </w:p>
+              </w:tc>
+              <w:tc>
+                <w:tcPr>
+                  <w:tcW w:type="dxa" w:w="168"/>
+                  <w:shd w:fill="8FD39A" w:color="auto" w:val="clear"/>
+                  <w:tcMar>
+                    <w:top w:type="dxa" w:w="0"/>
+                    <w:left w:type="dxa" w:w="0"/>
+                    <w:bottom w:type="dxa" w:w="0"/>
+                    <w:right w:type="dxa" w:w="0"/>
+                  </w:tcMar>
+                </w:tcPr>
+                <w:p>
+                  <w:pPr>
+                    <w:spacing w:after="0" w:line="120" w:lineRule="exact"/>
+                  </w:pPr>
+                  <w:r>
+                    <w:rPr>
+                      <w:sz w:val="6"/>
+                      <w:szCs w:val="6"/>
+                    </w:rPr>
+                    <w:t xml:space="preserve"/>
+                  </w:r>
+                </w:p>
+              </w:tc>
+            </w:tr>
+          </w:tbl>
+          <w:p/>
         </w:tc>
         <w:tc>
           <w:tcPr>
@@ -2309,19 +1938,22 @@
       </w:tr>
       <w:tr>
         <w:trPr>
-          <w:trHeight w:val="1300" w:hRule="atLeast"/>
+          <w:trHeight w:val="1900" w:hRule="atLeast"/>
         </w:trPr>
         <w:tc>
           <w:tcPr>
             <w:tcW w:type="dxa" w:w="700"/>
             <w:tcMar>
               <w:top w:type="dxa" w:w="100"/>
-              <w:left w:type="dxa" w:w="120"/>
+              <w:left w:type="dxa" w:w="100"/>
               <w:bottom w:type="dxa" w:w="100"/>
-              <w:right w:type="dxa" w:w="60"/>
+              <w:right w:type="dxa" w:w="40"/>
             </w:tcMar>
           </w:tcPr>
           <w:p>
+            <w:pPr>
+              <w:spacing w:after="40"/>
+            </w:pPr>
             <w:r>
               <w:rPr>
                 <w:rFonts w:ascii="Georgia" w:cs="Georgia" w:eastAsia="Georgia" w:hAnsi="Georgia"/>
@@ -2334,6 +1966,102 @@
               <w:t xml:space="preserve">L</w:t>
             </w:r>
           </w:p>
+          <w:tbl>
+            <w:tblPr>
+              <w:tblW w:type="dxa" w:w="560"/>
+              <w:tblBorders>
+                <w:top w:val="none" w:color="FFFFFF" w:sz="0"/>
+                <w:left w:val="none" w:color="FFFFFF" w:sz="0"/>
+                <w:bottom w:val="none" w:color="FFFFFF" w:sz="0"/>
+                <w:right w:val="none" w:color="FFFFFF" w:sz="0"/>
+                <w:insideH w:val="single" w:color="auto" w:sz="4"/>
+                <w:insideV w:val="single" w:color="auto" w:sz="4"/>
+              </w:tblBorders>
+            </w:tblPr>
+            <w:tblGrid>
+              <w:gridCol w:w="160"/>
+              <w:gridCol w:w="160"/>
+              <w:gridCol w:w="240"/>
+            </w:tblGrid>
+            <w:tr>
+              <w:trPr>
+                <w:trHeight w:val="160" w:hRule="exact"/>
+              </w:trPr>
+              <w:tc>
+                <w:tcPr>
+                  <w:tcW w:type="dxa" w:w="160"/>
+                  <w:shd w:fill="7FB3E6" w:color="auto" w:val="clear"/>
+                  <w:tcMar>
+                    <w:top w:type="dxa" w:w="0"/>
+                    <w:left w:type="dxa" w:w="0"/>
+                    <w:bottom w:type="dxa" w:w="0"/>
+                    <w:right w:type="dxa" w:w="0"/>
+                  </w:tcMar>
+                </w:tcPr>
+                <w:p>
+                  <w:pPr>
+                    <w:spacing w:after="0" w:line="120" w:lineRule="exact"/>
+                  </w:pPr>
+                  <w:r>
+                    <w:rPr>
+                      <w:sz w:val="6"/>
+                      <w:szCs w:val="6"/>
+                    </w:rPr>
+                    <w:t xml:space="preserve"/>
+                  </w:r>
+                </w:p>
+              </w:tc>
+              <w:tc>
+                <w:tcPr>
+                  <w:tcW w:type="dxa" w:w="160"/>
+                  <w:shd w:fill="7FB3E6" w:color="auto" w:val="clear"/>
+                  <w:tcMar>
+                    <w:top w:type="dxa" w:w="0"/>
+                    <w:left w:type="dxa" w:w="0"/>
+                    <w:bottom w:type="dxa" w:w="0"/>
+                    <w:right w:type="dxa" w:w="0"/>
+                  </w:tcMar>
+                </w:tcPr>
+                <w:p>
+                  <w:pPr>
+                    <w:spacing w:after="0" w:line="120" w:lineRule="exact"/>
+                  </w:pPr>
+                  <w:r>
+                    <w:rPr>
+                      <w:sz w:val="6"/>
+                      <w:szCs w:val="6"/>
+                    </w:rPr>
+                    <w:t xml:space="preserve"/>
+                  </w:r>
+                </w:p>
+              </w:tc>
+              <w:tc>
+                <w:tcPr>
+                  <w:tcW w:type="dxa" w:w="240"/>
+                  <w:shd w:fill="8FD39A" w:color="auto" w:val="clear"/>
+                  <w:tcMar>
+                    <w:top w:type="dxa" w:w="0"/>
+                    <w:left w:type="dxa" w:w="0"/>
+                    <w:bottom w:type="dxa" w:w="0"/>
+                    <w:right w:type="dxa" w:w="0"/>
+                  </w:tcMar>
+                </w:tcPr>
+                <w:p>
+                  <w:pPr>
+                    <w:spacing w:after="0" w:line="120" w:lineRule="exact"/>
+                  </w:pPr>
+                  <w:r>
+                    <w:rPr>
+                      <w:sz w:val="6"/>
+                      <w:szCs w:val="6"/>
+                    </w:rPr>
+                    <w:t xml:space="preserve"/>
+                  </w:r>
+                </w:p>
+              </w:tc>
+            </w:tr>
+          </w:tbl>
+          <w:p/>
         </w:tc>
         <w:tc>
           <w:tcPr>

</xml_diff>